<commit_message>
Add Data Understanding part
</commit_message>
<xml_diff>
--- a/CA2_Capstone_Report.docx
+++ b/CA2_Capstone_Report.docx
@@ -903,18 +903,1172 @@
       <w:pPr>
         <w:rPr>
           <w:rFonts w:ascii="Calibri" w:hAnsi="Calibri" w:cs="Calibri"/>
-          <w:sz w:val="24"/>
-          <w:szCs w:val="24"/>
-        </w:rPr>
-      </w:pPr>
-      <w:r>
-        <w:rPr>
-          <w:rFonts w:ascii="Calibri" w:hAnsi="Calibri" w:cs="Calibri"/>
           <w:b/>
           <w:bCs/>
           <w:sz w:val="28"/>
           <w:szCs w:val="28"/>
         </w:rPr>
+      </w:pPr>
+      <w:r>
+        <w:rPr>
+          <w:rFonts w:ascii="Calibri" w:hAnsi="Calibri" w:cs="Calibri"/>
+          <w:b/>
+          <w:bCs/>
+          <w:sz w:val="28"/>
+          <w:szCs w:val="28"/>
+        </w:rPr>
+        <w:t xml:space="preserve">4. </w:t>
+      </w:r>
+      <w:r>
+        <w:rPr>
+          <w:rFonts w:ascii="Calibri" w:hAnsi="Calibri" w:cs="Calibri"/>
+          <w:b/>
+          <w:bCs/>
+          <w:sz w:val="28"/>
+          <w:szCs w:val="28"/>
+        </w:rPr>
+        <w:t>Data Understanding</w:t>
+      </w:r>
+    </w:p>
+    <w:p>
+      <w:pPr>
+        <w:rPr>
+          <w:rFonts w:ascii="Calibri" w:hAnsi="Calibri" w:cs="Calibri"/>
+          <w:b/>
+          <w:bCs/>
+          <w:sz w:val="24"/>
+          <w:szCs w:val="24"/>
+        </w:rPr>
+      </w:pPr>
+      <w:r>
+        <w:rPr>
+          <w:rFonts w:ascii="Calibri" w:hAnsi="Calibri" w:cs="Calibri"/>
+          <w:b/>
+          <w:bCs/>
+          <w:sz w:val="24"/>
+          <w:szCs w:val="24"/>
+        </w:rPr>
+        <w:t>Dataset Overview</w:t>
+      </w:r>
+    </w:p>
+    <w:p>
+      <w:pPr>
+        <w:rPr>
+          <w:rFonts w:ascii="Calibri" w:hAnsi="Calibri" w:cs="Calibri"/>
+          <w:sz w:val="24"/>
+          <w:szCs w:val="24"/>
+        </w:rPr>
+      </w:pPr>
+      <w:r>
+        <w:rPr>
+          <w:rFonts w:ascii="Calibri" w:hAnsi="Calibri" w:cs="Calibri"/>
+          <w:sz w:val="24"/>
+          <w:szCs w:val="24"/>
+        </w:rPr>
+        <w:t>Transactional data from a UK-based online store can be found in the Online Retail II dataset, which was obtained via the UCI Machine Learning Repository (UCI, 2020). The dataset contains comprehensive information on customer purchases and covers a number of years. Among the dataset's primary attributes are:</w:t>
+      </w:r>
+    </w:p>
+    <w:p>
+      <w:pPr>
+        <w:pStyle w:val="ListParagraph"/>
+        <w:numPr>
+          <w:ilvl w:val="0"/>
+          <w:numId w:val="4"/>
+        </w:numPr>
+        <w:rPr>
+          <w:rFonts w:ascii="Calibri" w:hAnsi="Calibri" w:cs="Calibri"/>
+          <w:sz w:val="24"/>
+          <w:szCs w:val="24"/>
+        </w:rPr>
+      </w:pPr>
+      <w:proofErr w:type="spellStart"/>
+      <w:r>
+        <w:rPr>
+          <w:rFonts w:ascii="Calibri" w:hAnsi="Calibri" w:cs="Calibri"/>
+          <w:sz w:val="24"/>
+          <w:szCs w:val="24"/>
+        </w:rPr>
+        <w:t>CustomerID</w:t>
+      </w:r>
+      <w:proofErr w:type="spellEnd"/>
+      <w:r>
+        <w:rPr>
+          <w:rFonts w:ascii="Calibri" w:hAnsi="Calibri" w:cs="Calibri"/>
+          <w:sz w:val="24"/>
+          <w:szCs w:val="24"/>
+        </w:rPr>
+        <w:t>: A unique identifier assigned to every customer.</w:t>
+      </w:r>
+    </w:p>
+    <w:p>
+      <w:pPr>
+        <w:pStyle w:val="ListParagraph"/>
+        <w:numPr>
+          <w:ilvl w:val="0"/>
+          <w:numId w:val="4"/>
+        </w:numPr>
+        <w:rPr>
+          <w:rFonts w:ascii="Calibri" w:hAnsi="Calibri" w:cs="Calibri"/>
+          <w:sz w:val="24"/>
+          <w:szCs w:val="24"/>
+        </w:rPr>
+      </w:pPr>
+      <w:proofErr w:type="spellStart"/>
+      <w:r>
+        <w:rPr>
+          <w:rFonts w:ascii="Calibri" w:hAnsi="Calibri" w:cs="Calibri"/>
+          <w:sz w:val="24"/>
+          <w:szCs w:val="24"/>
+        </w:rPr>
+        <w:t>InvoiceNo</w:t>
+      </w:r>
+      <w:proofErr w:type="spellEnd"/>
+      <w:r>
+        <w:rPr>
+          <w:rFonts w:ascii="Calibri" w:hAnsi="Calibri" w:cs="Calibri"/>
+          <w:sz w:val="24"/>
+          <w:szCs w:val="24"/>
+        </w:rPr>
+        <w:t>: The unique transaction number for every purchase the customer has made.</w:t>
+      </w:r>
+    </w:p>
+    <w:p>
+      <w:pPr>
+        <w:pStyle w:val="ListParagraph"/>
+        <w:numPr>
+          <w:ilvl w:val="0"/>
+          <w:numId w:val="4"/>
+        </w:numPr>
+        <w:rPr>
+          <w:rFonts w:ascii="Calibri" w:hAnsi="Calibri" w:cs="Calibri"/>
+          <w:sz w:val="24"/>
+          <w:szCs w:val="24"/>
+        </w:rPr>
+      </w:pPr>
+      <w:proofErr w:type="spellStart"/>
+      <w:r>
+        <w:rPr>
+          <w:rFonts w:ascii="Calibri" w:hAnsi="Calibri" w:cs="Calibri"/>
+          <w:sz w:val="24"/>
+          <w:szCs w:val="24"/>
+        </w:rPr>
+        <w:t>StockCode</w:t>
+      </w:r>
+      <w:proofErr w:type="spellEnd"/>
+      <w:r>
+        <w:rPr>
+          <w:rFonts w:ascii="Calibri" w:hAnsi="Calibri" w:cs="Calibri"/>
+          <w:sz w:val="24"/>
+          <w:szCs w:val="24"/>
+        </w:rPr>
+        <w:t>: A unique number for the item bought.</w:t>
+      </w:r>
+    </w:p>
+    <w:p>
+      <w:pPr>
+        <w:pStyle w:val="ListParagraph"/>
+        <w:numPr>
+          <w:ilvl w:val="0"/>
+          <w:numId w:val="4"/>
+        </w:numPr>
+        <w:rPr>
+          <w:rFonts w:ascii="Calibri" w:hAnsi="Calibri" w:cs="Calibri"/>
+          <w:sz w:val="24"/>
+          <w:szCs w:val="24"/>
+        </w:rPr>
+      </w:pPr>
+      <w:r>
+        <w:rPr>
+          <w:rFonts w:ascii="Calibri" w:hAnsi="Calibri" w:cs="Calibri"/>
+          <w:sz w:val="24"/>
+          <w:szCs w:val="24"/>
+        </w:rPr>
+        <w:t>Description: The product's description in text form.</w:t>
+      </w:r>
+    </w:p>
+    <w:p>
+      <w:pPr>
+        <w:pStyle w:val="ListParagraph"/>
+        <w:numPr>
+          <w:ilvl w:val="0"/>
+          <w:numId w:val="4"/>
+        </w:numPr>
+        <w:rPr>
+          <w:rFonts w:ascii="Calibri" w:hAnsi="Calibri" w:cs="Calibri"/>
+          <w:sz w:val="24"/>
+          <w:szCs w:val="24"/>
+        </w:rPr>
+      </w:pPr>
+      <w:r>
+        <w:rPr>
+          <w:rFonts w:ascii="Calibri" w:hAnsi="Calibri" w:cs="Calibri"/>
+          <w:sz w:val="24"/>
+          <w:szCs w:val="24"/>
+        </w:rPr>
+        <w:t>Quantity: the total quantity of items bought during a transaction.</w:t>
+      </w:r>
+    </w:p>
+    <w:p>
+      <w:pPr>
+        <w:pStyle w:val="ListParagraph"/>
+        <w:numPr>
+          <w:ilvl w:val="0"/>
+          <w:numId w:val="4"/>
+        </w:numPr>
+        <w:rPr>
+          <w:rFonts w:ascii="Calibri" w:hAnsi="Calibri" w:cs="Calibri"/>
+          <w:sz w:val="24"/>
+          <w:szCs w:val="24"/>
+        </w:rPr>
+      </w:pPr>
+      <w:proofErr w:type="spellStart"/>
+      <w:r>
+        <w:rPr>
+          <w:rFonts w:ascii="Calibri" w:hAnsi="Calibri" w:cs="Calibri"/>
+          <w:sz w:val="24"/>
+          <w:szCs w:val="24"/>
+        </w:rPr>
+        <w:t>UnitPrice</w:t>
+      </w:r>
+      <w:proofErr w:type="spellEnd"/>
+      <w:r>
+        <w:rPr>
+          <w:rFonts w:ascii="Calibri" w:hAnsi="Calibri" w:cs="Calibri"/>
+          <w:sz w:val="24"/>
+          <w:szCs w:val="24"/>
+        </w:rPr>
+        <w:t>: The price of every item bought.</w:t>
+      </w:r>
+    </w:p>
+    <w:p>
+      <w:pPr>
+        <w:pStyle w:val="ListParagraph"/>
+        <w:numPr>
+          <w:ilvl w:val="0"/>
+          <w:numId w:val="4"/>
+        </w:numPr>
+        <w:rPr>
+          <w:rFonts w:ascii="Calibri" w:hAnsi="Calibri" w:cs="Calibri"/>
+          <w:sz w:val="24"/>
+          <w:szCs w:val="24"/>
+        </w:rPr>
+      </w:pPr>
+      <w:proofErr w:type="spellStart"/>
+      <w:r>
+        <w:rPr>
+          <w:rFonts w:ascii="Calibri" w:hAnsi="Calibri" w:cs="Calibri"/>
+          <w:sz w:val="24"/>
+          <w:szCs w:val="24"/>
+        </w:rPr>
+        <w:t>InvoiceDate</w:t>
+      </w:r>
+      <w:proofErr w:type="spellEnd"/>
+      <w:r>
+        <w:rPr>
+          <w:rFonts w:ascii="Calibri" w:hAnsi="Calibri" w:cs="Calibri"/>
+          <w:sz w:val="24"/>
+          <w:szCs w:val="24"/>
+        </w:rPr>
+        <w:t>: The time and date of the transaction.</w:t>
+      </w:r>
+    </w:p>
+    <w:p>
+      <w:pPr>
+        <w:pStyle w:val="ListParagraph"/>
+        <w:numPr>
+          <w:ilvl w:val="0"/>
+          <w:numId w:val="4"/>
+        </w:numPr>
+        <w:rPr>
+          <w:rFonts w:ascii="Calibri" w:hAnsi="Calibri" w:cs="Calibri"/>
+          <w:sz w:val="24"/>
+          <w:szCs w:val="24"/>
+        </w:rPr>
+      </w:pPr>
+      <w:r>
+        <w:rPr>
+          <w:rFonts w:ascii="Calibri" w:hAnsi="Calibri" w:cs="Calibri"/>
+          <w:sz w:val="24"/>
+          <w:szCs w:val="24"/>
+        </w:rPr>
+        <w:t>Country: The country in which the buyer originated the transaction.</w:t>
+      </w:r>
+    </w:p>
+    <w:p>
+      <w:pPr>
+        <w:rPr>
+          <w:rFonts w:ascii="Calibri" w:hAnsi="Calibri" w:cs="Calibri"/>
+          <w:sz w:val="24"/>
+          <w:szCs w:val="24"/>
+        </w:rPr>
+      </w:pPr>
+    </w:p>
+    <w:p>
+      <w:pPr>
+        <w:rPr>
+          <w:rFonts w:ascii="Calibri" w:hAnsi="Calibri" w:cs="Calibri"/>
+          <w:sz w:val="24"/>
+          <w:szCs w:val="24"/>
+        </w:rPr>
+      </w:pPr>
+      <w:r>
+        <w:rPr>
+          <w:rFonts w:ascii="Calibri" w:hAnsi="Calibri" w:cs="Calibri"/>
+          <w:sz w:val="24"/>
+          <w:szCs w:val="24"/>
+        </w:rPr>
+        <w:t>These features are necessary for creating customer segmentation models, predicting repeat purchases, and comprehending customer purchasing behaviour.</w:t>
+      </w:r>
+    </w:p>
+    <w:p>
+      <w:pPr>
+        <w:rPr>
+          <w:rFonts w:ascii="Calibri" w:hAnsi="Calibri" w:cs="Calibri"/>
+          <w:b/>
+          <w:bCs/>
+          <w:sz w:val="24"/>
+          <w:szCs w:val="24"/>
+        </w:rPr>
+      </w:pPr>
+      <w:r>
+        <w:rPr>
+          <w:rFonts w:ascii="Calibri" w:hAnsi="Calibri" w:cs="Calibri"/>
+          <w:b/>
+          <w:bCs/>
+          <w:sz w:val="24"/>
+          <w:szCs w:val="24"/>
+        </w:rPr>
+        <w:t>Initial Data Inspection</w:t>
+      </w:r>
+    </w:p>
+    <w:p>
+      <w:pPr>
+        <w:rPr>
+          <w:rFonts w:ascii="Calibri" w:hAnsi="Calibri" w:cs="Calibri"/>
+          <w:sz w:val="24"/>
+          <w:szCs w:val="24"/>
+        </w:rPr>
+      </w:pPr>
+      <w:r>
+        <w:rPr>
+          <w:rFonts w:ascii="Calibri" w:hAnsi="Calibri" w:cs="Calibri"/>
+          <w:sz w:val="24"/>
+          <w:szCs w:val="24"/>
+        </w:rPr>
+        <w:lastRenderedPageBreak/>
+        <w:t>It is essential to make an initial review of the dataset prior to carrying out any advanced data analysis. This include determining the kinds of variables available, looking for missing values or duplicates, and confirming the overall structure of the data. For the initial inspection, the following steps were taken:</w:t>
+      </w:r>
+    </w:p>
+    <w:p>
+      <w:pPr>
+        <w:rPr>
+          <w:rFonts w:ascii="Calibri" w:hAnsi="Calibri" w:cs="Calibri"/>
+          <w:b/>
+          <w:bCs/>
+          <w:sz w:val="24"/>
+          <w:szCs w:val="24"/>
+        </w:rPr>
+      </w:pPr>
+      <w:r>
+        <w:rPr>
+          <w:rFonts w:ascii="Calibri" w:hAnsi="Calibri" w:cs="Calibri"/>
+          <w:b/>
+          <w:bCs/>
+          <w:sz w:val="24"/>
+          <w:szCs w:val="24"/>
+        </w:rPr>
+        <w:t>1. First Few Rows</w:t>
+      </w:r>
+    </w:p>
+    <w:p>
+      <w:pPr>
+        <w:rPr>
+          <w:rFonts w:ascii="Calibri" w:hAnsi="Calibri" w:cs="Calibri"/>
+          <w:sz w:val="24"/>
+          <w:szCs w:val="24"/>
+        </w:rPr>
+      </w:pPr>
+      <w:r>
+        <w:rPr>
+          <w:rFonts w:ascii="Calibri" w:hAnsi="Calibri" w:cs="Calibri"/>
+          <w:sz w:val="24"/>
+          <w:szCs w:val="24"/>
+        </w:rPr>
+        <w:t>To get a basic idea of the data structure, the dataset's first few rows are shown. This helps in recognising any apparent patterns or issues with the data.</w:t>
+      </w:r>
+    </w:p>
+    <w:p>
+      <w:pPr>
+        <w:rPr>
+          <w:rFonts w:ascii="Calibri" w:hAnsi="Calibri" w:cs="Calibri"/>
+          <w:sz w:val="24"/>
+          <w:szCs w:val="24"/>
+        </w:rPr>
+      </w:pPr>
+    </w:p>
+    <w:p>
+      <w:pPr>
+        <w:rPr>
+          <w:rFonts w:ascii="Calibri" w:hAnsi="Calibri" w:cs="Calibri"/>
+          <w:sz w:val="24"/>
+          <w:szCs w:val="24"/>
+        </w:rPr>
+      </w:pPr>
+      <w:r>
+        <w:rPr>
+          <w:rFonts w:ascii="Calibri" w:hAnsi="Calibri" w:cs="Calibri"/>
+          <w:noProof/>
+          <w:sz w:val="24"/>
+          <w:szCs w:val="24"/>
+        </w:rPr>
+        <w:drawing>
+          <wp:inline distT="0" distB="0" distL="0" distR="0" wp14:anchorId="1ACC2AF7" wp14:editId="25990DE3">
+            <wp:extent cx="5731510" cy="2569845"/>
+            <wp:effectExtent l="0" t="0" r="2540" b="1905"/>
+            <wp:docPr id="693999359" name="Picture 1" descr="A screenshot of a computer&#10;&#10;AI-generated content may be incorrect."/>
+            <wp:cNvGraphicFramePr>
+              <a:graphicFrameLocks xmlns:a="http://schemas.openxmlformats.org/drawingml/2006/main" noChangeAspect="1"/>
+            </wp:cNvGraphicFramePr>
+            <a:graphic xmlns:a="http://schemas.openxmlformats.org/drawingml/2006/main">
+              <a:graphicData uri="http://schemas.openxmlformats.org/drawingml/2006/picture">
+                <pic:pic xmlns:pic="http://schemas.openxmlformats.org/drawingml/2006/picture">
+                  <pic:nvPicPr>
+                    <pic:cNvPr id="693999359" name="Picture 1" descr="A screenshot of a computer&#10;&#10;AI-generated content may be incorrect."/>
+                    <pic:cNvPicPr/>
+                  </pic:nvPicPr>
+                  <pic:blipFill>
+                    <a:blip r:embed="rId5">
+                      <a:extLst>
+                        <a:ext uri="{28A0092B-C50C-407E-A947-70E740481C1C}">
+                          <a14:useLocalDpi xmlns:a14="http://schemas.microsoft.com/office/drawing/2010/main" val="0"/>
+                        </a:ext>
+                      </a:extLst>
+                    </a:blip>
+                    <a:stretch>
+                      <a:fillRect/>
+                    </a:stretch>
+                  </pic:blipFill>
+                  <pic:spPr>
+                    <a:xfrm>
+                      <a:off x="0" y="0"/>
+                      <a:ext cx="5731510" cy="2569845"/>
+                    </a:xfrm>
+                    <a:prstGeom prst="rect">
+                      <a:avLst/>
+                    </a:prstGeom>
+                  </pic:spPr>
+                </pic:pic>
+              </a:graphicData>
+            </a:graphic>
+          </wp:inline>
+        </w:drawing>
+      </w:r>
+    </w:p>
+    <w:p>
+      <w:pPr>
+        <w:rPr>
+          <w:rFonts w:ascii="Calibri" w:hAnsi="Calibri" w:cs="Calibri"/>
+          <w:sz w:val="24"/>
+          <w:szCs w:val="24"/>
+        </w:rPr>
+      </w:pPr>
+    </w:p>
+    <w:p>
+      <w:pPr>
+        <w:rPr>
+          <w:rFonts w:ascii="Calibri" w:hAnsi="Calibri" w:cs="Calibri"/>
+          <w:sz w:val="24"/>
+          <w:szCs w:val="24"/>
+        </w:rPr>
+      </w:pPr>
+      <w:r>
+        <w:rPr>
+          <w:rFonts w:ascii="Calibri" w:hAnsi="Calibri" w:cs="Calibri"/>
+          <w:sz w:val="24"/>
+          <w:szCs w:val="24"/>
+        </w:rPr>
+        <w:t xml:space="preserve">Multiple line items can share the same </w:t>
+      </w:r>
+      <w:proofErr w:type="spellStart"/>
+      <w:r>
+        <w:rPr>
+          <w:rFonts w:ascii="Calibri" w:hAnsi="Calibri" w:cs="Calibri"/>
+          <w:sz w:val="24"/>
+          <w:szCs w:val="24"/>
+        </w:rPr>
+        <w:t>InvoiceNo</w:t>
+      </w:r>
+      <w:proofErr w:type="spellEnd"/>
+      <w:r>
+        <w:rPr>
+          <w:rFonts w:ascii="Calibri" w:hAnsi="Calibri" w:cs="Calibri"/>
+          <w:sz w:val="24"/>
+          <w:szCs w:val="24"/>
+        </w:rPr>
+        <w:t>, indicating that they are part of the same transaction, as shown in the first five rows. Several different products may be included in a single transaction. For example, all five sample rows are associated with UK customer 17850.0 and invoice 536365, indicating that the dataset is in transactional (line-item) format rather than aggregated at the invoice or customer level.</w:t>
+      </w:r>
+    </w:p>
+    <w:p>
+      <w:pPr>
+        <w:rPr>
+          <w:rFonts w:ascii="Calibri" w:hAnsi="Calibri" w:cs="Calibri"/>
+          <w:b/>
+          <w:bCs/>
+          <w:sz w:val="24"/>
+          <w:szCs w:val="24"/>
+        </w:rPr>
+      </w:pPr>
+      <w:r>
+        <w:rPr>
+          <w:rFonts w:ascii="Calibri" w:hAnsi="Calibri" w:cs="Calibri"/>
+          <w:b/>
+          <w:bCs/>
+          <w:sz w:val="24"/>
+          <w:szCs w:val="24"/>
+        </w:rPr>
+        <w:t>2. Data Types and Missing Values</w:t>
+      </w:r>
+    </w:p>
+    <w:p>
+      <w:pPr>
+        <w:rPr>
+          <w:rFonts w:ascii="Calibri" w:hAnsi="Calibri" w:cs="Calibri"/>
+          <w:sz w:val="24"/>
+          <w:szCs w:val="24"/>
+        </w:rPr>
+      </w:pPr>
+      <w:r>
+        <w:rPr>
+          <w:rFonts w:ascii="Calibri" w:hAnsi="Calibri" w:cs="Calibri"/>
+          <w:sz w:val="24"/>
+          <w:szCs w:val="24"/>
+        </w:rPr>
+        <w:t xml:space="preserve">Information about the dataset, including the data types of each column and the amount of non-null values in each column, is shown using the </w:t>
+      </w:r>
+      <w:proofErr w:type="gramStart"/>
+      <w:r>
+        <w:rPr>
+          <w:rFonts w:ascii="Calibri" w:hAnsi="Calibri" w:cs="Calibri"/>
+          <w:sz w:val="24"/>
+          <w:szCs w:val="24"/>
+        </w:rPr>
+        <w:t>df.info(</w:t>
+      </w:r>
+      <w:proofErr w:type="gramEnd"/>
+      <w:r>
+        <w:rPr>
+          <w:rFonts w:ascii="Calibri" w:hAnsi="Calibri" w:cs="Calibri"/>
+          <w:sz w:val="24"/>
+          <w:szCs w:val="24"/>
+        </w:rPr>
+        <w:t>) method. This makes it possible to identify columns that might have missing values, which may be addressed during the data preparation process.</w:t>
+      </w:r>
+    </w:p>
+    <w:p>
+      <w:pPr>
+        <w:rPr>
+          <w:rFonts w:ascii="Calibri" w:hAnsi="Calibri" w:cs="Calibri"/>
+          <w:sz w:val="24"/>
+          <w:szCs w:val="24"/>
+        </w:rPr>
+      </w:pPr>
+    </w:p>
+    <w:p>
+      <w:pPr>
+        <w:rPr>
+          <w:rFonts w:ascii="Calibri" w:hAnsi="Calibri" w:cs="Calibri"/>
+          <w:sz w:val="24"/>
+          <w:szCs w:val="24"/>
+        </w:rPr>
+      </w:pPr>
+      <w:r>
+        <w:rPr>
+          <w:rFonts w:ascii="Calibri" w:hAnsi="Calibri" w:cs="Calibri"/>
+          <w:noProof/>
+          <w:sz w:val="24"/>
+          <w:szCs w:val="24"/>
+        </w:rPr>
+        <w:lastRenderedPageBreak/>
+        <w:drawing>
+          <wp:inline distT="0" distB="0" distL="0" distR="0" wp14:anchorId="7BB6943A" wp14:editId="26618250">
+            <wp:extent cx="5731510" cy="3634105"/>
+            <wp:effectExtent l="0" t="0" r="2540" b="4445"/>
+            <wp:docPr id="2135739274" name="Picture 2" descr="A screenshot of a computer&#10;&#10;AI-generated content may be incorrect."/>
+            <wp:cNvGraphicFramePr>
+              <a:graphicFrameLocks xmlns:a="http://schemas.openxmlformats.org/drawingml/2006/main" noChangeAspect="1"/>
+            </wp:cNvGraphicFramePr>
+            <a:graphic xmlns:a="http://schemas.openxmlformats.org/drawingml/2006/main">
+              <a:graphicData uri="http://schemas.openxmlformats.org/drawingml/2006/picture">
+                <pic:pic xmlns:pic="http://schemas.openxmlformats.org/drawingml/2006/picture">
+                  <pic:nvPicPr>
+                    <pic:cNvPr id="2135739274" name="Picture 2" descr="A screenshot of a computer&#10;&#10;AI-generated content may be incorrect."/>
+                    <pic:cNvPicPr/>
+                  </pic:nvPicPr>
+                  <pic:blipFill>
+                    <a:blip r:embed="rId6">
+                      <a:extLst>
+                        <a:ext uri="{28A0092B-C50C-407E-A947-70E740481C1C}">
+                          <a14:useLocalDpi xmlns:a14="http://schemas.microsoft.com/office/drawing/2010/main" val="0"/>
+                        </a:ext>
+                      </a:extLst>
+                    </a:blip>
+                    <a:stretch>
+                      <a:fillRect/>
+                    </a:stretch>
+                  </pic:blipFill>
+                  <pic:spPr>
+                    <a:xfrm>
+                      <a:off x="0" y="0"/>
+                      <a:ext cx="5731510" cy="3634105"/>
+                    </a:xfrm>
+                    <a:prstGeom prst="rect">
+                      <a:avLst/>
+                    </a:prstGeom>
+                  </pic:spPr>
+                </pic:pic>
+              </a:graphicData>
+            </a:graphic>
+          </wp:inline>
+        </w:drawing>
+      </w:r>
+    </w:p>
+    <w:p>
+      <w:pPr>
+        <w:rPr>
+          <w:rFonts w:ascii="Calibri" w:hAnsi="Calibri" w:cs="Calibri"/>
+          <w:sz w:val="24"/>
+          <w:szCs w:val="24"/>
+        </w:rPr>
+      </w:pPr>
+    </w:p>
+    <w:p>
+      <w:pPr>
+        <w:rPr>
+          <w:rFonts w:ascii="Calibri" w:hAnsi="Calibri" w:cs="Calibri"/>
+          <w:sz w:val="24"/>
+          <w:szCs w:val="24"/>
+        </w:rPr>
+      </w:pPr>
+      <w:r>
+        <w:rPr>
+          <w:rFonts w:ascii="Calibri" w:hAnsi="Calibri" w:cs="Calibri"/>
+          <w:sz w:val="24"/>
+          <w:szCs w:val="24"/>
+        </w:rPr>
+        <w:t>There are eight columns and 541,909 rows in the dataset.</w:t>
+      </w:r>
+      <w:r>
+        <w:rPr>
+          <w:rFonts w:ascii="Calibri" w:hAnsi="Calibri" w:cs="Calibri"/>
+          <w:sz w:val="24"/>
+          <w:szCs w:val="24"/>
+        </w:rPr>
+        <w:t xml:space="preserve"> </w:t>
+      </w:r>
+      <w:r>
+        <w:rPr>
+          <w:rFonts w:ascii="Calibri" w:hAnsi="Calibri" w:cs="Calibri"/>
+          <w:sz w:val="24"/>
+          <w:szCs w:val="24"/>
+        </w:rPr>
+        <w:t xml:space="preserve">Although </w:t>
+      </w:r>
+      <w:proofErr w:type="spellStart"/>
+      <w:r>
+        <w:rPr>
+          <w:rFonts w:ascii="Calibri" w:hAnsi="Calibri" w:cs="Calibri"/>
+          <w:sz w:val="24"/>
+          <w:szCs w:val="24"/>
+        </w:rPr>
+        <w:t>CustomerID</w:t>
+      </w:r>
+      <w:proofErr w:type="spellEnd"/>
+      <w:r>
+        <w:rPr>
+          <w:rFonts w:ascii="Calibri" w:hAnsi="Calibri" w:cs="Calibri"/>
+          <w:sz w:val="24"/>
+          <w:szCs w:val="24"/>
+        </w:rPr>
+        <w:t xml:space="preserve"> is categorical, it has a float64 type because of missing values.</w:t>
+      </w:r>
+      <w:r>
+        <w:rPr>
+          <w:rFonts w:ascii="Calibri" w:hAnsi="Calibri" w:cs="Calibri"/>
+          <w:sz w:val="24"/>
+          <w:szCs w:val="24"/>
+        </w:rPr>
+        <w:t xml:space="preserve"> </w:t>
+      </w:r>
+      <w:r>
+        <w:rPr>
+          <w:rFonts w:ascii="Calibri" w:hAnsi="Calibri" w:cs="Calibri"/>
+          <w:sz w:val="24"/>
+          <w:szCs w:val="24"/>
+        </w:rPr>
+        <w:t xml:space="preserve">Any time-based analysis should convert the object that is stored as </w:t>
+      </w:r>
+      <w:proofErr w:type="spellStart"/>
+      <w:r>
+        <w:rPr>
+          <w:rFonts w:ascii="Calibri" w:hAnsi="Calibri" w:cs="Calibri"/>
+          <w:sz w:val="24"/>
+          <w:szCs w:val="24"/>
+        </w:rPr>
+        <w:t>invoicedate</w:t>
+      </w:r>
+      <w:proofErr w:type="spellEnd"/>
+      <w:r>
+        <w:rPr>
+          <w:rFonts w:ascii="Calibri" w:hAnsi="Calibri" w:cs="Calibri"/>
+          <w:sz w:val="24"/>
+          <w:szCs w:val="24"/>
+        </w:rPr>
+        <w:t xml:space="preserve"> to datetime.</w:t>
+      </w:r>
+      <w:r>
+        <w:rPr>
+          <w:rFonts w:ascii="Calibri" w:hAnsi="Calibri" w:cs="Calibri"/>
+          <w:sz w:val="24"/>
+          <w:szCs w:val="24"/>
+        </w:rPr>
+        <w:t xml:space="preserve"> </w:t>
+      </w:r>
+      <w:r>
+        <w:rPr>
+          <w:rFonts w:ascii="Calibri" w:hAnsi="Calibri" w:cs="Calibri"/>
+          <w:sz w:val="24"/>
+          <w:szCs w:val="24"/>
+        </w:rPr>
+        <w:t xml:space="preserve">The other fields are completely filled in, with the exception of Description and </w:t>
+      </w:r>
+      <w:proofErr w:type="spellStart"/>
+      <w:r>
+        <w:rPr>
+          <w:rFonts w:ascii="Calibri" w:hAnsi="Calibri" w:cs="Calibri"/>
+          <w:sz w:val="24"/>
+          <w:szCs w:val="24"/>
+        </w:rPr>
+        <w:t>CustomerID</w:t>
+      </w:r>
+      <w:proofErr w:type="spellEnd"/>
+      <w:r>
+        <w:rPr>
+          <w:rFonts w:ascii="Calibri" w:hAnsi="Calibri" w:cs="Calibri"/>
+          <w:sz w:val="24"/>
+          <w:szCs w:val="24"/>
+        </w:rPr>
+        <w:t>.</w:t>
+      </w:r>
+      <w:r>
+        <w:rPr>
+          <w:rFonts w:ascii="Calibri" w:hAnsi="Calibri" w:cs="Calibri"/>
+          <w:sz w:val="24"/>
+          <w:szCs w:val="24"/>
+        </w:rPr>
+        <w:t xml:space="preserve"> </w:t>
+      </w:r>
+      <w:r>
+        <w:rPr>
+          <w:rFonts w:ascii="Calibri" w:hAnsi="Calibri" w:cs="Calibri"/>
+          <w:sz w:val="24"/>
+          <w:szCs w:val="24"/>
+        </w:rPr>
+        <w:t>For local analysis, the 33.1 MB of memory usage is appropriate.</w:t>
+      </w:r>
+    </w:p>
+    <w:p>
+      <w:pPr>
+        <w:rPr>
+          <w:rFonts w:ascii="Calibri" w:hAnsi="Calibri" w:cs="Calibri"/>
+          <w:b/>
+          <w:bCs/>
+          <w:sz w:val="24"/>
+          <w:szCs w:val="24"/>
+        </w:rPr>
+      </w:pPr>
+      <w:r>
+        <w:rPr>
+          <w:rFonts w:ascii="Calibri" w:hAnsi="Calibri" w:cs="Calibri"/>
+          <w:b/>
+          <w:bCs/>
+          <w:sz w:val="24"/>
+          <w:szCs w:val="24"/>
+        </w:rPr>
+        <w:t>3. Missing Values Check</w:t>
+      </w:r>
+    </w:p>
+    <w:p>
+      <w:pPr>
+        <w:rPr>
+          <w:rFonts w:ascii="Calibri" w:hAnsi="Calibri" w:cs="Calibri"/>
+          <w:sz w:val="24"/>
+          <w:szCs w:val="24"/>
+        </w:rPr>
+      </w:pPr>
+      <w:r>
+        <w:rPr>
+          <w:rFonts w:ascii="Calibri" w:hAnsi="Calibri" w:cs="Calibri"/>
+          <w:sz w:val="24"/>
+          <w:szCs w:val="24"/>
+        </w:rPr>
+        <w:t xml:space="preserve">The </w:t>
+      </w:r>
+      <w:proofErr w:type="spellStart"/>
+      <w:proofErr w:type="gramStart"/>
+      <w:r>
+        <w:rPr>
+          <w:rFonts w:ascii="Calibri" w:hAnsi="Calibri" w:cs="Calibri"/>
+          <w:sz w:val="24"/>
+          <w:szCs w:val="24"/>
+        </w:rPr>
+        <w:t>df.isnull</w:t>
+      </w:r>
+      <w:proofErr w:type="spellEnd"/>
+      <w:proofErr w:type="gramEnd"/>
+      <w:r>
+        <w:rPr>
+          <w:rFonts w:ascii="Calibri" w:hAnsi="Calibri" w:cs="Calibri"/>
+          <w:sz w:val="24"/>
+          <w:szCs w:val="24"/>
+        </w:rPr>
+        <w:t>(</w:t>
+      </w:r>
+      <w:proofErr w:type="gramStart"/>
+      <w:r>
+        <w:rPr>
+          <w:rFonts w:ascii="Calibri" w:hAnsi="Calibri" w:cs="Calibri"/>
+          <w:sz w:val="24"/>
+          <w:szCs w:val="24"/>
+        </w:rPr>
+        <w:t>).sum</w:t>
+      </w:r>
+      <w:proofErr w:type="gramEnd"/>
+      <w:r>
+        <w:rPr>
+          <w:rFonts w:ascii="Calibri" w:hAnsi="Calibri" w:cs="Calibri"/>
+          <w:sz w:val="24"/>
+          <w:szCs w:val="24"/>
+        </w:rPr>
+        <w:t>() is used to find columns that contain missing data. In order to plan the imputation or removal of these values during the Data Preparation phase, it is necessary to know the total number of missing values per column.</w:t>
+      </w:r>
+    </w:p>
+    <w:p>
+      <w:pPr>
+        <w:rPr>
+          <w:rFonts w:ascii="Calibri" w:hAnsi="Calibri" w:cs="Calibri"/>
+          <w:sz w:val="24"/>
+          <w:szCs w:val="24"/>
+        </w:rPr>
+      </w:pPr>
+      <w:r>
+        <w:rPr>
+          <w:rFonts w:ascii="Calibri" w:hAnsi="Calibri" w:cs="Calibri"/>
+          <w:noProof/>
+          <w:sz w:val="24"/>
+          <w:szCs w:val="24"/>
+        </w:rPr>
+        <w:lastRenderedPageBreak/>
+        <w:drawing>
+          <wp:inline distT="0" distB="0" distL="0" distR="0" wp14:anchorId="05D0F9AD" wp14:editId="3D0727AE">
+            <wp:extent cx="5731510" cy="2792095"/>
+            <wp:effectExtent l="0" t="0" r="2540" b="8255"/>
+            <wp:docPr id="2089741096" name="Picture 3" descr="A screenshot of a computer&#10;&#10;AI-generated content may be incorrect."/>
+            <wp:cNvGraphicFramePr>
+              <a:graphicFrameLocks xmlns:a="http://schemas.openxmlformats.org/drawingml/2006/main" noChangeAspect="1"/>
+            </wp:cNvGraphicFramePr>
+            <a:graphic xmlns:a="http://schemas.openxmlformats.org/drawingml/2006/main">
+              <a:graphicData uri="http://schemas.openxmlformats.org/drawingml/2006/picture">
+                <pic:pic xmlns:pic="http://schemas.openxmlformats.org/drawingml/2006/picture">
+                  <pic:nvPicPr>
+                    <pic:cNvPr id="2089741096" name="Picture 3" descr="A screenshot of a computer&#10;&#10;AI-generated content may be incorrect."/>
+                    <pic:cNvPicPr/>
+                  </pic:nvPicPr>
+                  <pic:blipFill>
+                    <a:blip r:embed="rId7">
+                      <a:extLst>
+                        <a:ext uri="{28A0092B-C50C-407E-A947-70E740481C1C}">
+                          <a14:useLocalDpi xmlns:a14="http://schemas.microsoft.com/office/drawing/2010/main" val="0"/>
+                        </a:ext>
+                      </a:extLst>
+                    </a:blip>
+                    <a:stretch>
+                      <a:fillRect/>
+                    </a:stretch>
+                  </pic:blipFill>
+                  <pic:spPr>
+                    <a:xfrm>
+                      <a:off x="0" y="0"/>
+                      <a:ext cx="5731510" cy="2792095"/>
+                    </a:xfrm>
+                    <a:prstGeom prst="rect">
+                      <a:avLst/>
+                    </a:prstGeom>
+                  </pic:spPr>
+                </pic:pic>
+              </a:graphicData>
+            </a:graphic>
+          </wp:inline>
+        </w:drawing>
+      </w:r>
+    </w:p>
+    <w:p>
+      <w:pPr>
+        <w:rPr>
+          <w:rFonts w:ascii="Calibri" w:hAnsi="Calibri" w:cs="Calibri"/>
+          <w:sz w:val="24"/>
+          <w:szCs w:val="24"/>
+        </w:rPr>
+      </w:pPr>
+    </w:p>
+    <w:p>
+      <w:pPr>
+        <w:rPr>
+          <w:rFonts w:ascii="Calibri" w:hAnsi="Calibri" w:cs="Calibri"/>
+          <w:sz w:val="24"/>
+          <w:szCs w:val="24"/>
+        </w:rPr>
+      </w:pPr>
+      <w:r>
+        <w:rPr>
+          <w:rFonts w:ascii="Calibri" w:hAnsi="Calibri" w:cs="Calibri"/>
+          <w:sz w:val="24"/>
+          <w:szCs w:val="24"/>
+        </w:rPr>
+        <w:t xml:space="preserve">About 25% of the dataset, or 135,080 missing values, in </w:t>
+      </w:r>
+      <w:proofErr w:type="spellStart"/>
+      <w:r>
+        <w:rPr>
+          <w:rFonts w:ascii="Calibri" w:hAnsi="Calibri" w:cs="Calibri"/>
+          <w:sz w:val="24"/>
+          <w:szCs w:val="24"/>
+        </w:rPr>
+        <w:t>CustomerID</w:t>
+      </w:r>
+      <w:proofErr w:type="spellEnd"/>
+      <w:r>
+        <w:rPr>
+          <w:rFonts w:ascii="Calibri" w:hAnsi="Calibri" w:cs="Calibri"/>
+          <w:sz w:val="24"/>
+          <w:szCs w:val="24"/>
+        </w:rPr>
+        <w:t xml:space="preserve"> suggest that many transactions are anonymous or not linked to a specific customer.</w:t>
+      </w:r>
+      <w:r>
+        <w:rPr>
+          <w:rFonts w:ascii="Calibri" w:hAnsi="Calibri" w:cs="Calibri"/>
+          <w:sz w:val="24"/>
+          <w:szCs w:val="24"/>
+        </w:rPr>
+        <w:t xml:space="preserve"> </w:t>
+      </w:r>
+      <w:r>
+        <w:rPr>
+          <w:rFonts w:ascii="Calibri" w:hAnsi="Calibri" w:cs="Calibri"/>
+          <w:sz w:val="24"/>
+          <w:szCs w:val="24"/>
+        </w:rPr>
+        <w:t>1,454 rows lack a description.</w:t>
+      </w:r>
+    </w:p>
+    <w:p>
+      <w:pPr>
+        <w:rPr>
+          <w:rFonts w:ascii="Calibri" w:hAnsi="Calibri" w:cs="Calibri"/>
+          <w:sz w:val="24"/>
+          <w:szCs w:val="24"/>
+        </w:rPr>
+      </w:pPr>
+      <w:r>
+        <w:rPr>
+          <w:rFonts w:ascii="Calibri" w:hAnsi="Calibri" w:cs="Calibri"/>
+          <w:sz w:val="24"/>
+          <w:szCs w:val="24"/>
+        </w:rPr>
+        <w:t>These missing values should be handled during the data preparation phase, particularly when conducting customer-level analysis or clustering, even though they do not render the dataset useless.</w:t>
+      </w:r>
+    </w:p>
+    <w:p>
+      <w:pPr>
+        <w:rPr>
+          <w:rFonts w:ascii="Calibri" w:hAnsi="Calibri" w:cs="Calibri"/>
+          <w:b/>
+          <w:bCs/>
+          <w:sz w:val="24"/>
+          <w:szCs w:val="24"/>
+        </w:rPr>
+      </w:pPr>
+      <w:r>
+        <w:rPr>
+          <w:rFonts w:ascii="Calibri" w:hAnsi="Calibri" w:cs="Calibri"/>
+          <w:b/>
+          <w:bCs/>
+          <w:sz w:val="24"/>
+          <w:szCs w:val="24"/>
+        </w:rPr>
+        <w:t>4. Duplicate Rows Check</w:t>
+      </w:r>
+    </w:p>
+    <w:p>
+      <w:pPr>
+        <w:rPr>
+          <w:rFonts w:ascii="Calibri" w:hAnsi="Calibri" w:cs="Calibri"/>
+          <w:sz w:val="24"/>
+          <w:szCs w:val="24"/>
+        </w:rPr>
+      </w:pPr>
+      <w:r>
+        <w:rPr>
+          <w:rFonts w:ascii="Calibri" w:hAnsi="Calibri" w:cs="Calibri"/>
+          <w:sz w:val="24"/>
+          <w:szCs w:val="24"/>
+        </w:rPr>
+        <w:t>To make sure that the dataset has no duplicate transactions, it is crucial to check for duplicate rows. This may ensure the integrity of any prediction modelling and avoid biased analysis.</w:t>
+      </w:r>
+    </w:p>
+    <w:p>
+      <w:pPr>
+        <w:rPr>
+          <w:rFonts w:ascii="Calibri" w:hAnsi="Calibri" w:cs="Calibri"/>
+          <w:sz w:val="24"/>
+          <w:szCs w:val="24"/>
+        </w:rPr>
+      </w:pPr>
+    </w:p>
+    <w:p>
+      <w:pPr>
+        <w:rPr>
+          <w:rFonts w:ascii="Calibri" w:hAnsi="Calibri" w:cs="Calibri"/>
+          <w:sz w:val="24"/>
+          <w:szCs w:val="24"/>
+        </w:rPr>
+      </w:pPr>
+      <w:r>
+        <w:rPr>
+          <w:rFonts w:ascii="Calibri" w:hAnsi="Calibri" w:cs="Calibri"/>
+          <w:noProof/>
+          <w:sz w:val="24"/>
+          <w:szCs w:val="24"/>
+        </w:rPr>
+        <w:drawing>
+          <wp:inline distT="0" distB="0" distL="0" distR="0" wp14:anchorId="568A2323" wp14:editId="0C72E942">
+            <wp:extent cx="5731510" cy="1419860"/>
+            <wp:effectExtent l="0" t="0" r="2540" b="8890"/>
+            <wp:docPr id="2022938450" name="Picture 4" descr="A close-up of a computer screen&#10;&#10;AI-generated content may be incorrect."/>
+            <wp:cNvGraphicFramePr>
+              <a:graphicFrameLocks xmlns:a="http://schemas.openxmlformats.org/drawingml/2006/main" noChangeAspect="1"/>
+            </wp:cNvGraphicFramePr>
+            <a:graphic xmlns:a="http://schemas.openxmlformats.org/drawingml/2006/main">
+              <a:graphicData uri="http://schemas.openxmlformats.org/drawingml/2006/picture">
+                <pic:pic xmlns:pic="http://schemas.openxmlformats.org/drawingml/2006/picture">
+                  <pic:nvPicPr>
+                    <pic:cNvPr id="2022938450" name="Picture 4" descr="A close-up of a computer screen&#10;&#10;AI-generated content may be incorrect."/>
+                    <pic:cNvPicPr/>
+                  </pic:nvPicPr>
+                  <pic:blipFill>
+                    <a:blip r:embed="rId8">
+                      <a:extLst>
+                        <a:ext uri="{28A0092B-C50C-407E-A947-70E740481C1C}">
+                          <a14:useLocalDpi xmlns:a14="http://schemas.microsoft.com/office/drawing/2010/main" val="0"/>
+                        </a:ext>
+                      </a:extLst>
+                    </a:blip>
+                    <a:stretch>
+                      <a:fillRect/>
+                    </a:stretch>
+                  </pic:blipFill>
+                  <pic:spPr>
+                    <a:xfrm>
+                      <a:off x="0" y="0"/>
+                      <a:ext cx="5731510" cy="1419860"/>
+                    </a:xfrm>
+                    <a:prstGeom prst="rect">
+                      <a:avLst/>
+                    </a:prstGeom>
+                  </pic:spPr>
+                </pic:pic>
+              </a:graphicData>
+            </a:graphic>
+          </wp:inline>
+        </w:drawing>
+      </w:r>
+    </w:p>
+    <w:p>
+      <w:pPr>
+        <w:rPr>
+          <w:rFonts w:ascii="Calibri" w:hAnsi="Calibri" w:cs="Calibri"/>
+          <w:sz w:val="24"/>
+          <w:szCs w:val="24"/>
+        </w:rPr>
+      </w:pPr>
+    </w:p>
+    <w:p>
+      <w:pPr>
+        <w:rPr>
+          <w:rFonts w:ascii="Calibri" w:hAnsi="Calibri" w:cs="Calibri"/>
+          <w:sz w:val="24"/>
+          <w:szCs w:val="24"/>
+        </w:rPr>
+      </w:pPr>
+      <w:r>
+        <w:rPr>
+          <w:rFonts w:ascii="Calibri" w:hAnsi="Calibri" w:cs="Calibri"/>
+          <w:sz w:val="24"/>
+          <w:szCs w:val="24"/>
+        </w:rPr>
+        <w:t>Duplicate rows, or rows that are exactly the same in every column are total 5,268.</w:t>
+      </w:r>
+      <w:r>
+        <w:rPr>
+          <w:rFonts w:ascii="Calibri" w:hAnsi="Calibri" w:cs="Calibri"/>
+          <w:sz w:val="24"/>
+          <w:szCs w:val="24"/>
+        </w:rPr>
+        <w:t xml:space="preserve"> </w:t>
+      </w:r>
+      <w:r>
+        <w:rPr>
+          <w:rFonts w:ascii="Calibri" w:hAnsi="Calibri" w:cs="Calibri"/>
+          <w:sz w:val="24"/>
+          <w:szCs w:val="24"/>
+        </w:rPr>
+        <w:t>In retail, it is common to make repeated purchases, but exact duplicates are usually eliminated unless they are shown to be intentional records.</w:t>
+      </w:r>
+    </w:p>
+    <w:p>
+      <w:pPr>
+        <w:rPr>
+          <w:rFonts w:ascii="Calibri" w:hAnsi="Calibri" w:cs="Calibri"/>
+          <w:sz w:val="24"/>
+          <w:szCs w:val="24"/>
+        </w:rPr>
+      </w:pPr>
+    </w:p>
+    <w:p>
+      <w:pPr>
+        <w:rPr>
+          <w:rFonts w:ascii="Calibri" w:hAnsi="Calibri" w:cs="Calibri"/>
+          <w:sz w:val="24"/>
+          <w:szCs w:val="24"/>
+        </w:rPr>
+      </w:pPr>
+    </w:p>
+    <w:p>
+      <w:pPr>
+        <w:rPr>
+          <w:rFonts w:ascii="Calibri" w:hAnsi="Calibri" w:cs="Calibri"/>
+          <w:sz w:val="24"/>
+          <w:szCs w:val="24"/>
+        </w:rPr>
+      </w:pPr>
+      <w:r>
+        <w:rPr>
+          <w:rFonts w:ascii="Calibri" w:hAnsi="Calibri" w:cs="Calibri"/>
+          <w:b/>
+          <w:bCs/>
+          <w:sz w:val="28"/>
+          <w:szCs w:val="28"/>
+        </w:rPr>
         <w:t>References</w:t>
       </w:r>
     </w:p>
@@ -944,7 +2098,7 @@
         </w:rPr>
         <w:t xml:space="preserve">McKinsey &amp; Company (2021) The importance of customer retention in e-commerce. Available at: </w:t>
       </w:r>
-      <w:hyperlink r:id="rId5" w:history="1">
+      <w:hyperlink r:id="rId9" w:history="1">
         <w:r>
           <w:rPr>
             <w:rStyle w:val="Hyperlink"/>
@@ -2083,6 +3237,7 @@
   <w:style w:type="character" w:default="1" w:styleId="DefaultParagraphFont">
     <w:name w:val="Default Paragraph Font"/>
     <w:uiPriority w:val="1"/>
+    <w:semiHidden/>
     <w:unhideWhenUsed/>
   </w:style>
   <w:style w:type="table" w:default="1" w:styleId="TableNormal">

</xml_diff>

<commit_message>
Add visualizations for EDA
</commit_message>
<xml_diff>
--- a/CA2_Capstone_Report.docx
+++ b/CA2_Capstone_Report.docx
@@ -1443,25 +1443,7 @@
           <w:sz w:val="24"/>
           <w:szCs w:val="24"/>
         </w:rPr>
-        <w:t xml:space="preserve">Information about the dataset, including the data types of each column and the amount of non-null values in each column, is shown using the </w:t>
-      </w:r>
-      <w:proofErr w:type="gramStart"/>
-      <w:r>
-        <w:rPr>
-          <w:rFonts w:ascii="Calibri" w:hAnsi="Calibri" w:cs="Calibri"/>
-          <w:sz w:val="24"/>
-          <w:szCs w:val="24"/>
-        </w:rPr>
-        <w:t>df.info(</w:t>
-      </w:r>
-      <w:proofErr w:type="gramEnd"/>
-      <w:r>
-        <w:rPr>
-          <w:rFonts w:ascii="Calibri" w:hAnsi="Calibri" w:cs="Calibri"/>
-          <w:sz w:val="24"/>
-          <w:szCs w:val="24"/>
-        </w:rPr>
-        <w:t>) method. This makes it possible to identify columns that might have missing values, which may be addressed during the data preparation process.</w:t>
+        <w:t>Information about the dataset, including the data types of each column and the amount of non-null values in each column, is shown using the df.info() method. This makes it possible to identify columns that might have missing values, which may be addressed during the data preparation process.</w:t>
       </w:r>
     </w:p>
     <w:p>
@@ -1714,7 +1696,6 @@
         <w:t xml:space="preserve">The </w:t>
       </w:r>
       <w:proofErr w:type="spellStart"/>
-      <w:proofErr w:type="gramStart"/>
       <w:r>
         <w:rPr>
           <w:rFonts w:ascii="Calibri" w:hAnsi="Calibri" w:cs="Calibri"/>
@@ -1724,32 +1705,13 @@
         <w:t>df.isnull</w:t>
       </w:r>
       <w:proofErr w:type="spellEnd"/>
-      <w:proofErr w:type="gramEnd"/>
-      <w:r>
-        <w:rPr>
-          <w:rFonts w:ascii="Calibri" w:hAnsi="Calibri" w:cs="Calibri"/>
-          <w:sz w:val="24"/>
-          <w:szCs w:val="24"/>
-        </w:rPr>
-        <w:t>(</w:t>
-      </w:r>
-      <w:proofErr w:type="gramStart"/>
-      <w:r>
-        <w:rPr>
-          <w:rFonts w:ascii="Calibri" w:hAnsi="Calibri" w:cs="Calibri"/>
-          <w:sz w:val="24"/>
-          <w:szCs w:val="24"/>
-        </w:rPr>
-        <w:t>).sum</w:t>
-      </w:r>
-      <w:proofErr w:type="gramEnd"/>
-      <w:r>
-        <w:rPr>
-          <w:rFonts w:ascii="Calibri" w:hAnsi="Calibri" w:cs="Calibri"/>
-          <w:sz w:val="24"/>
-          <w:szCs w:val="24"/>
-        </w:rPr>
-        <w:t>() is used to find columns that contain missing data. In order to plan the imputation or removal of these values during the Data Preparation phase, it is necessary to know the total number of missing values per column.</w:t>
+      <w:r>
+        <w:rPr>
+          <w:rFonts w:ascii="Calibri" w:hAnsi="Calibri" w:cs="Calibri"/>
+          <w:sz w:val="24"/>
+          <w:szCs w:val="24"/>
+        </w:rPr>
+        <w:t>().sum() is used to find columns that contain missing data. In order to plan the imputation or removal of these values during the Data Preparation phase, it is necessary to know the total number of missing values per column.</w:t>
       </w:r>
     </w:p>
     <w:p>
@@ -2498,6 +2460,736 @@
       <w:pPr>
         <w:rPr>
           <w:rFonts w:ascii="Calibri" w:hAnsi="Calibri" w:cs="Calibri"/>
+          <w:b/>
+          <w:bCs/>
+          <w:sz w:val="24"/>
+          <w:szCs w:val="24"/>
+        </w:rPr>
+      </w:pPr>
+      <w:r>
+        <w:rPr>
+          <w:rFonts w:ascii="Calibri" w:hAnsi="Calibri" w:cs="Calibri"/>
+          <w:b/>
+          <w:bCs/>
+          <w:sz w:val="24"/>
+          <w:szCs w:val="24"/>
+        </w:rPr>
+        <w:t>3. Relationship Between Key Features</w:t>
+      </w:r>
+    </w:p>
+    <w:p>
+      <w:pPr>
+        <w:rPr>
+          <w:rFonts w:ascii="Calibri" w:hAnsi="Calibri" w:cs="Calibri"/>
+          <w:sz w:val="24"/>
+          <w:szCs w:val="24"/>
+        </w:rPr>
+      </w:pPr>
+      <w:r>
+        <w:rPr>
+          <w:rFonts w:ascii="Calibri" w:hAnsi="Calibri" w:cs="Calibri"/>
+          <w:sz w:val="24"/>
+          <w:szCs w:val="24"/>
+        </w:rPr>
+        <w:t>The relationship between quantity and unit price is analysed using a scatter plot, which might reveal information about the relationship between product pricing and quantity purchased. This could show some interesting trends in purchasing behaviour.</w:t>
+      </w:r>
+    </w:p>
+    <w:p>
+      <w:pPr>
+        <w:rPr>
+          <w:rFonts w:ascii="Calibri" w:hAnsi="Calibri" w:cs="Calibri"/>
+          <w:sz w:val="24"/>
+          <w:szCs w:val="24"/>
+        </w:rPr>
+      </w:pPr>
+      <w:r>
+        <w:rPr>
+          <w:rFonts w:ascii="Calibri" w:hAnsi="Calibri" w:cs="Calibri"/>
+          <w:noProof/>
+          <w:sz w:val="24"/>
+          <w:szCs w:val="24"/>
+        </w:rPr>
+        <w:lastRenderedPageBreak/>
+        <w:drawing>
+          <wp:inline distT="0" distB="0" distL="0" distR="0" wp14:anchorId="63488547" wp14:editId="702DEB41">
+            <wp:extent cx="5731510" cy="3971290"/>
+            <wp:effectExtent l="0" t="0" r="2540" b="0"/>
+            <wp:docPr id="659788097" name="Picture 1" descr="A screen shot of a graph&#10;&#10;AI-generated content may be incorrect."/>
+            <wp:cNvGraphicFramePr>
+              <a:graphicFrameLocks xmlns:a="http://schemas.openxmlformats.org/drawingml/2006/main" noChangeAspect="1"/>
+            </wp:cNvGraphicFramePr>
+            <a:graphic xmlns:a="http://schemas.openxmlformats.org/drawingml/2006/main">
+              <a:graphicData uri="http://schemas.openxmlformats.org/drawingml/2006/picture">
+                <pic:pic xmlns:pic="http://schemas.openxmlformats.org/drawingml/2006/picture">
+                  <pic:nvPicPr>
+                    <pic:cNvPr id="659788097" name="Picture 1" descr="A screen shot of a graph&#10;&#10;AI-generated content may be incorrect."/>
+                    <pic:cNvPicPr/>
+                  </pic:nvPicPr>
+                  <pic:blipFill>
+                    <a:blip r:embed="rId12">
+                      <a:extLst>
+                        <a:ext uri="{28A0092B-C50C-407E-A947-70E740481C1C}">
+                          <a14:useLocalDpi xmlns:a14="http://schemas.microsoft.com/office/drawing/2010/main" val="0"/>
+                        </a:ext>
+                      </a:extLst>
+                    </a:blip>
+                    <a:stretch>
+                      <a:fillRect/>
+                    </a:stretch>
+                  </pic:blipFill>
+                  <pic:spPr>
+                    <a:xfrm>
+                      <a:off x="0" y="0"/>
+                      <a:ext cx="5731510" cy="3971290"/>
+                    </a:xfrm>
+                    <a:prstGeom prst="rect">
+                      <a:avLst/>
+                    </a:prstGeom>
+                  </pic:spPr>
+                </pic:pic>
+              </a:graphicData>
+            </a:graphic>
+          </wp:inline>
+        </w:drawing>
+      </w:r>
+    </w:p>
+    <w:p>
+      <w:pPr>
+        <w:rPr>
+          <w:rFonts w:ascii="Calibri" w:hAnsi="Calibri" w:cs="Calibri"/>
+          <w:sz w:val="24"/>
+          <w:szCs w:val="24"/>
+        </w:rPr>
+      </w:pPr>
+    </w:p>
+    <w:p>
+      <w:pPr>
+        <w:rPr>
+          <w:rFonts w:ascii="Calibri" w:hAnsi="Calibri" w:cs="Calibri"/>
+          <w:sz w:val="24"/>
+          <w:szCs w:val="24"/>
+        </w:rPr>
+      </w:pPr>
+      <w:r>
+        <w:rPr>
+          <w:rFonts w:ascii="Calibri" w:hAnsi="Calibri" w:cs="Calibri"/>
+          <w:sz w:val="24"/>
+          <w:szCs w:val="24"/>
+        </w:rPr>
+        <w:t>Most transactions include relatively small quantities and low prices, as shown by the scatter plot showing the relationship between quantity and unit price, which shows a significant concentration of data points clustered at the origin. The possibility of major outliers or perhaps inaccurate data entries is suggested by the presence of extreme values on both axes, such as abnormally high or negative quantities and abnormally high or negative unit prices. Interpretability is limited by these outliers, which distort the plot's general scale. This observation emphasises that before moving forward with model development, outlier detection and data cleansing are necessary.</w:t>
+      </w:r>
+    </w:p>
+    <w:p>
+      <w:pPr>
+        <w:rPr>
+          <w:rFonts w:ascii="Calibri" w:hAnsi="Calibri" w:cs="Calibri"/>
+          <w:b/>
+          <w:bCs/>
+          <w:sz w:val="24"/>
+          <w:szCs w:val="24"/>
+        </w:rPr>
+      </w:pPr>
+      <w:r>
+        <w:rPr>
+          <w:rFonts w:ascii="Calibri" w:hAnsi="Calibri" w:cs="Calibri"/>
+          <w:b/>
+          <w:bCs/>
+          <w:sz w:val="24"/>
+          <w:szCs w:val="24"/>
+        </w:rPr>
+        <w:t>4</w:t>
+      </w:r>
+      <w:r>
+        <w:rPr>
+          <w:rFonts w:ascii="Calibri" w:hAnsi="Calibri" w:cs="Calibri"/>
+          <w:b/>
+          <w:bCs/>
+          <w:sz w:val="24"/>
+          <w:szCs w:val="24"/>
+        </w:rPr>
+        <w:t>. Outlier Detection with Boxplots</w:t>
+      </w:r>
+    </w:p>
+    <w:p>
+      <w:pPr>
+        <w:rPr>
+          <w:rFonts w:ascii="Calibri" w:hAnsi="Calibri" w:cs="Calibri"/>
+          <w:sz w:val="24"/>
+          <w:szCs w:val="24"/>
+        </w:rPr>
+      </w:pPr>
+      <w:r>
+        <w:rPr>
+          <w:rFonts w:ascii="Calibri" w:hAnsi="Calibri" w:cs="Calibri"/>
+          <w:sz w:val="24"/>
+          <w:szCs w:val="24"/>
+        </w:rPr>
+        <w:t xml:space="preserve">Potential outliers in the Quantity and </w:t>
+      </w:r>
+      <w:proofErr w:type="spellStart"/>
+      <w:r>
+        <w:rPr>
+          <w:rFonts w:ascii="Calibri" w:hAnsi="Calibri" w:cs="Calibri"/>
+          <w:sz w:val="24"/>
+          <w:szCs w:val="24"/>
+        </w:rPr>
+        <w:t>UnitPrice</w:t>
+      </w:r>
+      <w:proofErr w:type="spellEnd"/>
+      <w:r>
+        <w:rPr>
+          <w:rFonts w:ascii="Calibri" w:hAnsi="Calibri" w:cs="Calibri"/>
+          <w:sz w:val="24"/>
+          <w:szCs w:val="24"/>
+        </w:rPr>
+        <w:t xml:space="preserve"> columns are found using boxplots. These excessive numbers may indicate data entry errors or unusual transactions that need more analysis.</w:t>
+      </w:r>
+    </w:p>
+    <w:p>
+      <w:pPr>
+        <w:rPr>
+          <w:rFonts w:ascii="Calibri" w:hAnsi="Calibri" w:cs="Calibri"/>
+          <w:sz w:val="24"/>
+          <w:szCs w:val="24"/>
+        </w:rPr>
+      </w:pPr>
+      <w:r>
+        <w:rPr>
+          <w:rFonts w:ascii="Calibri" w:hAnsi="Calibri" w:cs="Calibri"/>
+          <w:noProof/>
+          <w:sz w:val="24"/>
+          <w:szCs w:val="24"/>
+        </w:rPr>
+        <w:lastRenderedPageBreak/>
+        <w:drawing>
+          <wp:inline distT="0" distB="0" distL="0" distR="0" wp14:anchorId="2CA6FD1F" wp14:editId="1D49664E">
+            <wp:extent cx="5731510" cy="3761740"/>
+            <wp:effectExtent l="0" t="0" r="2540" b="0"/>
+            <wp:docPr id="1321212278" name="Picture 2" descr="A screenshot of a computer&#10;&#10;AI-generated content may be incorrect."/>
+            <wp:cNvGraphicFramePr>
+              <a:graphicFrameLocks xmlns:a="http://schemas.openxmlformats.org/drawingml/2006/main" noChangeAspect="1"/>
+            </wp:cNvGraphicFramePr>
+            <a:graphic xmlns:a="http://schemas.openxmlformats.org/drawingml/2006/main">
+              <a:graphicData uri="http://schemas.openxmlformats.org/drawingml/2006/picture">
+                <pic:pic xmlns:pic="http://schemas.openxmlformats.org/drawingml/2006/picture">
+                  <pic:nvPicPr>
+                    <pic:cNvPr id="1321212278" name="Picture 2" descr="A screenshot of a computer&#10;&#10;AI-generated content may be incorrect."/>
+                    <pic:cNvPicPr/>
+                  </pic:nvPicPr>
+                  <pic:blipFill>
+                    <a:blip r:embed="rId13">
+                      <a:extLst>
+                        <a:ext uri="{28A0092B-C50C-407E-A947-70E740481C1C}">
+                          <a14:useLocalDpi xmlns:a14="http://schemas.microsoft.com/office/drawing/2010/main" val="0"/>
+                        </a:ext>
+                      </a:extLst>
+                    </a:blip>
+                    <a:stretch>
+                      <a:fillRect/>
+                    </a:stretch>
+                  </pic:blipFill>
+                  <pic:spPr>
+                    <a:xfrm>
+                      <a:off x="0" y="0"/>
+                      <a:ext cx="5731510" cy="3761740"/>
+                    </a:xfrm>
+                    <a:prstGeom prst="rect">
+                      <a:avLst/>
+                    </a:prstGeom>
+                  </pic:spPr>
+                </pic:pic>
+              </a:graphicData>
+            </a:graphic>
+          </wp:inline>
+        </w:drawing>
+      </w:r>
+    </w:p>
+    <w:p>
+      <w:pPr>
+        <w:rPr>
+          <w:rFonts w:ascii="Calibri" w:hAnsi="Calibri" w:cs="Calibri"/>
+          <w:sz w:val="24"/>
+          <w:szCs w:val="24"/>
+        </w:rPr>
+      </w:pPr>
+      <w:r>
+        <w:rPr>
+          <w:rFonts w:ascii="Calibri" w:hAnsi="Calibri" w:cs="Calibri"/>
+          <w:noProof/>
+          <w:sz w:val="24"/>
+          <w:szCs w:val="24"/>
+        </w:rPr>
+        <w:drawing>
+          <wp:inline distT="0" distB="0" distL="0" distR="0" wp14:anchorId="23E68239" wp14:editId="5D1E8DE9">
+            <wp:extent cx="5731510" cy="3453765"/>
+            <wp:effectExtent l="0" t="0" r="2540" b="0"/>
+            <wp:docPr id="874166402" name="Picture 3" descr="A graph with numbers and a line&#10;&#10;AI-generated content may be incorrect."/>
+            <wp:cNvGraphicFramePr>
+              <a:graphicFrameLocks xmlns:a="http://schemas.openxmlformats.org/drawingml/2006/main" noChangeAspect="1"/>
+            </wp:cNvGraphicFramePr>
+            <a:graphic xmlns:a="http://schemas.openxmlformats.org/drawingml/2006/main">
+              <a:graphicData uri="http://schemas.openxmlformats.org/drawingml/2006/picture">
+                <pic:pic xmlns:pic="http://schemas.openxmlformats.org/drawingml/2006/picture">
+                  <pic:nvPicPr>
+                    <pic:cNvPr id="874166402" name="Picture 3" descr="A graph with numbers and a line&#10;&#10;AI-generated content may be incorrect."/>
+                    <pic:cNvPicPr/>
+                  </pic:nvPicPr>
+                  <pic:blipFill>
+                    <a:blip r:embed="rId14">
+                      <a:extLst>
+                        <a:ext uri="{28A0092B-C50C-407E-A947-70E740481C1C}">
+                          <a14:useLocalDpi xmlns:a14="http://schemas.microsoft.com/office/drawing/2010/main" val="0"/>
+                        </a:ext>
+                      </a:extLst>
+                    </a:blip>
+                    <a:stretch>
+                      <a:fillRect/>
+                    </a:stretch>
+                  </pic:blipFill>
+                  <pic:spPr>
+                    <a:xfrm>
+                      <a:off x="0" y="0"/>
+                      <a:ext cx="5731510" cy="3453765"/>
+                    </a:xfrm>
+                    <a:prstGeom prst="rect">
+                      <a:avLst/>
+                    </a:prstGeom>
+                  </pic:spPr>
+                </pic:pic>
+              </a:graphicData>
+            </a:graphic>
+          </wp:inline>
+        </w:drawing>
+      </w:r>
+    </w:p>
+    <w:p>
+      <w:pPr>
+        <w:rPr>
+          <w:rFonts w:ascii="Calibri" w:hAnsi="Calibri" w:cs="Calibri"/>
+          <w:sz w:val="24"/>
+          <w:szCs w:val="24"/>
+        </w:rPr>
+      </w:pPr>
+    </w:p>
+    <w:p>
+      <w:pPr>
+        <w:rPr>
+          <w:rFonts w:ascii="Calibri" w:hAnsi="Calibri" w:cs="Calibri"/>
+          <w:sz w:val="24"/>
+          <w:szCs w:val="24"/>
+        </w:rPr>
+      </w:pPr>
+      <w:r>
+        <w:rPr>
+          <w:rFonts w:ascii="Calibri" w:hAnsi="Calibri" w:cs="Calibri"/>
+          <w:sz w:val="24"/>
+          <w:szCs w:val="24"/>
+        </w:rPr>
+        <w:t>Significant outliers in both quantity and unit price are present in the data set, which causes skewed distributions. Extreme bulk orders and negative values</w:t>
+      </w:r>
+      <w:r>
+        <w:rPr>
+          <w:rFonts w:ascii="Calibri" w:hAnsi="Calibri" w:cs="Calibri"/>
+          <w:sz w:val="24"/>
+          <w:szCs w:val="24"/>
+        </w:rPr>
+        <w:t xml:space="preserve">, </w:t>
+      </w:r>
+      <w:r>
+        <w:rPr>
+          <w:rFonts w:ascii="Calibri" w:hAnsi="Calibri" w:cs="Calibri"/>
+          <w:sz w:val="24"/>
+          <w:szCs w:val="24"/>
+        </w:rPr>
+        <w:t>likely the result of refunds or data errors</w:t>
+      </w:r>
+      <w:r>
+        <w:rPr>
+          <w:rFonts w:ascii="Calibri" w:hAnsi="Calibri" w:cs="Calibri"/>
+          <w:sz w:val="24"/>
+          <w:szCs w:val="24"/>
+        </w:rPr>
+        <w:t xml:space="preserve">, </w:t>
+      </w:r>
+      <w:r>
+        <w:rPr>
+          <w:rFonts w:ascii="Calibri" w:hAnsi="Calibri" w:cs="Calibri"/>
+          <w:sz w:val="24"/>
+          <w:szCs w:val="24"/>
+        </w:rPr>
+        <w:t>are included in quantity. The unit price varies greatly; negative numbers indicate adjustments or inaccurate entries. To improve the reliability of the data for analysis, these anomalies require preprocessing, such as handling outliers and normalising the data.</w:t>
+      </w:r>
+    </w:p>
+    <w:p>
+      <w:pPr>
+        <w:rPr>
+          <w:rFonts w:ascii="Calibri" w:hAnsi="Calibri" w:cs="Calibri"/>
+          <w:b/>
+          <w:bCs/>
+          <w:sz w:val="24"/>
+          <w:szCs w:val="24"/>
+        </w:rPr>
+      </w:pPr>
+      <w:r>
+        <w:rPr>
+          <w:rFonts w:ascii="Calibri" w:hAnsi="Calibri" w:cs="Calibri"/>
+          <w:b/>
+          <w:bCs/>
+          <w:sz w:val="24"/>
+          <w:szCs w:val="24"/>
+        </w:rPr>
+        <w:lastRenderedPageBreak/>
+        <w:t>5</w:t>
+      </w:r>
+      <w:r>
+        <w:rPr>
+          <w:rFonts w:ascii="Calibri" w:hAnsi="Calibri" w:cs="Calibri"/>
+          <w:b/>
+          <w:bCs/>
+          <w:sz w:val="24"/>
+          <w:szCs w:val="24"/>
+        </w:rPr>
+        <w:t>. Correlation Matrix</w:t>
+      </w:r>
+    </w:p>
+    <w:p>
+      <w:pPr>
+        <w:rPr>
+          <w:rFonts w:ascii="Calibri" w:hAnsi="Calibri" w:cs="Calibri"/>
+          <w:sz w:val="24"/>
+          <w:szCs w:val="24"/>
+        </w:rPr>
+      </w:pPr>
+      <w:r>
+        <w:rPr>
+          <w:rFonts w:ascii="Calibri" w:hAnsi="Calibri" w:cs="Calibri"/>
+          <w:sz w:val="24"/>
+          <w:szCs w:val="24"/>
+        </w:rPr>
+        <w:t>Understanding the relationships between numerical variables is made easier by the correlation matrix.</w:t>
+      </w:r>
+      <w:r>
+        <w:rPr>
+          <w:rFonts w:ascii="Calibri" w:hAnsi="Calibri" w:cs="Calibri"/>
+          <w:sz w:val="24"/>
+          <w:szCs w:val="24"/>
+        </w:rPr>
+        <w:t xml:space="preserve"> </w:t>
+      </w:r>
+      <w:r>
+        <w:rPr>
+          <w:rFonts w:ascii="Calibri" w:hAnsi="Calibri" w:cs="Calibri"/>
+          <w:sz w:val="24"/>
+          <w:szCs w:val="24"/>
+        </w:rPr>
+        <w:t>It is especially helpful in identifying linear relationships that could be used in predictive modelling.</w:t>
+      </w:r>
+    </w:p>
+    <w:p>
+      <w:pPr>
+        <w:rPr>
+          <w:rFonts w:ascii="Calibri" w:hAnsi="Calibri" w:cs="Calibri"/>
+          <w:b/>
+          <w:bCs/>
+          <w:sz w:val="24"/>
+          <w:szCs w:val="24"/>
+        </w:rPr>
+      </w:pPr>
+      <w:r>
+        <w:rPr>
+          <w:rFonts w:ascii="Calibri" w:hAnsi="Calibri" w:cs="Calibri"/>
+          <w:b/>
+          <w:bCs/>
+          <w:noProof/>
+          <w:sz w:val="24"/>
+          <w:szCs w:val="24"/>
+        </w:rPr>
+        <w:drawing>
+          <wp:inline distT="0" distB="0" distL="0" distR="0" wp14:anchorId="78370F3D" wp14:editId="73509111">
+            <wp:extent cx="5731510" cy="3844925"/>
+            <wp:effectExtent l="0" t="0" r="2540" b="3175"/>
+            <wp:docPr id="487681910" name="Picture 4" descr="A screenshot of a computer&#10;&#10;AI-generated content may be incorrect."/>
+            <wp:cNvGraphicFramePr>
+              <a:graphicFrameLocks xmlns:a="http://schemas.openxmlformats.org/drawingml/2006/main" noChangeAspect="1"/>
+            </wp:cNvGraphicFramePr>
+            <a:graphic xmlns:a="http://schemas.openxmlformats.org/drawingml/2006/main">
+              <a:graphicData uri="http://schemas.openxmlformats.org/drawingml/2006/picture">
+                <pic:pic xmlns:pic="http://schemas.openxmlformats.org/drawingml/2006/picture">
+                  <pic:nvPicPr>
+                    <pic:cNvPr id="487681910" name="Picture 4" descr="A screenshot of a computer&#10;&#10;AI-generated content may be incorrect."/>
+                    <pic:cNvPicPr/>
+                  </pic:nvPicPr>
+                  <pic:blipFill>
+                    <a:blip r:embed="rId15">
+                      <a:extLst>
+                        <a:ext uri="{28A0092B-C50C-407E-A947-70E740481C1C}">
+                          <a14:useLocalDpi xmlns:a14="http://schemas.microsoft.com/office/drawing/2010/main" val="0"/>
+                        </a:ext>
+                      </a:extLst>
+                    </a:blip>
+                    <a:stretch>
+                      <a:fillRect/>
+                    </a:stretch>
+                  </pic:blipFill>
+                  <pic:spPr>
+                    <a:xfrm>
+                      <a:off x="0" y="0"/>
+                      <a:ext cx="5731510" cy="3844925"/>
+                    </a:xfrm>
+                    <a:prstGeom prst="rect">
+                      <a:avLst/>
+                    </a:prstGeom>
+                  </pic:spPr>
+                </pic:pic>
+              </a:graphicData>
+            </a:graphic>
+          </wp:inline>
+        </w:drawing>
+      </w:r>
+    </w:p>
+    <w:p>
+      <w:pPr>
+        <w:rPr>
+          <w:rFonts w:ascii="Calibri" w:hAnsi="Calibri" w:cs="Calibri"/>
+          <w:b/>
+          <w:bCs/>
+          <w:sz w:val="24"/>
+          <w:szCs w:val="24"/>
+        </w:rPr>
+      </w:pPr>
+    </w:p>
+    <w:p>
+      <w:pPr>
+        <w:rPr>
+          <w:rFonts w:ascii="Calibri" w:hAnsi="Calibri" w:cs="Calibri"/>
+          <w:sz w:val="24"/>
+          <w:szCs w:val="24"/>
+        </w:rPr>
+      </w:pPr>
+      <w:r>
+        <w:rPr>
+          <w:rFonts w:ascii="Calibri" w:hAnsi="Calibri" w:cs="Calibri"/>
+          <w:sz w:val="24"/>
+          <w:szCs w:val="24"/>
+        </w:rPr>
+        <w:t xml:space="preserve">There is no significant linear relationship between the number of items purchased and their pricing, according to the correlation matrix, which shows that quantity and unit price have a weak correlation. This implies that price changes have little effect on the number of purchases, most likely as a result of different product kinds and consumer behaviour. </w:t>
+      </w:r>
+      <w:r>
+        <w:rPr>
+          <w:rFonts w:ascii="Calibri" w:hAnsi="Calibri" w:cs="Calibri"/>
+          <w:sz w:val="24"/>
+          <w:szCs w:val="24"/>
+        </w:rPr>
+        <w:t>This</w:t>
+      </w:r>
+      <w:r>
+        <w:rPr>
+          <w:rFonts w:ascii="Calibri" w:hAnsi="Calibri" w:cs="Calibri"/>
+          <w:sz w:val="24"/>
+          <w:szCs w:val="24"/>
+        </w:rPr>
+        <w:t xml:space="preserve"> </w:t>
+      </w:r>
+      <w:r>
+        <w:rPr>
+          <w:rFonts w:ascii="Calibri" w:hAnsi="Calibri" w:cs="Calibri"/>
+          <w:sz w:val="24"/>
+          <w:szCs w:val="24"/>
+        </w:rPr>
+        <w:t>implies that in order to have a more thorough understanding of purchasing patterns, the assignment analysis needs aggregated variables.</w:t>
+      </w:r>
+    </w:p>
+    <w:p>
+      <w:pPr>
+        <w:rPr>
+          <w:rFonts w:ascii="Calibri" w:hAnsi="Calibri" w:cs="Calibri"/>
+          <w:b/>
+          <w:bCs/>
+          <w:sz w:val="24"/>
+          <w:szCs w:val="24"/>
+        </w:rPr>
+      </w:pPr>
+      <w:r>
+        <w:rPr>
+          <w:rFonts w:ascii="Calibri" w:hAnsi="Calibri" w:cs="Calibri"/>
+          <w:b/>
+          <w:bCs/>
+          <w:sz w:val="24"/>
+          <w:szCs w:val="24"/>
+        </w:rPr>
+        <w:t>6</w:t>
+      </w:r>
+      <w:r>
+        <w:rPr>
+          <w:rFonts w:ascii="Calibri" w:hAnsi="Calibri" w:cs="Calibri"/>
+          <w:b/>
+          <w:bCs/>
+          <w:sz w:val="24"/>
+          <w:szCs w:val="24"/>
+        </w:rPr>
+        <w:t>. Skewness Check</w:t>
+      </w:r>
+    </w:p>
+    <w:p>
+      <w:pPr>
+        <w:rPr>
+          <w:rFonts w:ascii="Calibri" w:hAnsi="Calibri" w:cs="Calibri"/>
+          <w:sz w:val="24"/>
+          <w:szCs w:val="24"/>
+        </w:rPr>
+      </w:pPr>
+      <w:r>
+        <w:rPr>
+          <w:rFonts w:ascii="Calibri" w:hAnsi="Calibri" w:cs="Calibri"/>
+          <w:sz w:val="24"/>
+          <w:szCs w:val="24"/>
+        </w:rPr>
+        <w:t xml:space="preserve">Lastly, determining whether data transformations (such log transformations) might be required to normalise the data for modelling purposes is made easier by analysing the skewness of the numerical features (Quantity and </w:t>
+      </w:r>
+      <w:proofErr w:type="spellStart"/>
+      <w:r>
+        <w:rPr>
+          <w:rFonts w:ascii="Calibri" w:hAnsi="Calibri" w:cs="Calibri"/>
+          <w:sz w:val="24"/>
+          <w:szCs w:val="24"/>
+        </w:rPr>
+        <w:t>UnitPrice</w:t>
+      </w:r>
+      <w:proofErr w:type="spellEnd"/>
+      <w:r>
+        <w:rPr>
+          <w:rFonts w:ascii="Calibri" w:hAnsi="Calibri" w:cs="Calibri"/>
+          <w:sz w:val="24"/>
+          <w:szCs w:val="24"/>
+        </w:rPr>
+        <w:t>).</w:t>
+      </w:r>
+    </w:p>
+    <w:p>
+      <w:pPr>
+        <w:rPr>
+          <w:rFonts w:ascii="Calibri" w:hAnsi="Calibri" w:cs="Calibri"/>
+          <w:sz w:val="24"/>
+          <w:szCs w:val="24"/>
+        </w:rPr>
+      </w:pPr>
+    </w:p>
+    <w:p>
+      <w:pPr>
+        <w:rPr>
+          <w:rFonts w:ascii="Calibri" w:hAnsi="Calibri" w:cs="Calibri"/>
+          <w:sz w:val="24"/>
+          <w:szCs w:val="24"/>
+        </w:rPr>
+      </w:pPr>
+      <w:r>
+        <w:rPr>
+          <w:rFonts w:ascii="Calibri" w:hAnsi="Calibri" w:cs="Calibri"/>
+          <w:noProof/>
+          <w:sz w:val="24"/>
+          <w:szCs w:val="24"/>
+        </w:rPr>
+        <w:lastRenderedPageBreak/>
+        <w:drawing>
+          <wp:inline distT="0" distB="0" distL="0" distR="0" wp14:anchorId="74DA2764" wp14:editId="70262F05">
+            <wp:extent cx="5731510" cy="990600"/>
+            <wp:effectExtent l="0" t="0" r="2540" b="0"/>
+            <wp:docPr id="1072442842" name="Picture 5" descr="A screen shot of a computer code&#10;&#10;AI-generated content may be incorrect."/>
+            <wp:cNvGraphicFramePr>
+              <a:graphicFrameLocks xmlns:a="http://schemas.openxmlformats.org/drawingml/2006/main" noChangeAspect="1"/>
+            </wp:cNvGraphicFramePr>
+            <a:graphic xmlns:a="http://schemas.openxmlformats.org/drawingml/2006/main">
+              <a:graphicData uri="http://schemas.openxmlformats.org/drawingml/2006/picture">
+                <pic:pic xmlns:pic="http://schemas.openxmlformats.org/drawingml/2006/picture">
+                  <pic:nvPicPr>
+                    <pic:cNvPr id="1072442842" name="Picture 5" descr="A screen shot of a computer code&#10;&#10;AI-generated content may be incorrect."/>
+                    <pic:cNvPicPr/>
+                  </pic:nvPicPr>
+                  <pic:blipFill>
+                    <a:blip r:embed="rId16">
+                      <a:extLst>
+                        <a:ext uri="{28A0092B-C50C-407E-A947-70E740481C1C}">
+                          <a14:useLocalDpi xmlns:a14="http://schemas.microsoft.com/office/drawing/2010/main" val="0"/>
+                        </a:ext>
+                      </a:extLst>
+                    </a:blip>
+                    <a:stretch>
+                      <a:fillRect/>
+                    </a:stretch>
+                  </pic:blipFill>
+                  <pic:spPr>
+                    <a:xfrm>
+                      <a:off x="0" y="0"/>
+                      <a:ext cx="5731510" cy="990600"/>
+                    </a:xfrm>
+                    <a:prstGeom prst="rect">
+                      <a:avLst/>
+                    </a:prstGeom>
+                  </pic:spPr>
+                </pic:pic>
+              </a:graphicData>
+            </a:graphic>
+          </wp:inline>
+        </w:drawing>
+      </w:r>
+    </w:p>
+    <w:p>
+      <w:pPr>
+        <w:rPr>
+          <w:rFonts w:ascii="Calibri" w:hAnsi="Calibri" w:cs="Calibri"/>
+          <w:sz w:val="24"/>
+          <w:szCs w:val="24"/>
+        </w:rPr>
+      </w:pPr>
+    </w:p>
+    <w:p>
+      <w:pPr>
+        <w:rPr>
+          <w:rFonts w:ascii="Calibri" w:hAnsi="Calibri" w:cs="Calibri"/>
+          <w:sz w:val="24"/>
+          <w:szCs w:val="24"/>
+        </w:rPr>
+      </w:pPr>
+      <w:r>
+        <w:rPr>
+          <w:rFonts w:ascii="Calibri" w:hAnsi="Calibri" w:cs="Calibri"/>
+          <w:sz w:val="24"/>
+          <w:szCs w:val="24"/>
+        </w:rPr>
+        <w:t xml:space="preserve">To comprehend the distribution of the data, the skewness of key numerical variables was assessed. With a skewness of -0.26, the quantity variable shows a distribution that is almost symmetric but slightly skewed to the left. </w:t>
+      </w:r>
+      <w:proofErr w:type="spellStart"/>
+      <w:r>
+        <w:rPr>
+          <w:rFonts w:ascii="Calibri" w:hAnsi="Calibri" w:cs="Calibri"/>
+          <w:sz w:val="24"/>
+          <w:szCs w:val="24"/>
+        </w:rPr>
+        <w:t>UnitPrice</w:t>
+      </w:r>
+      <w:proofErr w:type="spellEnd"/>
+      <w:r>
+        <w:rPr>
+          <w:rFonts w:ascii="Calibri" w:hAnsi="Calibri" w:cs="Calibri"/>
+          <w:sz w:val="24"/>
+          <w:szCs w:val="24"/>
+        </w:rPr>
+        <w:t>, on the other hand, shows excessive positive skewness (186.51), indicating a significant concentration of low-priced items with a few numbers of extremely high-priced outliers. This suggests that further analysis may require data transformation or outlier treatment.</w:t>
+      </w:r>
+    </w:p>
+    <w:p>
+      <w:pPr>
+        <w:rPr>
+          <w:rFonts w:ascii="Calibri" w:hAnsi="Calibri" w:cs="Calibri"/>
+          <w:sz w:val="24"/>
+          <w:szCs w:val="24"/>
+        </w:rPr>
+      </w:pPr>
+    </w:p>
+    <w:p>
+      <w:pPr>
+        <w:rPr>
+          <w:rFonts w:ascii="Calibri" w:hAnsi="Calibri" w:cs="Calibri"/>
           <w:sz w:val="24"/>
           <w:szCs w:val="24"/>
         </w:rPr>
@@ -2564,10 +3256,9 @@
           <w:sz w:val="24"/>
           <w:szCs w:val="24"/>
         </w:rPr>
-        <w:lastRenderedPageBreak/>
         <w:t xml:space="preserve">McKinsey &amp; Company (2021) The importance of customer retention in e-commerce. Available at: </w:t>
       </w:r>
-      <w:hyperlink r:id="rId12" w:history="1">
+      <w:hyperlink r:id="rId17" w:history="1">
         <w:r>
           <w:rPr>
             <w:rStyle w:val="Hyperlink"/>

</xml_diff>

<commit_message>
Add machine learning implementation
</commit_message>
<xml_diff>
--- a/CA2_Capstone_Report.docx
+++ b/CA2_Capstone_Report.docx
@@ -1443,25 +1443,7 @@
           <w:sz w:val="24"/>
           <w:szCs w:val="24"/>
         </w:rPr>
-        <w:t xml:space="preserve">Information about the dataset, including the data types of each column and the amount of non-null values in each column, is shown using the </w:t>
-      </w:r>
-      <w:proofErr w:type="gramStart"/>
-      <w:r>
-        <w:rPr>
-          <w:rFonts w:ascii="Calibri" w:hAnsi="Calibri" w:cs="Calibri"/>
-          <w:sz w:val="24"/>
-          <w:szCs w:val="24"/>
-        </w:rPr>
-        <w:t>df.info(</w:t>
-      </w:r>
-      <w:proofErr w:type="gramEnd"/>
-      <w:r>
-        <w:rPr>
-          <w:rFonts w:ascii="Calibri" w:hAnsi="Calibri" w:cs="Calibri"/>
-          <w:sz w:val="24"/>
-          <w:szCs w:val="24"/>
-        </w:rPr>
-        <w:t>) method. This makes it possible to identify columns that might have missing values, which may be addressed during the data preparation process.</w:t>
+        <w:t>Information about the dataset, including the data types of each column and the amount of non-null values in each column, is shown using the df.info() method. This makes it possible to identify columns that might have missing values, which may be addressed during the data preparation process.</w:t>
       </w:r>
     </w:p>
     <w:p>
@@ -1714,7 +1696,6 @@
         <w:t xml:space="preserve">The </w:t>
       </w:r>
       <w:proofErr w:type="spellStart"/>
-      <w:proofErr w:type="gramStart"/>
       <w:r>
         <w:rPr>
           <w:rFonts w:ascii="Calibri" w:hAnsi="Calibri" w:cs="Calibri"/>
@@ -1724,32 +1705,13 @@
         <w:t>df.isnull</w:t>
       </w:r>
       <w:proofErr w:type="spellEnd"/>
-      <w:proofErr w:type="gramEnd"/>
-      <w:r>
-        <w:rPr>
-          <w:rFonts w:ascii="Calibri" w:hAnsi="Calibri" w:cs="Calibri"/>
-          <w:sz w:val="24"/>
-          <w:szCs w:val="24"/>
-        </w:rPr>
-        <w:t>(</w:t>
-      </w:r>
-      <w:proofErr w:type="gramStart"/>
-      <w:r>
-        <w:rPr>
-          <w:rFonts w:ascii="Calibri" w:hAnsi="Calibri" w:cs="Calibri"/>
-          <w:sz w:val="24"/>
-          <w:szCs w:val="24"/>
-        </w:rPr>
-        <w:t>).sum</w:t>
-      </w:r>
-      <w:proofErr w:type="gramEnd"/>
-      <w:r>
-        <w:rPr>
-          <w:rFonts w:ascii="Calibri" w:hAnsi="Calibri" w:cs="Calibri"/>
-          <w:sz w:val="24"/>
-          <w:szCs w:val="24"/>
-        </w:rPr>
-        <w:t>() is used to find columns that contain missing data. In order to plan the imputation or removal of these values during the Data Preparation phase, it is necessary to know the total number of missing values per column.</w:t>
+      <w:r>
+        <w:rPr>
+          <w:rFonts w:ascii="Calibri" w:hAnsi="Calibri" w:cs="Calibri"/>
+          <w:sz w:val="24"/>
+          <w:szCs w:val="24"/>
+        </w:rPr>
+        <w:t>().sum() is used to find columns that contain missing data. In order to plan the imputation or removal of these values during the Data Preparation phase, it is necessary to know the total number of missing values per column.</w:t>
       </w:r>
     </w:p>
     <w:p>
@@ -4567,99 +4529,248 @@
       <w:pPr>
         <w:rPr>
           <w:rFonts w:ascii="Calibri" w:hAnsi="Calibri" w:cs="Calibri"/>
-          <w:sz w:val="24"/>
-          <w:szCs w:val="24"/>
-        </w:rPr>
-      </w:pPr>
-    </w:p>
-    <w:p>
-      <w:pPr>
-        <w:rPr>
-          <w:rFonts w:ascii="Calibri" w:hAnsi="Calibri" w:cs="Calibri"/>
-          <w:sz w:val="24"/>
-          <w:szCs w:val="24"/>
-        </w:rPr>
-      </w:pPr>
-    </w:p>
-    <w:p>
-      <w:pPr>
-        <w:rPr>
-          <w:rFonts w:ascii="Calibri" w:hAnsi="Calibri" w:cs="Calibri"/>
-          <w:sz w:val="24"/>
-          <w:szCs w:val="24"/>
-        </w:rPr>
-      </w:pPr>
-    </w:p>
-    <w:p>
-      <w:pPr>
-        <w:rPr>
-          <w:rFonts w:ascii="Calibri" w:hAnsi="Calibri" w:cs="Calibri"/>
-          <w:sz w:val="24"/>
-          <w:szCs w:val="24"/>
-        </w:rPr>
-      </w:pPr>
-    </w:p>
-    <w:p>
-      <w:pPr>
-        <w:rPr>
-          <w:rFonts w:ascii="Calibri" w:hAnsi="Calibri" w:cs="Calibri"/>
-          <w:sz w:val="24"/>
-          <w:szCs w:val="24"/>
-        </w:rPr>
-      </w:pPr>
-    </w:p>
-    <w:p>
-      <w:pPr>
-        <w:rPr>
-          <w:rFonts w:ascii="Calibri" w:hAnsi="Calibri" w:cs="Calibri"/>
-          <w:sz w:val="24"/>
-          <w:szCs w:val="24"/>
-        </w:rPr>
-      </w:pPr>
-    </w:p>
-    <w:p>
-      <w:pPr>
-        <w:rPr>
-          <w:rFonts w:ascii="Calibri" w:hAnsi="Calibri" w:cs="Calibri"/>
-          <w:sz w:val="24"/>
-          <w:szCs w:val="24"/>
-        </w:rPr>
-      </w:pPr>
-    </w:p>
-    <w:p>
-      <w:pPr>
-        <w:rPr>
-          <w:rFonts w:ascii="Calibri" w:hAnsi="Calibri" w:cs="Calibri"/>
-          <w:sz w:val="24"/>
-          <w:szCs w:val="24"/>
-        </w:rPr>
-      </w:pPr>
-    </w:p>
-    <w:p>
-      <w:pPr>
-        <w:rPr>
-          <w:rFonts w:ascii="Calibri" w:hAnsi="Calibri" w:cs="Calibri"/>
-          <w:sz w:val="24"/>
-          <w:szCs w:val="24"/>
-        </w:rPr>
-      </w:pPr>
-    </w:p>
-    <w:p>
-      <w:pPr>
-        <w:rPr>
-          <w:rFonts w:ascii="Calibri" w:hAnsi="Calibri" w:cs="Calibri"/>
-          <w:sz w:val="24"/>
-          <w:szCs w:val="24"/>
-        </w:rPr>
-      </w:pPr>
-      <w:r>
-        <w:rPr>
-          <w:rFonts w:ascii="Calibri" w:hAnsi="Calibri" w:cs="Calibri"/>
           <w:b/>
           <w:bCs/>
           <w:sz w:val="28"/>
           <w:szCs w:val="28"/>
         </w:rPr>
+      </w:pPr>
+      <w:r>
+        <w:rPr>
+          <w:rFonts w:ascii="Calibri" w:hAnsi="Calibri" w:cs="Calibri"/>
+          <w:b/>
+          <w:bCs/>
+          <w:sz w:val="28"/>
+          <w:szCs w:val="28"/>
+        </w:rPr>
+        <w:t>6. Machine Learning Implementation</w:t>
+      </w:r>
+    </w:p>
+    <w:p>
+      <w:pPr>
+        <w:rPr>
+          <w:rFonts w:ascii="Calibri" w:hAnsi="Calibri" w:cs="Calibri"/>
+          <w:b/>
+          <w:bCs/>
+          <w:sz w:val="24"/>
+          <w:szCs w:val="24"/>
+        </w:rPr>
+      </w:pPr>
+      <w:r>
+        <w:rPr>
+          <w:rFonts w:ascii="Calibri" w:hAnsi="Calibri" w:cs="Calibri"/>
+          <w:b/>
+          <w:bCs/>
+          <w:sz w:val="24"/>
+          <w:szCs w:val="24"/>
+        </w:rPr>
+        <w:t>6.1 Customer Segmentation with K-Means</w:t>
+      </w:r>
+    </w:p>
+    <w:p>
+      <w:pPr>
+        <w:rPr>
+          <w:rFonts w:ascii="Calibri" w:hAnsi="Calibri" w:cs="Calibri"/>
+          <w:sz w:val="24"/>
+          <w:szCs w:val="24"/>
+        </w:rPr>
+      </w:pPr>
+      <w:r>
+        <w:rPr>
+          <w:rFonts w:ascii="Calibri" w:hAnsi="Calibri" w:cs="Calibri"/>
+          <w:sz w:val="24"/>
+          <w:szCs w:val="24"/>
+        </w:rPr>
+        <w:t xml:space="preserve">The standardised customer-level features </w:t>
+      </w:r>
+      <w:proofErr w:type="spellStart"/>
+      <w:r>
+        <w:rPr>
+          <w:rFonts w:ascii="Calibri" w:hAnsi="Calibri" w:cs="Calibri"/>
+          <w:sz w:val="24"/>
+          <w:szCs w:val="24"/>
+        </w:rPr>
+        <w:t>TotalSpend</w:t>
+      </w:r>
+      <w:proofErr w:type="spellEnd"/>
+      <w:r>
+        <w:rPr>
+          <w:rFonts w:ascii="Calibri" w:hAnsi="Calibri" w:cs="Calibri"/>
+          <w:sz w:val="24"/>
+          <w:szCs w:val="24"/>
+        </w:rPr>
+        <w:t xml:space="preserve">, </w:t>
+      </w:r>
+      <w:proofErr w:type="spellStart"/>
+      <w:r>
+        <w:rPr>
+          <w:rFonts w:ascii="Calibri" w:hAnsi="Calibri" w:cs="Calibri"/>
+          <w:sz w:val="24"/>
+          <w:szCs w:val="24"/>
+        </w:rPr>
+        <w:t>TotalQuantity</w:t>
+      </w:r>
+      <w:proofErr w:type="spellEnd"/>
+      <w:r>
+        <w:rPr>
+          <w:rFonts w:ascii="Calibri" w:hAnsi="Calibri" w:cs="Calibri"/>
+          <w:sz w:val="24"/>
+          <w:szCs w:val="24"/>
+        </w:rPr>
+        <w:t xml:space="preserve">, </w:t>
+      </w:r>
+      <w:proofErr w:type="spellStart"/>
+      <w:r>
+        <w:rPr>
+          <w:rFonts w:ascii="Calibri" w:hAnsi="Calibri" w:cs="Calibri"/>
+          <w:sz w:val="24"/>
+          <w:szCs w:val="24"/>
+        </w:rPr>
+        <w:t>PurchaseFrequency</w:t>
+      </w:r>
+      <w:proofErr w:type="spellEnd"/>
+      <w:r>
+        <w:rPr>
+          <w:rFonts w:ascii="Calibri" w:hAnsi="Calibri" w:cs="Calibri"/>
+          <w:sz w:val="24"/>
+          <w:szCs w:val="24"/>
+        </w:rPr>
+        <w:t xml:space="preserve">, and </w:t>
+      </w:r>
+      <w:proofErr w:type="spellStart"/>
+      <w:r>
+        <w:rPr>
+          <w:rFonts w:ascii="Calibri" w:hAnsi="Calibri" w:cs="Calibri"/>
+          <w:sz w:val="24"/>
+          <w:szCs w:val="24"/>
+        </w:rPr>
+        <w:t>CustomerAgeDays</w:t>
+      </w:r>
+      <w:proofErr w:type="spellEnd"/>
+      <w:r>
+        <w:rPr>
+          <w:rFonts w:ascii="Calibri" w:hAnsi="Calibri" w:cs="Calibri"/>
+          <w:sz w:val="24"/>
+          <w:szCs w:val="24"/>
+        </w:rPr>
+        <w:t xml:space="preserve"> were subjected to K-Means clustering in order to discern discrete behavioural customer groupings. The goal of the clustering was to identify underlying customer characteristics, such as frequent purchases, large spenders, and loyal repeat customers.</w:t>
+      </w:r>
+    </w:p>
+    <w:p>
+      <w:pPr>
+        <w:rPr>
+          <w:rFonts w:ascii="Calibri" w:hAnsi="Calibri" w:cs="Calibri"/>
+          <w:sz w:val="24"/>
+          <w:szCs w:val="24"/>
+        </w:rPr>
+      </w:pPr>
+    </w:p>
+    <w:p>
+      <w:pPr>
+        <w:rPr>
+          <w:rFonts w:ascii="Calibri" w:hAnsi="Calibri" w:cs="Calibri"/>
+          <w:sz w:val="24"/>
+          <w:szCs w:val="24"/>
+        </w:rPr>
+      </w:pPr>
+    </w:p>
+    <w:p>
+      <w:pPr>
+        <w:rPr>
+          <w:rFonts w:ascii="Calibri" w:hAnsi="Calibri" w:cs="Calibri"/>
+          <w:sz w:val="24"/>
+          <w:szCs w:val="24"/>
+        </w:rPr>
+      </w:pPr>
+    </w:p>
+    <w:p>
+      <w:pPr>
+        <w:rPr>
+          <w:rFonts w:ascii="Calibri" w:hAnsi="Calibri" w:cs="Calibri"/>
+          <w:sz w:val="24"/>
+          <w:szCs w:val="24"/>
+        </w:rPr>
+      </w:pPr>
+    </w:p>
+    <w:p>
+      <w:pPr>
+        <w:rPr>
+          <w:rFonts w:ascii="Calibri" w:hAnsi="Calibri" w:cs="Calibri"/>
+          <w:sz w:val="24"/>
+          <w:szCs w:val="24"/>
+        </w:rPr>
+      </w:pPr>
+    </w:p>
+    <w:p>
+      <w:pPr>
+        <w:rPr>
+          <w:rFonts w:ascii="Calibri" w:hAnsi="Calibri" w:cs="Calibri"/>
+          <w:sz w:val="24"/>
+          <w:szCs w:val="24"/>
+        </w:rPr>
+      </w:pPr>
+    </w:p>
+    <w:p>
+      <w:pPr>
+        <w:rPr>
+          <w:rFonts w:ascii="Calibri" w:hAnsi="Calibri" w:cs="Calibri"/>
+          <w:sz w:val="24"/>
+          <w:szCs w:val="24"/>
+        </w:rPr>
+      </w:pPr>
+    </w:p>
+    <w:p>
+      <w:pPr>
+        <w:rPr>
+          <w:rFonts w:ascii="Calibri" w:hAnsi="Calibri" w:cs="Calibri"/>
+          <w:sz w:val="24"/>
+          <w:szCs w:val="24"/>
+        </w:rPr>
+      </w:pPr>
+    </w:p>
+    <w:p>
+      <w:pPr>
+        <w:rPr>
+          <w:rFonts w:ascii="Calibri" w:hAnsi="Calibri" w:cs="Calibri"/>
+          <w:sz w:val="24"/>
+          <w:szCs w:val="24"/>
+        </w:rPr>
+      </w:pPr>
+    </w:p>
+    <w:p>
+      <w:pPr>
+        <w:rPr>
+          <w:rFonts w:ascii="Calibri" w:hAnsi="Calibri" w:cs="Calibri"/>
+          <w:sz w:val="24"/>
+          <w:szCs w:val="24"/>
+        </w:rPr>
+      </w:pPr>
+    </w:p>
+    <w:p>
+      <w:pPr>
+        <w:rPr>
+          <w:rFonts w:ascii="Calibri" w:hAnsi="Calibri" w:cs="Calibri"/>
+          <w:sz w:val="24"/>
+          <w:szCs w:val="24"/>
+        </w:rPr>
+      </w:pPr>
+    </w:p>
+    <w:p>
+      <w:pPr>
+        <w:rPr>
+          <w:rFonts w:ascii="Calibri" w:hAnsi="Calibri" w:cs="Calibri"/>
+          <w:sz w:val="24"/>
+          <w:szCs w:val="24"/>
+        </w:rPr>
+      </w:pPr>
+      <w:r>
+        <w:rPr>
+          <w:rFonts w:ascii="Calibri" w:hAnsi="Calibri" w:cs="Calibri"/>
+          <w:b/>
+          <w:bCs/>
+          <w:sz w:val="28"/>
+          <w:szCs w:val="28"/>
+        </w:rPr>
         <w:t>References</w:t>
       </w:r>
     </w:p>
@@ -4677,7 +4788,6 @@
           <w:sz w:val="24"/>
           <w:szCs w:val="24"/>
         </w:rPr>
-        <w:lastRenderedPageBreak/>
         <w:t>Fader, P.S. and Hardie, B.G.S. (2009) ‘Probability models for customer-base analysis’, Journal of Interactive Marketing, 23(1), pp. 61–69.</w:t>
       </w:r>
     </w:p>

</xml_diff>

<commit_message>
Add K-Means Clustering implementation
</commit_message>
<xml_diff>
--- a/CA2_Capstone_Report.docx
+++ b/CA2_Capstone_Report.docx
@@ -4660,6 +4660,892 @@
       <w:pPr>
         <w:rPr>
           <w:rFonts w:ascii="Calibri" w:hAnsi="Calibri" w:cs="Calibri"/>
+          <w:b/>
+          <w:bCs/>
+          <w:sz w:val="24"/>
+          <w:szCs w:val="24"/>
+        </w:rPr>
+      </w:pPr>
+      <w:r>
+        <w:rPr>
+          <w:rFonts w:ascii="Calibri" w:hAnsi="Calibri" w:cs="Calibri"/>
+          <w:b/>
+          <w:bCs/>
+          <w:sz w:val="24"/>
+          <w:szCs w:val="24"/>
+        </w:rPr>
+        <w:t>Choosing the Optimal Number of Clusters</w:t>
+      </w:r>
+    </w:p>
+    <w:p>
+      <w:pPr>
+        <w:rPr>
+          <w:rFonts w:ascii="Calibri" w:hAnsi="Calibri" w:cs="Calibri"/>
+          <w:sz w:val="24"/>
+          <w:szCs w:val="24"/>
+        </w:rPr>
+      </w:pPr>
+      <w:r>
+        <w:rPr>
+          <w:rFonts w:ascii="Calibri" w:hAnsi="Calibri" w:cs="Calibri"/>
+          <w:sz w:val="24"/>
+          <w:szCs w:val="24"/>
+        </w:rPr>
+        <w:t>Two measures for evaluating the model were used:</w:t>
+      </w:r>
+    </w:p>
+    <w:p>
+      <w:pPr>
+        <w:rPr>
+          <w:rFonts w:ascii="Calibri" w:hAnsi="Calibri" w:cs="Calibri"/>
+          <w:sz w:val="24"/>
+          <w:szCs w:val="24"/>
+        </w:rPr>
+      </w:pPr>
+      <w:r>
+        <w:rPr>
+          <w:rFonts w:ascii="Calibri" w:hAnsi="Calibri" w:cs="Calibri"/>
+          <w:b/>
+          <w:bCs/>
+          <w:sz w:val="24"/>
+          <w:szCs w:val="24"/>
+        </w:rPr>
+        <w:t>Silhouette Score:</w:t>
+      </w:r>
+      <w:r>
+        <w:rPr>
+          <w:rFonts w:ascii="Calibri" w:hAnsi="Calibri" w:cs="Calibri"/>
+          <w:sz w:val="24"/>
+          <w:szCs w:val="24"/>
+        </w:rPr>
+        <w:t xml:space="preserve"> Evaluates cluster dispersion and cohesion, the greater the number, the better.</w:t>
+      </w:r>
+    </w:p>
+    <w:p>
+      <w:pPr>
+        <w:rPr>
+          <w:rFonts w:ascii="Calibri" w:hAnsi="Calibri" w:cs="Calibri"/>
+          <w:sz w:val="24"/>
+          <w:szCs w:val="24"/>
+        </w:rPr>
+      </w:pPr>
+      <w:proofErr w:type="spellStart"/>
+      <w:r>
+        <w:rPr>
+          <w:rFonts w:ascii="Calibri" w:hAnsi="Calibri" w:cs="Calibri"/>
+          <w:b/>
+          <w:bCs/>
+          <w:sz w:val="24"/>
+          <w:szCs w:val="24"/>
+        </w:rPr>
+        <w:lastRenderedPageBreak/>
+        <w:t>Calinski-Harabasz</w:t>
+      </w:r>
+      <w:proofErr w:type="spellEnd"/>
+      <w:r>
+        <w:rPr>
+          <w:rFonts w:ascii="Calibri" w:hAnsi="Calibri" w:cs="Calibri"/>
+          <w:b/>
+          <w:bCs/>
+          <w:sz w:val="24"/>
+          <w:szCs w:val="24"/>
+        </w:rPr>
+        <w:t xml:space="preserve"> Index (CH Score):</w:t>
+      </w:r>
+      <w:r>
+        <w:rPr>
+          <w:rFonts w:ascii="Calibri" w:hAnsi="Calibri" w:cs="Calibri"/>
+          <w:sz w:val="24"/>
+          <w:szCs w:val="24"/>
+        </w:rPr>
+        <w:t xml:space="preserve"> Assesses the between-cluster to within-cluster dispersion ratio, with a greater value being preferable.</w:t>
+      </w:r>
+    </w:p>
+    <w:p>
+      <w:pPr>
+        <w:rPr>
+          <w:rFonts w:ascii="Calibri" w:hAnsi="Calibri" w:cs="Calibri"/>
+          <w:sz w:val="24"/>
+          <w:szCs w:val="24"/>
+        </w:rPr>
+      </w:pPr>
+      <w:r>
+        <w:rPr>
+          <w:rFonts w:ascii="Calibri" w:hAnsi="Calibri" w:cs="Calibri"/>
+          <w:sz w:val="24"/>
+          <w:szCs w:val="24"/>
+        </w:rPr>
+        <w:t>The following code in the figure below analyses both metrics while iterating over values of k between 2 and 10 and providing output</w:t>
+      </w:r>
+      <w:r>
+        <w:rPr>
+          <w:rFonts w:ascii="Calibri" w:hAnsi="Calibri" w:cs="Calibri"/>
+          <w:sz w:val="24"/>
+          <w:szCs w:val="24"/>
+        </w:rPr>
+        <w:t>.</w:t>
+      </w:r>
+    </w:p>
+    <w:p>
+      <w:pPr>
+        <w:rPr>
+          <w:rFonts w:ascii="Calibri" w:hAnsi="Calibri" w:cs="Calibri"/>
+          <w:sz w:val="24"/>
+          <w:szCs w:val="24"/>
+        </w:rPr>
+      </w:pPr>
+    </w:p>
+    <w:p>
+      <w:pPr>
+        <w:rPr>
+          <w:rFonts w:ascii="Calibri" w:hAnsi="Calibri" w:cs="Calibri"/>
+          <w:sz w:val="24"/>
+          <w:szCs w:val="24"/>
+        </w:rPr>
+      </w:pPr>
+      <w:r>
+        <w:rPr>
+          <w:rFonts w:ascii="Calibri" w:hAnsi="Calibri" w:cs="Calibri"/>
+          <w:noProof/>
+          <w:sz w:val="24"/>
+          <w:szCs w:val="24"/>
+        </w:rPr>
+        <w:drawing>
+          <wp:inline distT="0" distB="0" distL="0" distR="0" wp14:anchorId="2B3E2E42" wp14:editId="0B816AE7">
+            <wp:extent cx="5731510" cy="4030980"/>
+            <wp:effectExtent l="0" t="0" r="2540" b="7620"/>
+            <wp:docPr id="2139618873" name="Picture 4" descr="A screenshot of a computer program&#10;&#10;AI-generated content may be incorrect."/>
+            <wp:cNvGraphicFramePr>
+              <a:graphicFrameLocks xmlns:a="http://schemas.openxmlformats.org/drawingml/2006/main" noChangeAspect="1"/>
+            </wp:cNvGraphicFramePr>
+            <a:graphic xmlns:a="http://schemas.openxmlformats.org/drawingml/2006/main">
+              <a:graphicData uri="http://schemas.openxmlformats.org/drawingml/2006/picture">
+                <pic:pic xmlns:pic="http://schemas.openxmlformats.org/drawingml/2006/picture">
+                  <pic:nvPicPr>
+                    <pic:cNvPr id="2139618873" name="Picture 4" descr="A screenshot of a computer program&#10;&#10;AI-generated content may be incorrect."/>
+                    <pic:cNvPicPr/>
+                  </pic:nvPicPr>
+                  <pic:blipFill>
+                    <a:blip r:embed="rId22">
+                      <a:extLst>
+                        <a:ext uri="{28A0092B-C50C-407E-A947-70E740481C1C}">
+                          <a14:useLocalDpi xmlns:a14="http://schemas.microsoft.com/office/drawing/2010/main" val="0"/>
+                        </a:ext>
+                      </a:extLst>
+                    </a:blip>
+                    <a:stretch>
+                      <a:fillRect/>
+                    </a:stretch>
+                  </pic:blipFill>
+                  <pic:spPr>
+                    <a:xfrm>
+                      <a:off x="0" y="0"/>
+                      <a:ext cx="5731510" cy="4030980"/>
+                    </a:xfrm>
+                    <a:prstGeom prst="rect">
+                      <a:avLst/>
+                    </a:prstGeom>
+                  </pic:spPr>
+                </pic:pic>
+              </a:graphicData>
+            </a:graphic>
+          </wp:inline>
+        </w:drawing>
+      </w:r>
+    </w:p>
+    <w:p>
+      <w:pPr>
+        <w:rPr>
+          <w:rFonts w:ascii="Calibri" w:hAnsi="Calibri" w:cs="Calibri"/>
+          <w:sz w:val="24"/>
+          <w:szCs w:val="24"/>
+        </w:rPr>
+      </w:pPr>
+      <w:r>
+        <w:rPr>
+          <w:rFonts w:ascii="Calibri" w:hAnsi="Calibri" w:cs="Calibri"/>
+          <w:noProof/>
+          <w:sz w:val="24"/>
+          <w:szCs w:val="24"/>
+        </w:rPr>
+        <w:drawing>
+          <wp:inline distT="0" distB="0" distL="0" distR="0" wp14:anchorId="7EEED9FC" wp14:editId="2C2D8FFC">
+            <wp:extent cx="5731510" cy="2402840"/>
+            <wp:effectExtent l="0" t="0" r="2540" b="0"/>
+            <wp:docPr id="293884062" name="Picture 3" descr="A graph of a number of clutters&#10;&#10;AI-generated content may be incorrect."/>
+            <wp:cNvGraphicFramePr>
+              <a:graphicFrameLocks xmlns:a="http://schemas.openxmlformats.org/drawingml/2006/main" noChangeAspect="1"/>
+            </wp:cNvGraphicFramePr>
+            <a:graphic xmlns:a="http://schemas.openxmlformats.org/drawingml/2006/main">
+              <a:graphicData uri="http://schemas.openxmlformats.org/drawingml/2006/picture">
+                <pic:pic xmlns:pic="http://schemas.openxmlformats.org/drawingml/2006/picture">
+                  <pic:nvPicPr>
+                    <pic:cNvPr id="293884062" name="Picture 3" descr="A graph of a number of clutters&#10;&#10;AI-generated content may be incorrect."/>
+                    <pic:cNvPicPr/>
+                  </pic:nvPicPr>
+                  <pic:blipFill>
+                    <a:blip r:embed="rId23">
+                      <a:extLst>
+                        <a:ext uri="{28A0092B-C50C-407E-A947-70E740481C1C}">
+                          <a14:useLocalDpi xmlns:a14="http://schemas.microsoft.com/office/drawing/2010/main" val="0"/>
+                        </a:ext>
+                      </a:extLst>
+                    </a:blip>
+                    <a:stretch>
+                      <a:fillRect/>
+                    </a:stretch>
+                  </pic:blipFill>
+                  <pic:spPr>
+                    <a:xfrm>
+                      <a:off x="0" y="0"/>
+                      <a:ext cx="5731510" cy="2402840"/>
+                    </a:xfrm>
+                    <a:prstGeom prst="rect">
+                      <a:avLst/>
+                    </a:prstGeom>
+                  </pic:spPr>
+                </pic:pic>
+              </a:graphicData>
+            </a:graphic>
+          </wp:inline>
+        </w:drawing>
+      </w:r>
+    </w:p>
+    <w:p>
+      <w:pPr>
+        <w:rPr>
+          <w:rFonts w:ascii="Calibri" w:hAnsi="Calibri" w:cs="Calibri"/>
+          <w:sz w:val="24"/>
+          <w:szCs w:val="24"/>
+        </w:rPr>
+      </w:pPr>
+    </w:p>
+    <w:p>
+      <w:pPr>
+        <w:rPr>
+          <w:rFonts w:ascii="Calibri" w:hAnsi="Calibri" w:cs="Calibri"/>
+          <w:sz w:val="24"/>
+          <w:szCs w:val="24"/>
+        </w:rPr>
+      </w:pPr>
+      <w:r>
+        <w:rPr>
+          <w:rFonts w:ascii="Calibri" w:hAnsi="Calibri" w:cs="Calibri"/>
+          <w:sz w:val="24"/>
+          <w:szCs w:val="24"/>
+        </w:rPr>
+        <w:t>High-quality and well-separated clusters were indicated by the Silhouette Score peaking at k=8 (~0.69).</w:t>
+      </w:r>
+    </w:p>
+    <w:p>
+      <w:pPr>
+        <w:rPr>
+          <w:rFonts w:ascii="Calibri" w:hAnsi="Calibri" w:cs="Calibri"/>
+          <w:sz w:val="24"/>
+          <w:szCs w:val="24"/>
+        </w:rPr>
+      </w:pPr>
+      <w:r>
+        <w:rPr>
+          <w:rFonts w:ascii="Calibri" w:hAnsi="Calibri" w:cs="Calibri"/>
+          <w:sz w:val="24"/>
+          <w:szCs w:val="24"/>
+        </w:rPr>
+        <w:lastRenderedPageBreak/>
+        <w:t xml:space="preserve">At k=8, the </w:t>
+      </w:r>
+      <w:proofErr w:type="spellStart"/>
+      <w:r>
+        <w:rPr>
+          <w:rFonts w:ascii="Calibri" w:hAnsi="Calibri" w:cs="Calibri"/>
+          <w:sz w:val="24"/>
+          <w:szCs w:val="24"/>
+        </w:rPr>
+        <w:t>Calinski-Harabasz</w:t>
+      </w:r>
+      <w:proofErr w:type="spellEnd"/>
+      <w:r>
+        <w:rPr>
+          <w:rFonts w:ascii="Calibri" w:hAnsi="Calibri" w:cs="Calibri"/>
+          <w:sz w:val="24"/>
+          <w:szCs w:val="24"/>
+        </w:rPr>
+        <w:t xml:space="preserve"> Score likewise rose noticeably and kept rising. But after this, Silhouette decreased, indicating overfitting.</w:t>
+      </w:r>
+    </w:p>
+    <w:p>
+      <w:pPr>
+        <w:rPr>
+          <w:rFonts w:ascii="Calibri" w:hAnsi="Calibri" w:cs="Calibri"/>
+          <w:sz w:val="24"/>
+          <w:szCs w:val="24"/>
+        </w:rPr>
+      </w:pPr>
+      <w:r>
+        <w:rPr>
+          <w:rFonts w:ascii="Calibri" w:hAnsi="Calibri" w:cs="Calibri"/>
+          <w:sz w:val="24"/>
+          <w:szCs w:val="24"/>
+        </w:rPr>
+        <w:t>Thus, k=8 was chosen as the optimal number of clusters in order to balance separation and compactness.</w:t>
+      </w:r>
+    </w:p>
+    <w:p>
+      <w:pPr>
+        <w:rPr>
+          <w:rFonts w:ascii="Calibri" w:hAnsi="Calibri" w:cs="Calibri"/>
+          <w:b/>
+          <w:bCs/>
+          <w:sz w:val="24"/>
+          <w:szCs w:val="24"/>
+        </w:rPr>
+      </w:pPr>
+      <w:r>
+        <w:rPr>
+          <w:rFonts w:ascii="Calibri" w:hAnsi="Calibri" w:cs="Calibri"/>
+          <w:b/>
+          <w:bCs/>
+          <w:sz w:val="24"/>
+          <w:szCs w:val="24"/>
+        </w:rPr>
+        <w:t xml:space="preserve">Final K-Means Model </w:t>
+      </w:r>
+      <w:r>
+        <w:rPr>
+          <w:rFonts w:ascii="Calibri" w:hAnsi="Calibri" w:cs="Calibri"/>
+          <w:b/>
+          <w:bCs/>
+          <w:sz w:val="24"/>
+          <w:szCs w:val="24"/>
+        </w:rPr>
+        <w:t>for</w:t>
+      </w:r>
+      <w:r>
+        <w:rPr>
+          <w:rFonts w:ascii="Calibri" w:hAnsi="Calibri" w:cs="Calibri"/>
+          <w:b/>
+          <w:bCs/>
+          <w:sz w:val="24"/>
+          <w:szCs w:val="24"/>
+        </w:rPr>
+        <w:t xml:space="preserve"> k=8</w:t>
+      </w:r>
+    </w:p>
+    <w:p>
+      <w:pPr>
+        <w:rPr>
+          <w:rFonts w:ascii="Calibri" w:hAnsi="Calibri" w:cs="Calibri"/>
+          <w:b/>
+          <w:bCs/>
+          <w:sz w:val="24"/>
+          <w:szCs w:val="24"/>
+        </w:rPr>
+      </w:pPr>
+      <w:r>
+        <w:rPr>
+          <w:rFonts w:ascii="Calibri" w:hAnsi="Calibri" w:cs="Calibri"/>
+          <w:b/>
+          <w:bCs/>
+          <w:noProof/>
+          <w:sz w:val="24"/>
+          <w:szCs w:val="24"/>
+        </w:rPr>
+        <w:drawing>
+          <wp:inline distT="0" distB="0" distL="0" distR="0" wp14:anchorId="6AF97EB3" wp14:editId="007E9629">
+            <wp:extent cx="5731510" cy="447675"/>
+            <wp:effectExtent l="0" t="0" r="2540" b="9525"/>
+            <wp:docPr id="2112966782" name="Picture 5"/>
+            <wp:cNvGraphicFramePr>
+              <a:graphicFrameLocks xmlns:a="http://schemas.openxmlformats.org/drawingml/2006/main" noChangeAspect="1"/>
+            </wp:cNvGraphicFramePr>
+            <a:graphic xmlns:a="http://schemas.openxmlformats.org/drawingml/2006/main">
+              <a:graphicData uri="http://schemas.openxmlformats.org/drawingml/2006/picture">
+                <pic:pic xmlns:pic="http://schemas.openxmlformats.org/drawingml/2006/picture">
+                  <pic:nvPicPr>
+                    <pic:cNvPr id="2112966782" name="Picture 2112966782"/>
+                    <pic:cNvPicPr/>
+                  </pic:nvPicPr>
+                  <pic:blipFill>
+                    <a:blip r:embed="rId24">
+                      <a:extLst>
+                        <a:ext uri="{28A0092B-C50C-407E-A947-70E740481C1C}">
+                          <a14:useLocalDpi xmlns:a14="http://schemas.microsoft.com/office/drawing/2010/main" val="0"/>
+                        </a:ext>
+                      </a:extLst>
+                    </a:blip>
+                    <a:stretch>
+                      <a:fillRect/>
+                    </a:stretch>
+                  </pic:blipFill>
+                  <pic:spPr>
+                    <a:xfrm>
+                      <a:off x="0" y="0"/>
+                      <a:ext cx="5731510" cy="447675"/>
+                    </a:xfrm>
+                    <a:prstGeom prst="rect">
+                      <a:avLst/>
+                    </a:prstGeom>
+                  </pic:spPr>
+                </pic:pic>
+              </a:graphicData>
+            </a:graphic>
+          </wp:inline>
+        </w:drawing>
+      </w:r>
+    </w:p>
+    <w:p>
+      <w:pPr>
+        <w:rPr>
+          <w:rFonts w:ascii="Calibri" w:hAnsi="Calibri" w:cs="Calibri"/>
+          <w:b/>
+          <w:bCs/>
+          <w:sz w:val="24"/>
+          <w:szCs w:val="24"/>
+        </w:rPr>
+      </w:pPr>
+    </w:p>
+    <w:p>
+      <w:pPr>
+        <w:rPr>
+          <w:rFonts w:ascii="Calibri" w:hAnsi="Calibri" w:cs="Calibri"/>
+          <w:b/>
+          <w:bCs/>
+          <w:sz w:val="24"/>
+          <w:szCs w:val="24"/>
+        </w:rPr>
+      </w:pPr>
+      <w:r>
+        <w:rPr>
+          <w:rFonts w:ascii="Calibri" w:hAnsi="Calibri" w:cs="Calibri"/>
+          <w:b/>
+          <w:bCs/>
+          <w:sz w:val="24"/>
+          <w:szCs w:val="24"/>
+        </w:rPr>
+        <w:t>Cluster Profiling and Business Insight</w:t>
+      </w:r>
+    </w:p>
+    <w:p>
+      <w:pPr>
+        <w:rPr>
+          <w:rFonts w:ascii="Calibri" w:hAnsi="Calibri" w:cs="Calibri"/>
+          <w:sz w:val="24"/>
+          <w:szCs w:val="24"/>
+        </w:rPr>
+      </w:pPr>
+      <w:r>
+        <w:rPr>
+          <w:rFonts w:ascii="Calibri" w:hAnsi="Calibri" w:cs="Calibri"/>
+          <w:sz w:val="24"/>
+          <w:szCs w:val="24"/>
+        </w:rPr>
+        <w:t>In order to comprehend behavioural patterns, cluster-level means were calculated:</w:t>
+      </w:r>
+    </w:p>
+    <w:p>
+      <w:pPr>
+        <w:rPr>
+          <w:rFonts w:ascii="Calibri" w:hAnsi="Calibri" w:cs="Calibri"/>
+          <w:sz w:val="24"/>
+          <w:szCs w:val="24"/>
+        </w:rPr>
+      </w:pPr>
+    </w:p>
+    <w:p>
+      <w:pPr>
+        <w:rPr>
+          <w:rFonts w:ascii="Calibri" w:hAnsi="Calibri" w:cs="Calibri"/>
+          <w:sz w:val="24"/>
+          <w:szCs w:val="24"/>
+        </w:rPr>
+      </w:pPr>
+      <w:r>
+        <w:rPr>
+          <w:rFonts w:ascii="Calibri" w:hAnsi="Calibri" w:cs="Calibri"/>
+          <w:noProof/>
+          <w:sz w:val="24"/>
+          <w:szCs w:val="24"/>
+        </w:rPr>
+        <w:drawing>
+          <wp:inline distT="0" distB="0" distL="0" distR="0" wp14:anchorId="13536390" wp14:editId="011F356D">
+            <wp:extent cx="5731510" cy="1412240"/>
+            <wp:effectExtent l="0" t="0" r="2540" b="0"/>
+            <wp:docPr id="799865873" name="Picture 6" descr="A screenshot of a computer&#10;&#10;AI-generated content may be incorrect."/>
+            <wp:cNvGraphicFramePr>
+              <a:graphicFrameLocks xmlns:a="http://schemas.openxmlformats.org/drawingml/2006/main" noChangeAspect="1"/>
+            </wp:cNvGraphicFramePr>
+            <a:graphic xmlns:a="http://schemas.openxmlformats.org/drawingml/2006/main">
+              <a:graphicData uri="http://schemas.openxmlformats.org/drawingml/2006/picture">
+                <pic:pic xmlns:pic="http://schemas.openxmlformats.org/drawingml/2006/picture">
+                  <pic:nvPicPr>
+                    <pic:cNvPr id="799865873" name="Picture 6" descr="A screenshot of a computer&#10;&#10;AI-generated content may be incorrect."/>
+                    <pic:cNvPicPr/>
+                  </pic:nvPicPr>
+                  <pic:blipFill>
+                    <a:blip r:embed="rId25">
+                      <a:extLst>
+                        <a:ext uri="{28A0092B-C50C-407E-A947-70E740481C1C}">
+                          <a14:useLocalDpi xmlns:a14="http://schemas.microsoft.com/office/drawing/2010/main" val="0"/>
+                        </a:ext>
+                      </a:extLst>
+                    </a:blip>
+                    <a:stretch>
+                      <a:fillRect/>
+                    </a:stretch>
+                  </pic:blipFill>
+                  <pic:spPr>
+                    <a:xfrm>
+                      <a:off x="0" y="0"/>
+                      <a:ext cx="5731510" cy="1412240"/>
+                    </a:xfrm>
+                    <a:prstGeom prst="rect">
+                      <a:avLst/>
+                    </a:prstGeom>
+                  </pic:spPr>
+                </pic:pic>
+              </a:graphicData>
+            </a:graphic>
+          </wp:inline>
+        </w:drawing>
+      </w:r>
+    </w:p>
+    <w:p>
+      <w:pPr>
+        <w:rPr>
+          <w:rFonts w:ascii="Calibri" w:hAnsi="Calibri" w:cs="Calibri"/>
+          <w:sz w:val="24"/>
+          <w:szCs w:val="24"/>
+        </w:rPr>
+      </w:pPr>
+    </w:p>
+    <w:p>
+      <w:pPr>
+        <w:rPr>
+          <w:rFonts w:ascii="Calibri" w:hAnsi="Calibri" w:cs="Calibri"/>
+          <w:sz w:val="24"/>
+          <w:szCs w:val="24"/>
+        </w:rPr>
+      </w:pPr>
+      <w:r>
+        <w:rPr>
+          <w:rFonts w:ascii="Calibri" w:hAnsi="Calibri" w:cs="Calibri"/>
+          <w:sz w:val="24"/>
+          <w:szCs w:val="24"/>
+        </w:rPr>
+        <w:t>These figures, which are z-scores (standardised units), show how each cluster compares to the average but do not directly reflect real spend, quantity, or frequency</w:t>
+      </w:r>
+      <w:r>
+        <w:rPr>
+          <w:rFonts w:ascii="Calibri" w:hAnsi="Calibri" w:cs="Calibri"/>
+          <w:sz w:val="24"/>
+          <w:szCs w:val="24"/>
+        </w:rPr>
+        <w:t>.</w:t>
+      </w:r>
+    </w:p>
+    <w:p>
+      <w:pPr>
+        <w:rPr>
+          <w:rFonts w:ascii="Calibri" w:hAnsi="Calibri" w:cs="Calibri"/>
+          <w:sz w:val="24"/>
+          <w:szCs w:val="24"/>
+        </w:rPr>
+      </w:pPr>
+      <w:r>
+        <w:rPr>
+          <w:rFonts w:ascii="Calibri" w:hAnsi="Calibri" w:cs="Calibri"/>
+          <w:b/>
+          <w:bCs/>
+          <w:sz w:val="24"/>
+          <w:szCs w:val="24"/>
+        </w:rPr>
+        <w:t>Cluster 3:</w:t>
+      </w:r>
+      <w:r>
+        <w:rPr>
+          <w:rFonts w:ascii="Calibri" w:hAnsi="Calibri" w:cs="Calibri"/>
+          <w:sz w:val="24"/>
+          <w:szCs w:val="24"/>
+        </w:rPr>
+        <w:t xml:space="preserve"> These large values in </w:t>
+      </w:r>
+      <w:proofErr w:type="spellStart"/>
+      <w:r>
+        <w:rPr>
+          <w:rFonts w:ascii="Calibri" w:hAnsi="Calibri" w:cs="Calibri"/>
+          <w:sz w:val="24"/>
+          <w:szCs w:val="24"/>
+        </w:rPr>
+        <w:t>TotalQuantity</w:t>
+      </w:r>
+      <w:proofErr w:type="spellEnd"/>
+      <w:r>
+        <w:rPr>
+          <w:rFonts w:ascii="Calibri" w:hAnsi="Calibri" w:cs="Calibri"/>
+          <w:sz w:val="24"/>
+          <w:szCs w:val="24"/>
+        </w:rPr>
+        <w:t xml:space="preserve"> (20.26) and </w:t>
+      </w:r>
+      <w:proofErr w:type="spellStart"/>
+      <w:r>
+        <w:rPr>
+          <w:rFonts w:ascii="Calibri" w:hAnsi="Calibri" w:cs="Calibri"/>
+          <w:sz w:val="24"/>
+          <w:szCs w:val="24"/>
+        </w:rPr>
+        <w:t>TotalSpend</w:t>
+      </w:r>
+      <w:proofErr w:type="spellEnd"/>
+      <w:r>
+        <w:rPr>
+          <w:rFonts w:ascii="Calibri" w:hAnsi="Calibri" w:cs="Calibri"/>
+          <w:sz w:val="24"/>
+          <w:szCs w:val="24"/>
+        </w:rPr>
+        <w:t> (17.53), indicate valuable customers.</w:t>
+      </w:r>
+    </w:p>
+    <w:p>
+      <w:pPr>
+        <w:rPr>
+          <w:rFonts w:ascii="Calibri" w:hAnsi="Calibri" w:cs="Calibri"/>
+          <w:sz w:val="24"/>
+          <w:szCs w:val="24"/>
+        </w:rPr>
+      </w:pPr>
+      <w:r>
+        <w:rPr>
+          <w:rFonts w:ascii="Calibri" w:hAnsi="Calibri" w:cs="Calibri"/>
+          <w:b/>
+          <w:bCs/>
+          <w:sz w:val="24"/>
+          <w:szCs w:val="24"/>
+        </w:rPr>
+        <w:t>Cluster 5:</w:t>
+      </w:r>
+      <w:r>
+        <w:rPr>
+          <w:rFonts w:ascii="Calibri" w:hAnsi="Calibri" w:cs="Calibri"/>
+          <w:sz w:val="24"/>
+          <w:szCs w:val="24"/>
+        </w:rPr>
+        <w:t xml:space="preserve"> Purchase frequency is quite high (28.70 standard deviations above mean) but spend and quantity are slightly below normal; these customers are regular low-spenders.</w:t>
+      </w:r>
+    </w:p>
+    <w:p>
+      <w:pPr>
+        <w:rPr>
+          <w:rFonts w:ascii="Calibri" w:hAnsi="Calibri" w:cs="Calibri"/>
+          <w:sz w:val="24"/>
+          <w:szCs w:val="24"/>
+        </w:rPr>
+      </w:pPr>
+      <w:r>
+        <w:rPr>
+          <w:rFonts w:ascii="Calibri" w:hAnsi="Calibri" w:cs="Calibri"/>
+          <w:b/>
+          <w:bCs/>
+          <w:sz w:val="24"/>
+          <w:szCs w:val="24"/>
+        </w:rPr>
+        <w:t>Clusters 2 and 7:</w:t>
+      </w:r>
+      <w:r>
+        <w:rPr>
+          <w:rFonts w:ascii="Calibri" w:hAnsi="Calibri" w:cs="Calibri"/>
+          <w:sz w:val="24"/>
+          <w:szCs w:val="24"/>
+        </w:rPr>
+        <w:t xml:space="preserve"> These</w:t>
+      </w:r>
+      <w:r>
+        <w:rPr>
+          <w:rFonts w:ascii="Calibri" w:hAnsi="Calibri" w:cs="Calibri"/>
+          <w:sz w:val="24"/>
+          <w:szCs w:val="24"/>
+        </w:rPr>
+        <w:t xml:space="preserve"> have extremely low purchase frequencies, with cluster 7 having a particularly low -13.35. probably inactive customers.</w:t>
+      </w:r>
+    </w:p>
+    <w:p>
+      <w:pPr>
+        <w:rPr>
+          <w:rFonts w:ascii="Calibri" w:hAnsi="Calibri" w:cs="Calibri"/>
+          <w:b/>
+          <w:bCs/>
+          <w:sz w:val="24"/>
+          <w:szCs w:val="24"/>
+        </w:rPr>
+      </w:pPr>
+      <w:r>
+        <w:rPr>
+          <w:rFonts w:ascii="Calibri" w:hAnsi="Calibri" w:cs="Calibri"/>
+          <w:b/>
+          <w:bCs/>
+          <w:sz w:val="24"/>
+          <w:szCs w:val="24"/>
+        </w:rPr>
+        <w:t>Visualizing Clusters Using PCA</w:t>
+      </w:r>
+    </w:p>
+    <w:p>
+      <w:pPr>
+        <w:rPr>
+          <w:rFonts w:ascii="Calibri" w:hAnsi="Calibri" w:cs="Calibri"/>
+          <w:b/>
+          <w:bCs/>
+          <w:sz w:val="24"/>
+          <w:szCs w:val="24"/>
+        </w:rPr>
+      </w:pPr>
+      <w:r>
+        <w:rPr>
+          <w:rFonts w:ascii="Calibri" w:hAnsi="Calibri" w:cs="Calibri"/>
+          <w:b/>
+          <w:bCs/>
+          <w:noProof/>
+          <w:sz w:val="24"/>
+          <w:szCs w:val="24"/>
+        </w:rPr>
+        <w:lastRenderedPageBreak/>
+        <w:drawing>
+          <wp:inline distT="0" distB="0" distL="0" distR="0" wp14:anchorId="255158B9" wp14:editId="3CC5834B">
+            <wp:extent cx="5731510" cy="5917565"/>
+            <wp:effectExtent l="0" t="0" r="2540" b="6985"/>
+            <wp:docPr id="2081211722" name="Picture 7" descr="A screen shot of a computer screen&#10;&#10;AI-generated content may be incorrect."/>
+            <wp:cNvGraphicFramePr>
+              <a:graphicFrameLocks xmlns:a="http://schemas.openxmlformats.org/drawingml/2006/main" noChangeAspect="1"/>
+            </wp:cNvGraphicFramePr>
+            <a:graphic xmlns:a="http://schemas.openxmlformats.org/drawingml/2006/main">
+              <a:graphicData uri="http://schemas.openxmlformats.org/drawingml/2006/picture">
+                <pic:pic xmlns:pic="http://schemas.openxmlformats.org/drawingml/2006/picture">
+                  <pic:nvPicPr>
+                    <pic:cNvPr id="2081211722" name="Picture 7" descr="A screen shot of a computer screen&#10;&#10;AI-generated content may be incorrect."/>
+                    <pic:cNvPicPr/>
+                  </pic:nvPicPr>
+                  <pic:blipFill>
+                    <a:blip r:embed="rId26">
+                      <a:extLst>
+                        <a:ext uri="{28A0092B-C50C-407E-A947-70E740481C1C}">
+                          <a14:useLocalDpi xmlns:a14="http://schemas.microsoft.com/office/drawing/2010/main" val="0"/>
+                        </a:ext>
+                      </a:extLst>
+                    </a:blip>
+                    <a:stretch>
+                      <a:fillRect/>
+                    </a:stretch>
+                  </pic:blipFill>
+                  <pic:spPr>
+                    <a:xfrm>
+                      <a:off x="0" y="0"/>
+                      <a:ext cx="5731510" cy="5917565"/>
+                    </a:xfrm>
+                    <a:prstGeom prst="rect">
+                      <a:avLst/>
+                    </a:prstGeom>
+                  </pic:spPr>
+                </pic:pic>
+              </a:graphicData>
+            </a:graphic>
+          </wp:inline>
+        </w:drawing>
+      </w:r>
+    </w:p>
+    <w:p>
+      <w:pPr>
+        <w:rPr>
+          <w:rFonts w:ascii="Calibri" w:hAnsi="Calibri" w:cs="Calibri"/>
+          <w:b/>
+          <w:bCs/>
+          <w:sz w:val="24"/>
+          <w:szCs w:val="24"/>
+        </w:rPr>
+      </w:pPr>
+    </w:p>
+    <w:p>
+      <w:pPr>
+        <w:rPr>
+          <w:rFonts w:ascii="Calibri" w:hAnsi="Calibri" w:cs="Calibri"/>
+          <w:b/>
+          <w:bCs/>
+          <w:sz w:val="24"/>
+          <w:szCs w:val="24"/>
+        </w:rPr>
+      </w:pPr>
+      <w:r>
+        <w:rPr>
+          <w:rFonts w:ascii="Calibri" w:hAnsi="Calibri" w:cs="Calibri"/>
+          <w:b/>
+          <w:bCs/>
+          <w:sz w:val="24"/>
+          <w:szCs w:val="24"/>
+        </w:rPr>
+        <w:t>The PCA plot clearly displays:</w:t>
+      </w:r>
+    </w:p>
+    <w:p>
+      <w:pPr>
+        <w:rPr>
+          <w:rFonts w:ascii="Calibri" w:hAnsi="Calibri" w:cs="Calibri"/>
+          <w:sz w:val="24"/>
+          <w:szCs w:val="24"/>
+        </w:rPr>
+      </w:pPr>
+      <w:r>
+        <w:rPr>
+          <w:rFonts w:ascii="Calibri" w:hAnsi="Calibri" w:cs="Calibri"/>
+          <w:sz w:val="24"/>
+          <w:szCs w:val="24"/>
+        </w:rPr>
+        <w:t>Cluster separation is a sign of significant segmentation.</w:t>
+      </w:r>
+      <w:r>
+        <w:rPr>
+          <w:rFonts w:ascii="Calibri" w:hAnsi="Calibri" w:cs="Calibri"/>
+          <w:sz w:val="24"/>
+          <w:szCs w:val="24"/>
+        </w:rPr>
+        <w:t xml:space="preserve"> </w:t>
+      </w:r>
+      <w:r>
+        <w:rPr>
+          <w:rFonts w:ascii="Calibri" w:hAnsi="Calibri" w:cs="Calibri"/>
+          <w:sz w:val="24"/>
+          <w:szCs w:val="24"/>
+        </w:rPr>
+        <w:t>Given their distance from the others, Clusters 3 and 5 represent distinct behaviour of extremely high-value customers.</w:t>
+      </w:r>
+      <w:r>
+        <w:rPr>
+          <w:rFonts w:ascii="Calibri" w:hAnsi="Calibri" w:cs="Calibri"/>
+          <w:sz w:val="24"/>
+          <w:szCs w:val="24"/>
+        </w:rPr>
+        <w:t xml:space="preserve"> </w:t>
+      </w:r>
+      <w:r>
+        <w:rPr>
+          <w:rFonts w:ascii="Calibri" w:hAnsi="Calibri" w:cs="Calibri"/>
+          <w:sz w:val="24"/>
+          <w:szCs w:val="24"/>
+        </w:rPr>
+        <w:t>The comparatively centralised nature of Clusters 0, 1, 2, and 4 may reflect the more "typical" customer.</w:t>
+      </w:r>
+    </w:p>
+    <w:p>
+      <w:pPr>
+        <w:rPr>
+          <w:rFonts w:ascii="Calibri" w:hAnsi="Calibri" w:cs="Calibri"/>
+          <w:sz w:val="24"/>
+          <w:szCs w:val="24"/>
+        </w:rPr>
+      </w:pPr>
+    </w:p>
+    <w:p>
+      <w:pPr>
+        <w:rPr>
+          <w:rFonts w:ascii="Calibri" w:hAnsi="Calibri" w:cs="Calibri"/>
           <w:sz w:val="24"/>
           <w:szCs w:val="24"/>
         </w:rPr>
@@ -4800,7 +5686,7 @@
         </w:rPr>
         <w:t xml:space="preserve">McKinsey &amp; Company (2021) The importance of customer retention in e-commerce. Available at: </w:t>
       </w:r>
-      <w:hyperlink r:id="rId22" w:history="1">
+      <w:hyperlink r:id="rId27" w:history="1">
         <w:r>
           <w:rPr>
             <w:rStyle w:val="Hyperlink"/>

</xml_diff>

<commit_message>
Add machine learning models implementation
</commit_message>
<xml_diff>
--- a/CA2_Capstone_Report.docx
+++ b/CA2_Capstone_Report.docx
@@ -1443,7 +1443,25 @@
           <w:sz w:val="24"/>
           <w:szCs w:val="24"/>
         </w:rPr>
-        <w:t>Information about the dataset, including the data types of each column and the amount of non-null values in each column, is shown using the df.info() method. This makes it possible to identify columns that might have missing values, which may be addressed during the data preparation process.</w:t>
+        <w:t xml:space="preserve">Information about the dataset, including the data types of each column and the amount of non-null values in each column, is shown using the </w:t>
+      </w:r>
+      <w:proofErr w:type="gramStart"/>
+      <w:r>
+        <w:rPr>
+          <w:rFonts w:ascii="Calibri" w:hAnsi="Calibri" w:cs="Calibri"/>
+          <w:sz w:val="24"/>
+          <w:szCs w:val="24"/>
+        </w:rPr>
+        <w:t>df.info(</w:t>
+      </w:r>
+      <w:proofErr w:type="gramEnd"/>
+      <w:r>
+        <w:rPr>
+          <w:rFonts w:ascii="Calibri" w:hAnsi="Calibri" w:cs="Calibri"/>
+          <w:sz w:val="24"/>
+          <w:szCs w:val="24"/>
+        </w:rPr>
+        <w:t>) method. This makes it possible to identify columns that might have missing values, which may be addressed during the data preparation process.</w:t>
       </w:r>
     </w:p>
     <w:p>
@@ -1696,6 +1714,7 @@
         <w:t xml:space="preserve">The </w:t>
       </w:r>
       <w:proofErr w:type="spellStart"/>
+      <w:proofErr w:type="gramStart"/>
       <w:r>
         <w:rPr>
           <w:rFonts w:ascii="Calibri" w:hAnsi="Calibri" w:cs="Calibri"/>
@@ -1705,13 +1724,32 @@
         <w:t>df.isnull</w:t>
       </w:r>
       <w:proofErr w:type="spellEnd"/>
-      <w:r>
-        <w:rPr>
-          <w:rFonts w:ascii="Calibri" w:hAnsi="Calibri" w:cs="Calibri"/>
-          <w:sz w:val="24"/>
-          <w:szCs w:val="24"/>
-        </w:rPr>
-        <w:t>().sum() is used to find columns that contain missing data. In order to plan the imputation or removal of these values during the Data Preparation phase, it is necessary to know the total number of missing values per column.</w:t>
+      <w:proofErr w:type="gramEnd"/>
+      <w:r>
+        <w:rPr>
+          <w:rFonts w:ascii="Calibri" w:hAnsi="Calibri" w:cs="Calibri"/>
+          <w:sz w:val="24"/>
+          <w:szCs w:val="24"/>
+        </w:rPr>
+        <w:t>(</w:t>
+      </w:r>
+      <w:proofErr w:type="gramStart"/>
+      <w:r>
+        <w:rPr>
+          <w:rFonts w:ascii="Calibri" w:hAnsi="Calibri" w:cs="Calibri"/>
+          <w:sz w:val="24"/>
+          <w:szCs w:val="24"/>
+        </w:rPr>
+        <w:t>).sum</w:t>
+      </w:r>
+      <w:proofErr w:type="gramEnd"/>
+      <w:r>
+        <w:rPr>
+          <w:rFonts w:ascii="Calibri" w:hAnsi="Calibri" w:cs="Calibri"/>
+          <w:sz w:val="24"/>
+          <w:szCs w:val="24"/>
+        </w:rPr>
+        <w:t>() is used to find columns that contain missing data. In order to plan the imputation or removal of these values during the Data Preparation phase, it is necessary to know the total number of missing values per column.</w:t>
       </w:r>
     </w:p>
     <w:p>
@@ -5537,51 +5575,569 @@
       <w:pPr>
         <w:rPr>
           <w:rFonts w:ascii="Calibri" w:hAnsi="Calibri" w:cs="Calibri"/>
-          <w:sz w:val="24"/>
-          <w:szCs w:val="24"/>
-        </w:rPr>
-      </w:pPr>
-    </w:p>
-    <w:p>
-      <w:pPr>
-        <w:rPr>
-          <w:rFonts w:ascii="Calibri" w:hAnsi="Calibri" w:cs="Calibri"/>
-          <w:sz w:val="24"/>
-          <w:szCs w:val="24"/>
-        </w:rPr>
-      </w:pPr>
-    </w:p>
-    <w:p>
-      <w:pPr>
-        <w:rPr>
-          <w:rFonts w:ascii="Calibri" w:hAnsi="Calibri" w:cs="Calibri"/>
-          <w:sz w:val="24"/>
-          <w:szCs w:val="24"/>
-        </w:rPr>
-      </w:pPr>
-    </w:p>
-    <w:p>
-      <w:pPr>
-        <w:rPr>
-          <w:rFonts w:ascii="Calibri" w:hAnsi="Calibri" w:cs="Calibri"/>
-          <w:sz w:val="24"/>
-          <w:szCs w:val="24"/>
-        </w:rPr>
-      </w:pPr>
-    </w:p>
-    <w:p>
-      <w:pPr>
-        <w:rPr>
-          <w:rFonts w:ascii="Calibri" w:hAnsi="Calibri" w:cs="Calibri"/>
-          <w:sz w:val="24"/>
-          <w:szCs w:val="24"/>
-        </w:rPr>
-      </w:pPr>
-    </w:p>
-    <w:p>
-      <w:pPr>
-        <w:rPr>
-          <w:rFonts w:ascii="Calibri" w:hAnsi="Calibri" w:cs="Calibri"/>
+          <w:b/>
+          <w:bCs/>
+          <w:sz w:val="24"/>
+          <w:szCs w:val="24"/>
+        </w:rPr>
+      </w:pPr>
+      <w:r>
+        <w:rPr>
+          <w:rFonts w:ascii="Calibri" w:hAnsi="Calibri" w:cs="Calibri"/>
+          <w:b/>
+          <w:bCs/>
+          <w:sz w:val="24"/>
+          <w:szCs w:val="24"/>
+        </w:rPr>
+        <w:t xml:space="preserve">6.2 Predictive </w:t>
+      </w:r>
+      <w:proofErr w:type="spellStart"/>
+      <w:r>
+        <w:rPr>
+          <w:rFonts w:ascii="Calibri" w:hAnsi="Calibri" w:cs="Calibri"/>
+          <w:b/>
+          <w:bCs/>
+          <w:sz w:val="24"/>
+          <w:szCs w:val="24"/>
+        </w:rPr>
+        <w:t>Modeling</w:t>
+      </w:r>
+      <w:proofErr w:type="spellEnd"/>
+    </w:p>
+    <w:p>
+      <w:pPr>
+        <w:rPr>
+          <w:rFonts w:ascii="Calibri" w:hAnsi="Calibri" w:cs="Calibri"/>
+          <w:sz w:val="24"/>
+          <w:szCs w:val="24"/>
+        </w:rPr>
+      </w:pPr>
+      <w:r>
+        <w:rPr>
+          <w:rFonts w:ascii="Calibri" w:hAnsi="Calibri" w:cs="Calibri"/>
+          <w:sz w:val="24"/>
+          <w:szCs w:val="24"/>
+        </w:rPr>
+        <w:t>A binary classification target variable (</w:t>
+      </w:r>
+      <w:proofErr w:type="spellStart"/>
+      <w:r>
+        <w:rPr>
+          <w:rFonts w:ascii="Calibri" w:hAnsi="Calibri" w:cs="Calibri"/>
+          <w:sz w:val="24"/>
+          <w:szCs w:val="24"/>
+        </w:rPr>
+        <w:t>RepeatBuyer</w:t>
+      </w:r>
+      <w:proofErr w:type="spellEnd"/>
+      <w:r>
+        <w:rPr>
+          <w:rFonts w:ascii="Calibri" w:hAnsi="Calibri" w:cs="Calibri"/>
+          <w:sz w:val="24"/>
+          <w:szCs w:val="24"/>
+        </w:rPr>
+        <w:t>) was developed in order to recognise repeat buying behaviour. It shows if, throughout the dataset period, a customer made at least one additional purchase following their initial transaction. Four engineered customer-level features were used in the predictive modelling process:</w:t>
+      </w:r>
+    </w:p>
+    <w:p>
+      <w:pPr>
+        <w:rPr>
+          <w:rFonts w:ascii="Calibri" w:hAnsi="Calibri" w:cs="Calibri"/>
+          <w:sz w:val="24"/>
+          <w:szCs w:val="24"/>
+        </w:rPr>
+      </w:pPr>
+      <w:proofErr w:type="spellStart"/>
+      <w:r>
+        <w:rPr>
+          <w:rFonts w:ascii="Calibri" w:hAnsi="Calibri" w:cs="Calibri"/>
+          <w:sz w:val="24"/>
+          <w:szCs w:val="24"/>
+        </w:rPr>
+        <w:lastRenderedPageBreak/>
+        <w:t>TotalSpend</w:t>
+      </w:r>
+      <w:proofErr w:type="spellEnd"/>
+      <w:r>
+        <w:rPr>
+          <w:rFonts w:ascii="Calibri" w:hAnsi="Calibri" w:cs="Calibri"/>
+          <w:sz w:val="24"/>
+          <w:szCs w:val="24"/>
+        </w:rPr>
+        <w:t>: The sum of the purchases' monetary worth.</w:t>
+      </w:r>
+    </w:p>
+    <w:p>
+      <w:pPr>
+        <w:rPr>
+          <w:rFonts w:ascii="Calibri" w:hAnsi="Calibri" w:cs="Calibri"/>
+          <w:sz w:val="24"/>
+          <w:szCs w:val="24"/>
+        </w:rPr>
+      </w:pPr>
+      <w:proofErr w:type="spellStart"/>
+      <w:r>
+        <w:rPr>
+          <w:rFonts w:ascii="Calibri" w:hAnsi="Calibri" w:cs="Calibri"/>
+          <w:sz w:val="24"/>
+          <w:szCs w:val="24"/>
+        </w:rPr>
+        <w:t>TotalQuantity</w:t>
+      </w:r>
+      <w:proofErr w:type="spellEnd"/>
+      <w:r>
+        <w:rPr>
+          <w:rFonts w:ascii="Calibri" w:hAnsi="Calibri" w:cs="Calibri"/>
+          <w:sz w:val="24"/>
+          <w:szCs w:val="24"/>
+        </w:rPr>
+        <w:t>: The total quantity of items bought.</w:t>
+      </w:r>
+    </w:p>
+    <w:p>
+      <w:pPr>
+        <w:rPr>
+          <w:rFonts w:ascii="Calibri" w:hAnsi="Calibri" w:cs="Calibri"/>
+          <w:sz w:val="24"/>
+          <w:szCs w:val="24"/>
+        </w:rPr>
+      </w:pPr>
+      <w:proofErr w:type="spellStart"/>
+      <w:r>
+        <w:rPr>
+          <w:rFonts w:ascii="Calibri" w:hAnsi="Calibri" w:cs="Calibri"/>
+          <w:sz w:val="24"/>
+          <w:szCs w:val="24"/>
+        </w:rPr>
+        <w:t>PurchaseFrequency</w:t>
+      </w:r>
+      <w:proofErr w:type="spellEnd"/>
+      <w:r>
+        <w:rPr>
+          <w:rFonts w:ascii="Calibri" w:hAnsi="Calibri" w:cs="Calibri"/>
+          <w:sz w:val="24"/>
+          <w:szCs w:val="24"/>
+        </w:rPr>
+        <w:t>: The number of times a purchase was made.</w:t>
+      </w:r>
+    </w:p>
+    <w:p>
+      <w:pPr>
+        <w:rPr>
+          <w:rFonts w:ascii="Calibri" w:hAnsi="Calibri" w:cs="Calibri"/>
+          <w:sz w:val="24"/>
+          <w:szCs w:val="24"/>
+        </w:rPr>
+      </w:pPr>
+      <w:proofErr w:type="spellStart"/>
+      <w:r>
+        <w:rPr>
+          <w:rFonts w:ascii="Calibri" w:hAnsi="Calibri" w:cs="Calibri"/>
+          <w:sz w:val="24"/>
+          <w:szCs w:val="24"/>
+        </w:rPr>
+        <w:t>CustomerPurchaseDays</w:t>
+      </w:r>
+      <w:proofErr w:type="spellEnd"/>
+      <w:r>
+        <w:rPr>
+          <w:rFonts w:ascii="Calibri" w:hAnsi="Calibri" w:cs="Calibri"/>
+          <w:sz w:val="24"/>
+          <w:szCs w:val="24"/>
+        </w:rPr>
+        <w:t>: The total number of different days that a customer made a purchase.</w:t>
+      </w:r>
+    </w:p>
+    <w:p>
+      <w:pPr>
+        <w:rPr>
+          <w:rFonts w:ascii="Calibri" w:hAnsi="Calibri" w:cs="Calibri"/>
+          <w:sz w:val="24"/>
+          <w:szCs w:val="24"/>
+        </w:rPr>
+      </w:pPr>
+      <w:r>
+        <w:rPr>
+          <w:rFonts w:ascii="Calibri" w:hAnsi="Calibri" w:cs="Calibri"/>
+          <w:sz w:val="24"/>
+          <w:szCs w:val="24"/>
+        </w:rPr>
+        <w:t>These characteristics serve as helpful predictors of repeat purchasing behaviour since they show customer engagement and purchase behaviour (Fader &amp; Hardie, 2009).</w:t>
+      </w:r>
+    </w:p>
+    <w:p>
+      <w:pPr>
+        <w:rPr>
+          <w:rFonts w:ascii="Calibri" w:hAnsi="Calibri" w:cs="Calibri"/>
+          <w:b/>
+          <w:bCs/>
+          <w:sz w:val="24"/>
+          <w:szCs w:val="24"/>
+        </w:rPr>
+      </w:pPr>
+      <w:r>
+        <w:rPr>
+          <w:rFonts w:ascii="Calibri" w:hAnsi="Calibri" w:cs="Calibri"/>
+          <w:b/>
+          <w:bCs/>
+          <w:sz w:val="24"/>
+          <w:szCs w:val="24"/>
+        </w:rPr>
+        <w:t>Model Selection</w:t>
+      </w:r>
+    </w:p>
+    <w:p>
+      <w:pPr>
+        <w:rPr>
+          <w:rFonts w:ascii="Calibri" w:hAnsi="Calibri" w:cs="Calibri"/>
+          <w:sz w:val="24"/>
+          <w:szCs w:val="24"/>
+        </w:rPr>
+      </w:pPr>
+      <w:r>
+        <w:rPr>
+          <w:rFonts w:ascii="Calibri" w:hAnsi="Calibri" w:cs="Calibri"/>
+          <w:sz w:val="24"/>
+          <w:szCs w:val="24"/>
+        </w:rPr>
+        <w:t>Three models of classification were implemented and assessed:</w:t>
+      </w:r>
+    </w:p>
+    <w:p>
+      <w:pPr>
+        <w:rPr>
+          <w:rFonts w:ascii="Calibri" w:hAnsi="Calibri" w:cs="Calibri"/>
+          <w:sz w:val="24"/>
+          <w:szCs w:val="24"/>
+        </w:rPr>
+      </w:pPr>
+      <w:r>
+        <w:rPr>
+          <w:rFonts w:ascii="Calibri" w:hAnsi="Calibri" w:cs="Calibri"/>
+          <w:b/>
+          <w:bCs/>
+          <w:sz w:val="24"/>
+          <w:szCs w:val="24"/>
+        </w:rPr>
+        <w:t>Logistic Regression</w:t>
+      </w:r>
+      <w:r>
+        <w:rPr>
+          <w:rFonts w:ascii="Calibri" w:hAnsi="Calibri" w:cs="Calibri"/>
+          <w:b/>
+          <w:bCs/>
+          <w:sz w:val="24"/>
+          <w:szCs w:val="24"/>
+        </w:rPr>
+        <w:t xml:space="preserve">: </w:t>
+      </w:r>
+      <w:r>
+        <w:rPr>
+          <w:rFonts w:ascii="Calibri" w:hAnsi="Calibri" w:cs="Calibri"/>
+          <w:sz w:val="24"/>
+          <w:szCs w:val="24"/>
+        </w:rPr>
+        <w:t>Selected due to its ease of interpretation and ease of use in assessing the impact of features on the probability of an outcome.</w:t>
+      </w:r>
+    </w:p>
+    <w:p>
+      <w:pPr>
+        <w:rPr>
+          <w:rFonts w:ascii="Calibri" w:hAnsi="Calibri" w:cs="Calibri"/>
+          <w:sz w:val="24"/>
+          <w:szCs w:val="24"/>
+        </w:rPr>
+      </w:pPr>
+      <w:r>
+        <w:rPr>
+          <w:rFonts w:ascii="Calibri" w:hAnsi="Calibri" w:cs="Calibri"/>
+          <w:b/>
+          <w:bCs/>
+          <w:sz w:val="24"/>
+          <w:szCs w:val="24"/>
+        </w:rPr>
+        <w:t>Decision Tree Classifier</w:t>
+      </w:r>
+      <w:r>
+        <w:rPr>
+          <w:rFonts w:ascii="Calibri" w:hAnsi="Calibri" w:cs="Calibri"/>
+          <w:b/>
+          <w:bCs/>
+          <w:sz w:val="24"/>
+          <w:szCs w:val="24"/>
+        </w:rPr>
+        <w:t xml:space="preserve">: </w:t>
+      </w:r>
+      <w:r>
+        <w:rPr>
+          <w:rFonts w:ascii="Calibri" w:hAnsi="Calibri" w:cs="Calibri"/>
+          <w:sz w:val="24"/>
+          <w:szCs w:val="24"/>
+        </w:rPr>
+        <w:t>C</w:t>
+      </w:r>
+      <w:r>
+        <w:rPr>
+          <w:rFonts w:ascii="Calibri" w:hAnsi="Calibri" w:cs="Calibri"/>
+          <w:sz w:val="24"/>
+          <w:szCs w:val="24"/>
+        </w:rPr>
+        <w:t>hosen due to its clear predictions based on rules.</w:t>
+      </w:r>
+    </w:p>
+    <w:p>
+      <w:pPr>
+        <w:rPr>
+          <w:rFonts w:ascii="Calibri" w:hAnsi="Calibri" w:cs="Calibri"/>
+          <w:sz w:val="24"/>
+          <w:szCs w:val="24"/>
+        </w:rPr>
+      </w:pPr>
+      <w:r>
+        <w:rPr>
+          <w:rFonts w:ascii="Calibri" w:hAnsi="Calibri" w:cs="Calibri"/>
+          <w:b/>
+          <w:bCs/>
+          <w:sz w:val="24"/>
+          <w:szCs w:val="24"/>
+        </w:rPr>
+        <w:t>Random Forest Classifier</w:t>
+      </w:r>
+      <w:r>
+        <w:rPr>
+          <w:rFonts w:ascii="Calibri" w:hAnsi="Calibri" w:cs="Calibri"/>
+          <w:b/>
+          <w:bCs/>
+          <w:sz w:val="24"/>
+          <w:szCs w:val="24"/>
+        </w:rPr>
+        <w:t xml:space="preserve">: </w:t>
+      </w:r>
+      <w:r>
+        <w:rPr>
+          <w:rFonts w:ascii="Calibri" w:hAnsi="Calibri" w:cs="Calibri"/>
+          <w:sz w:val="24"/>
+          <w:szCs w:val="24"/>
+        </w:rPr>
+        <w:t>Used because of its great accuracy and resilience (</w:t>
+      </w:r>
+      <w:proofErr w:type="spellStart"/>
+      <w:r>
+        <w:rPr>
+          <w:rFonts w:ascii="Calibri" w:hAnsi="Calibri" w:cs="Calibri"/>
+          <w:sz w:val="24"/>
+          <w:szCs w:val="24"/>
+        </w:rPr>
+        <w:t>Breiman</w:t>
+      </w:r>
+      <w:proofErr w:type="spellEnd"/>
+      <w:r>
+        <w:rPr>
+          <w:rFonts w:ascii="Calibri" w:hAnsi="Calibri" w:cs="Calibri"/>
+          <w:sz w:val="24"/>
+          <w:szCs w:val="24"/>
+        </w:rPr>
+        <w:t>, 2001).</w:t>
+      </w:r>
+    </w:p>
+    <w:p>
+      <w:pPr>
+        <w:rPr>
+          <w:rFonts w:ascii="Calibri" w:hAnsi="Calibri" w:cs="Calibri"/>
+          <w:sz w:val="24"/>
+          <w:szCs w:val="24"/>
+        </w:rPr>
+      </w:pPr>
+      <w:r>
+        <w:rPr>
+          <w:rFonts w:ascii="Calibri" w:hAnsi="Calibri" w:cs="Calibri"/>
+          <w:sz w:val="24"/>
+          <w:szCs w:val="24"/>
+        </w:rPr>
+        <w:t>Training (80%) and test (20%) sets of data were separated, and models were assessed using:</w:t>
+      </w:r>
+    </w:p>
+    <w:p>
+      <w:pPr>
+        <w:pStyle w:val="ListParagraph"/>
+        <w:numPr>
+          <w:ilvl w:val="0"/>
+          <w:numId w:val="5"/>
+        </w:numPr>
+        <w:rPr>
+          <w:rFonts w:ascii="Calibri" w:hAnsi="Calibri" w:cs="Calibri"/>
+          <w:sz w:val="24"/>
+          <w:szCs w:val="24"/>
+        </w:rPr>
+      </w:pPr>
+      <w:r>
+        <w:rPr>
+          <w:rFonts w:ascii="Calibri" w:hAnsi="Calibri" w:cs="Calibri"/>
+          <w:sz w:val="24"/>
+          <w:szCs w:val="24"/>
+        </w:rPr>
+        <w:t>Accuracy</w:t>
+      </w:r>
+    </w:p>
+    <w:p>
+      <w:pPr>
+        <w:pStyle w:val="ListParagraph"/>
+        <w:numPr>
+          <w:ilvl w:val="0"/>
+          <w:numId w:val="5"/>
+        </w:numPr>
+        <w:rPr>
+          <w:rFonts w:ascii="Calibri" w:hAnsi="Calibri" w:cs="Calibri"/>
+          <w:sz w:val="24"/>
+          <w:szCs w:val="24"/>
+        </w:rPr>
+      </w:pPr>
+      <w:r>
+        <w:rPr>
+          <w:rFonts w:ascii="Calibri" w:hAnsi="Calibri" w:cs="Calibri"/>
+          <w:sz w:val="24"/>
+          <w:szCs w:val="24"/>
+        </w:rPr>
+        <w:t>Precision</w:t>
+      </w:r>
+    </w:p>
+    <w:p>
+      <w:pPr>
+        <w:pStyle w:val="ListParagraph"/>
+        <w:numPr>
+          <w:ilvl w:val="0"/>
+          <w:numId w:val="5"/>
+        </w:numPr>
+        <w:rPr>
+          <w:rFonts w:ascii="Calibri" w:hAnsi="Calibri" w:cs="Calibri"/>
+          <w:sz w:val="24"/>
+          <w:szCs w:val="24"/>
+        </w:rPr>
+      </w:pPr>
+      <w:r>
+        <w:rPr>
+          <w:rFonts w:ascii="Calibri" w:hAnsi="Calibri" w:cs="Calibri"/>
+          <w:sz w:val="24"/>
+          <w:szCs w:val="24"/>
+        </w:rPr>
+        <w:t>Recall</w:t>
+      </w:r>
+    </w:p>
+    <w:p>
+      <w:pPr>
+        <w:pStyle w:val="ListParagraph"/>
+        <w:numPr>
+          <w:ilvl w:val="0"/>
+          <w:numId w:val="5"/>
+        </w:numPr>
+        <w:rPr>
+          <w:rFonts w:ascii="Calibri" w:hAnsi="Calibri" w:cs="Calibri"/>
+          <w:sz w:val="24"/>
+          <w:szCs w:val="24"/>
+        </w:rPr>
+      </w:pPr>
+      <w:r>
+        <w:rPr>
+          <w:rFonts w:ascii="Calibri" w:hAnsi="Calibri" w:cs="Calibri"/>
+          <w:sz w:val="24"/>
+          <w:szCs w:val="24"/>
+        </w:rPr>
+        <w:t>F1 Score</w:t>
+      </w:r>
+    </w:p>
+    <w:p>
+      <w:pPr>
+        <w:pStyle w:val="ListParagraph"/>
+        <w:numPr>
+          <w:ilvl w:val="0"/>
+          <w:numId w:val="5"/>
+        </w:numPr>
+        <w:rPr>
+          <w:rFonts w:ascii="Calibri" w:hAnsi="Calibri" w:cs="Calibri"/>
+          <w:sz w:val="24"/>
+          <w:szCs w:val="24"/>
+        </w:rPr>
+      </w:pPr>
+      <w:r>
+        <w:rPr>
+          <w:rFonts w:ascii="Calibri" w:hAnsi="Calibri" w:cs="Calibri"/>
+          <w:sz w:val="24"/>
+          <w:szCs w:val="24"/>
+        </w:rPr>
+        <w:t>ROC-AUC</w:t>
+      </w:r>
+    </w:p>
+    <w:p>
+      <w:pPr>
+        <w:pStyle w:val="ListParagraph"/>
+        <w:rPr>
+          <w:rFonts w:ascii="Calibri" w:hAnsi="Calibri" w:cs="Calibri"/>
+          <w:sz w:val="24"/>
+          <w:szCs w:val="24"/>
+        </w:rPr>
+      </w:pPr>
+    </w:p>
+    <w:p>
+      <w:pPr>
+        <w:rPr>
+          <w:rFonts w:ascii="Calibri" w:hAnsi="Calibri" w:cs="Calibri"/>
+          <w:b/>
+          <w:bCs/>
+          <w:sz w:val="24"/>
+          <w:szCs w:val="24"/>
+        </w:rPr>
+      </w:pPr>
+    </w:p>
+    <w:p>
+      <w:pPr>
+        <w:rPr>
+          <w:rFonts w:ascii="Calibri" w:hAnsi="Calibri" w:cs="Calibri"/>
+          <w:b/>
+          <w:bCs/>
+          <w:sz w:val="24"/>
+          <w:szCs w:val="24"/>
+        </w:rPr>
+      </w:pPr>
+    </w:p>
+    <w:p>
+      <w:pPr>
+        <w:rPr>
+          <w:rFonts w:ascii="Calibri" w:hAnsi="Calibri" w:cs="Calibri"/>
+          <w:b/>
+          <w:bCs/>
+          <w:sz w:val="24"/>
+          <w:szCs w:val="24"/>
+        </w:rPr>
+      </w:pPr>
+    </w:p>
+    <w:p>
+      <w:pPr>
+        <w:rPr>
+          <w:rFonts w:ascii="Calibri" w:hAnsi="Calibri" w:cs="Calibri"/>
+          <w:b/>
+          <w:bCs/>
+          <w:sz w:val="24"/>
+          <w:szCs w:val="24"/>
+        </w:rPr>
+      </w:pPr>
+    </w:p>
+    <w:p>
+      <w:pPr>
+        <w:rPr>
+          <w:rFonts w:ascii="Calibri" w:hAnsi="Calibri" w:cs="Calibri"/>
+          <w:b/>
+          <w:bCs/>
+          <w:sz w:val="24"/>
+          <w:szCs w:val="24"/>
+        </w:rPr>
+      </w:pPr>
+    </w:p>
+    <w:p>
+      <w:pPr>
+        <w:rPr>
+          <w:rFonts w:ascii="Calibri" w:hAnsi="Calibri" w:cs="Calibri"/>
+          <w:b/>
+          <w:bCs/>
           <w:sz w:val="24"/>
           <w:szCs w:val="24"/>
         </w:rPr>
@@ -5657,6 +6213,7 @@
           <w:sz w:val="28"/>
           <w:szCs w:val="28"/>
         </w:rPr>
+        <w:lastRenderedPageBreak/>
         <w:t>References</w:t>
       </w:r>
     </w:p>
@@ -6094,9 +6651,9 @@
     </w:lvl>
   </w:abstractNum>
   <w:abstractNum w:abstractNumId="3" w15:restartNumberingAfterBreak="0">
-    <w:nsid w:val="5FCB4856"/>
+    <w:nsid w:val="4142450E"/>
     <w:multiLevelType w:val="hybridMultilevel"/>
-    <w:tmpl w:val="7B0CE1FE"/>
+    <w:tmpl w:val="DACC70EE"/>
     <w:lvl w:ilvl="0" w:tplc="18090001">
       <w:start w:val="1"/>
       <w:numFmt w:val="bullet"/>
@@ -6206,8 +6763,121 @@
       </w:rPr>
     </w:lvl>
   </w:abstractNum>
+  <w:abstractNum w:abstractNumId="4" w15:restartNumberingAfterBreak="0">
+    <w:nsid w:val="5FCB4856"/>
+    <w:multiLevelType w:val="hybridMultilevel"/>
+    <w:tmpl w:val="7B0CE1FE"/>
+    <w:lvl w:ilvl="0" w:tplc="18090001">
+      <w:start w:val="1"/>
+      <w:numFmt w:val="bullet"/>
+      <w:lvlText w:val=""/>
+      <w:lvlJc w:val="left"/>
+      <w:pPr>
+        <w:ind w:left="720" w:hanging="360"/>
+      </w:pPr>
+      <w:rPr>
+        <w:rFonts w:ascii="Symbol" w:hAnsi="Symbol" w:hint="default"/>
+      </w:rPr>
+    </w:lvl>
+    <w:lvl w:ilvl="1" w:tplc="18090003" w:tentative="1">
+      <w:start w:val="1"/>
+      <w:numFmt w:val="bullet"/>
+      <w:lvlText w:val="o"/>
+      <w:lvlJc w:val="left"/>
+      <w:pPr>
+        <w:ind w:left="1440" w:hanging="360"/>
+      </w:pPr>
+      <w:rPr>
+        <w:rFonts w:ascii="Courier New" w:hAnsi="Courier New" w:cs="Courier New" w:hint="default"/>
+      </w:rPr>
+    </w:lvl>
+    <w:lvl w:ilvl="2" w:tplc="18090005" w:tentative="1">
+      <w:start w:val="1"/>
+      <w:numFmt w:val="bullet"/>
+      <w:lvlText w:val=""/>
+      <w:lvlJc w:val="left"/>
+      <w:pPr>
+        <w:ind w:left="2160" w:hanging="360"/>
+      </w:pPr>
+      <w:rPr>
+        <w:rFonts w:ascii="Wingdings" w:hAnsi="Wingdings" w:hint="default"/>
+      </w:rPr>
+    </w:lvl>
+    <w:lvl w:ilvl="3" w:tplc="18090001" w:tentative="1">
+      <w:start w:val="1"/>
+      <w:numFmt w:val="bullet"/>
+      <w:lvlText w:val=""/>
+      <w:lvlJc w:val="left"/>
+      <w:pPr>
+        <w:ind w:left="2880" w:hanging="360"/>
+      </w:pPr>
+      <w:rPr>
+        <w:rFonts w:ascii="Symbol" w:hAnsi="Symbol" w:hint="default"/>
+      </w:rPr>
+    </w:lvl>
+    <w:lvl w:ilvl="4" w:tplc="18090003" w:tentative="1">
+      <w:start w:val="1"/>
+      <w:numFmt w:val="bullet"/>
+      <w:lvlText w:val="o"/>
+      <w:lvlJc w:val="left"/>
+      <w:pPr>
+        <w:ind w:left="3600" w:hanging="360"/>
+      </w:pPr>
+      <w:rPr>
+        <w:rFonts w:ascii="Courier New" w:hAnsi="Courier New" w:cs="Courier New" w:hint="default"/>
+      </w:rPr>
+    </w:lvl>
+    <w:lvl w:ilvl="5" w:tplc="18090005" w:tentative="1">
+      <w:start w:val="1"/>
+      <w:numFmt w:val="bullet"/>
+      <w:lvlText w:val=""/>
+      <w:lvlJc w:val="left"/>
+      <w:pPr>
+        <w:ind w:left="4320" w:hanging="360"/>
+      </w:pPr>
+      <w:rPr>
+        <w:rFonts w:ascii="Wingdings" w:hAnsi="Wingdings" w:hint="default"/>
+      </w:rPr>
+    </w:lvl>
+    <w:lvl w:ilvl="6" w:tplc="18090001" w:tentative="1">
+      <w:start w:val="1"/>
+      <w:numFmt w:val="bullet"/>
+      <w:lvlText w:val=""/>
+      <w:lvlJc w:val="left"/>
+      <w:pPr>
+        <w:ind w:left="5040" w:hanging="360"/>
+      </w:pPr>
+      <w:rPr>
+        <w:rFonts w:ascii="Symbol" w:hAnsi="Symbol" w:hint="default"/>
+      </w:rPr>
+    </w:lvl>
+    <w:lvl w:ilvl="7" w:tplc="18090003" w:tentative="1">
+      <w:start w:val="1"/>
+      <w:numFmt w:val="bullet"/>
+      <w:lvlText w:val="o"/>
+      <w:lvlJc w:val="left"/>
+      <w:pPr>
+        <w:ind w:left="5760" w:hanging="360"/>
+      </w:pPr>
+      <w:rPr>
+        <w:rFonts w:ascii="Courier New" w:hAnsi="Courier New" w:cs="Courier New" w:hint="default"/>
+      </w:rPr>
+    </w:lvl>
+    <w:lvl w:ilvl="8" w:tplc="18090005" w:tentative="1">
+      <w:start w:val="1"/>
+      <w:numFmt w:val="bullet"/>
+      <w:lvlText w:val=""/>
+      <w:lvlJc w:val="left"/>
+      <w:pPr>
+        <w:ind w:left="6480" w:hanging="360"/>
+      </w:pPr>
+      <w:rPr>
+        <w:rFonts w:ascii="Wingdings" w:hAnsi="Wingdings" w:hint="default"/>
+      </w:rPr>
+    </w:lvl>
+  </w:abstractNum>
   <w:num w:numId="1" w16cid:durableId="53701104">
-    <w:abstractNumId w:val="3"/>
+    <w:abstractNumId w:val="4"/>
   </w:num>
   <w:num w:numId="2" w16cid:durableId="186408463">
     <w:abstractNumId w:val="2"/>
@@ -6217,6 +6887,9 @@
   </w:num>
   <w:num w:numId="4" w16cid:durableId="238904787">
     <w:abstractNumId w:val="1"/>
+  </w:num>
+  <w:num w:numId="5" w16cid:durableId="315960961">
+    <w:abstractNumId w:val="3"/>
   </w:num>
 </w:numbering>
 </file>

</xml_diff>

<commit_message>
Add machine learning models Evaluation
</commit_message>
<xml_diff>
--- a/CA2_Capstone_Report.docx
+++ b/CA2_Capstone_Report.docx
@@ -1443,25 +1443,7 @@
           <w:sz w:val="24"/>
           <w:szCs w:val="24"/>
         </w:rPr>
-        <w:t xml:space="preserve">Information about the dataset, including the data types of each column and the amount of non-null values in each column, is shown using the </w:t>
-      </w:r>
-      <w:proofErr w:type="gramStart"/>
-      <w:r>
-        <w:rPr>
-          <w:rFonts w:ascii="Calibri" w:hAnsi="Calibri" w:cs="Calibri"/>
-          <w:sz w:val="24"/>
-          <w:szCs w:val="24"/>
-        </w:rPr>
-        <w:t>df.info(</w:t>
-      </w:r>
-      <w:proofErr w:type="gramEnd"/>
-      <w:r>
-        <w:rPr>
-          <w:rFonts w:ascii="Calibri" w:hAnsi="Calibri" w:cs="Calibri"/>
-          <w:sz w:val="24"/>
-          <w:szCs w:val="24"/>
-        </w:rPr>
-        <w:t>) method. This makes it possible to identify columns that might have missing values, which may be addressed during the data preparation process.</w:t>
+        <w:t>Information about the dataset, including the data types of each column and the amount of non-null values in each column, is shown using the df.info() method. This makes it possible to identify columns that might have missing values, which may be addressed during the data preparation process.</w:t>
       </w:r>
     </w:p>
     <w:p>
@@ -1714,7 +1696,6 @@
         <w:t xml:space="preserve">The </w:t>
       </w:r>
       <w:proofErr w:type="spellStart"/>
-      <w:proofErr w:type="gramStart"/>
       <w:r>
         <w:rPr>
           <w:rFonts w:ascii="Calibri" w:hAnsi="Calibri" w:cs="Calibri"/>
@@ -1724,32 +1705,13 @@
         <w:t>df.isnull</w:t>
       </w:r>
       <w:proofErr w:type="spellEnd"/>
-      <w:proofErr w:type="gramEnd"/>
-      <w:r>
-        <w:rPr>
-          <w:rFonts w:ascii="Calibri" w:hAnsi="Calibri" w:cs="Calibri"/>
-          <w:sz w:val="24"/>
-          <w:szCs w:val="24"/>
-        </w:rPr>
-        <w:t>(</w:t>
-      </w:r>
-      <w:proofErr w:type="gramStart"/>
-      <w:r>
-        <w:rPr>
-          <w:rFonts w:ascii="Calibri" w:hAnsi="Calibri" w:cs="Calibri"/>
-          <w:sz w:val="24"/>
-          <w:szCs w:val="24"/>
-        </w:rPr>
-        <w:t>).sum</w:t>
-      </w:r>
-      <w:proofErr w:type="gramEnd"/>
-      <w:r>
-        <w:rPr>
-          <w:rFonts w:ascii="Calibri" w:hAnsi="Calibri" w:cs="Calibri"/>
-          <w:sz w:val="24"/>
-          <w:szCs w:val="24"/>
-        </w:rPr>
-        <w:t>() is used to find columns that contain missing data. In order to plan the imputation or removal of these values during the Data Preparation phase, it is necessary to know the total number of missing values per column.</w:t>
+      <w:r>
+        <w:rPr>
+          <w:rFonts w:ascii="Calibri" w:hAnsi="Calibri" w:cs="Calibri"/>
+          <w:sz w:val="24"/>
+          <w:szCs w:val="24"/>
+        </w:rPr>
+        <w:t>().sum() is used to find columns that contain missing data. In order to plan the imputation or removal of these values during the Data Preparation phase, it is necessary to know the total number of missing values per column.</w:t>
       </w:r>
     </w:p>
     <w:p>
@@ -6069,6 +6031,640 @@
     </w:p>
     <w:p>
       <w:pPr>
+        <w:rPr>
+          <w:rFonts w:ascii="Calibri" w:hAnsi="Calibri" w:cs="Calibri"/>
+          <w:sz w:val="24"/>
+          <w:szCs w:val="24"/>
+        </w:rPr>
+      </w:pPr>
+    </w:p>
+    <w:p>
+      <w:pPr>
+        <w:rPr>
+          <w:rFonts w:ascii="Calibri" w:hAnsi="Calibri" w:cs="Calibri"/>
+          <w:b/>
+          <w:bCs/>
+          <w:sz w:val="24"/>
+          <w:szCs w:val="24"/>
+        </w:rPr>
+      </w:pPr>
+      <w:r>
+        <w:rPr>
+          <w:rFonts w:ascii="Calibri" w:hAnsi="Calibri" w:cs="Calibri"/>
+          <w:b/>
+          <w:bCs/>
+          <w:sz w:val="24"/>
+          <w:szCs w:val="24"/>
+        </w:rPr>
+        <w:t>Logistic Regression</w:t>
+      </w:r>
+    </w:p>
+    <w:p>
+      <w:pPr>
+        <w:rPr>
+          <w:rFonts w:ascii="Calibri" w:hAnsi="Calibri" w:cs="Calibri"/>
+          <w:b/>
+          <w:bCs/>
+          <w:sz w:val="24"/>
+          <w:szCs w:val="24"/>
+        </w:rPr>
+      </w:pPr>
+    </w:p>
+    <w:p>
+      <w:pPr>
+        <w:rPr>
+          <w:rFonts w:ascii="Calibri" w:hAnsi="Calibri" w:cs="Calibri"/>
+          <w:b/>
+          <w:bCs/>
+          <w:sz w:val="24"/>
+          <w:szCs w:val="24"/>
+        </w:rPr>
+      </w:pPr>
+      <w:r>
+        <w:rPr>
+          <w:rFonts w:ascii="Calibri" w:hAnsi="Calibri" w:cs="Calibri"/>
+          <w:b/>
+          <w:bCs/>
+          <w:noProof/>
+          <w:sz w:val="24"/>
+          <w:szCs w:val="24"/>
+        </w:rPr>
+        <w:drawing>
+          <wp:inline distT="0" distB="0" distL="0" distR="0" wp14:anchorId="3B4EB575" wp14:editId="5594303B">
+            <wp:extent cx="5731510" cy="1903730"/>
+            <wp:effectExtent l="0" t="0" r="2540" b="1270"/>
+            <wp:docPr id="2039788730" name="Picture 1" descr="A screenshot of a computer screen&#10;&#10;AI-generated content may be incorrect."/>
+            <wp:cNvGraphicFramePr>
+              <a:graphicFrameLocks xmlns:a="http://schemas.openxmlformats.org/drawingml/2006/main" noChangeAspect="1"/>
+            </wp:cNvGraphicFramePr>
+            <a:graphic xmlns:a="http://schemas.openxmlformats.org/drawingml/2006/main">
+              <a:graphicData uri="http://schemas.openxmlformats.org/drawingml/2006/picture">
+                <pic:pic xmlns:pic="http://schemas.openxmlformats.org/drawingml/2006/picture">
+                  <pic:nvPicPr>
+                    <pic:cNvPr id="2039788730" name="Picture 1" descr="A screenshot of a computer screen&#10;&#10;AI-generated content may be incorrect."/>
+                    <pic:cNvPicPr/>
+                  </pic:nvPicPr>
+                  <pic:blipFill>
+                    <a:blip r:embed="rId27">
+                      <a:extLst>
+                        <a:ext uri="{28A0092B-C50C-407E-A947-70E740481C1C}">
+                          <a14:useLocalDpi xmlns:a14="http://schemas.microsoft.com/office/drawing/2010/main" val="0"/>
+                        </a:ext>
+                      </a:extLst>
+                    </a:blip>
+                    <a:stretch>
+                      <a:fillRect/>
+                    </a:stretch>
+                  </pic:blipFill>
+                  <pic:spPr>
+                    <a:xfrm>
+                      <a:off x="0" y="0"/>
+                      <a:ext cx="5731510" cy="1903730"/>
+                    </a:xfrm>
+                    <a:prstGeom prst="rect">
+                      <a:avLst/>
+                    </a:prstGeom>
+                  </pic:spPr>
+                </pic:pic>
+              </a:graphicData>
+            </a:graphic>
+          </wp:inline>
+        </w:drawing>
+      </w:r>
+    </w:p>
+    <w:p>
+      <w:pPr>
+        <w:rPr>
+          <w:rFonts w:ascii="Calibri" w:hAnsi="Calibri" w:cs="Calibri"/>
+          <w:b/>
+          <w:bCs/>
+          <w:sz w:val="24"/>
+          <w:szCs w:val="24"/>
+        </w:rPr>
+      </w:pPr>
+    </w:p>
+    <w:p>
+      <w:pPr>
+        <w:rPr>
+          <w:rFonts w:ascii="Calibri" w:hAnsi="Calibri" w:cs="Calibri"/>
+          <w:b/>
+          <w:bCs/>
+          <w:sz w:val="24"/>
+          <w:szCs w:val="24"/>
+        </w:rPr>
+      </w:pPr>
+      <w:r>
+        <w:rPr>
+          <w:rFonts w:ascii="Calibri" w:hAnsi="Calibri" w:cs="Calibri"/>
+          <w:b/>
+          <w:bCs/>
+          <w:noProof/>
+          <w:sz w:val="24"/>
+          <w:szCs w:val="24"/>
+        </w:rPr>
+        <w:lastRenderedPageBreak/>
+        <w:drawing>
+          <wp:inline distT="0" distB="0" distL="0" distR="0" wp14:anchorId="310B2266" wp14:editId="13336A2A">
+            <wp:extent cx="4648849" cy="1905266"/>
+            <wp:effectExtent l="0" t="0" r="0" b="0"/>
+            <wp:docPr id="1197027447" name="Picture 2" descr="A screenshot of a computer&#10;&#10;AI-generated content may be incorrect."/>
+            <wp:cNvGraphicFramePr>
+              <a:graphicFrameLocks xmlns:a="http://schemas.openxmlformats.org/drawingml/2006/main" noChangeAspect="1"/>
+            </wp:cNvGraphicFramePr>
+            <a:graphic xmlns:a="http://schemas.openxmlformats.org/drawingml/2006/main">
+              <a:graphicData uri="http://schemas.openxmlformats.org/drawingml/2006/picture">
+                <pic:pic xmlns:pic="http://schemas.openxmlformats.org/drawingml/2006/picture">
+                  <pic:nvPicPr>
+                    <pic:cNvPr id="1197027447" name="Picture 2" descr="A screenshot of a computer&#10;&#10;AI-generated content may be incorrect."/>
+                    <pic:cNvPicPr/>
+                  </pic:nvPicPr>
+                  <pic:blipFill>
+                    <a:blip r:embed="rId28">
+                      <a:extLst>
+                        <a:ext uri="{28A0092B-C50C-407E-A947-70E740481C1C}">
+                          <a14:useLocalDpi xmlns:a14="http://schemas.microsoft.com/office/drawing/2010/main" val="0"/>
+                        </a:ext>
+                      </a:extLst>
+                    </a:blip>
+                    <a:stretch>
+                      <a:fillRect/>
+                    </a:stretch>
+                  </pic:blipFill>
+                  <pic:spPr>
+                    <a:xfrm>
+                      <a:off x="0" y="0"/>
+                      <a:ext cx="4648849" cy="1905266"/>
+                    </a:xfrm>
+                    <a:prstGeom prst="rect">
+                      <a:avLst/>
+                    </a:prstGeom>
+                  </pic:spPr>
+                </pic:pic>
+              </a:graphicData>
+            </a:graphic>
+          </wp:inline>
+        </w:drawing>
+      </w:r>
+    </w:p>
+    <w:p>
+      <w:pPr>
+        <w:rPr>
+          <w:rFonts w:ascii="Calibri" w:hAnsi="Calibri" w:cs="Calibri"/>
+          <w:b/>
+          <w:bCs/>
+          <w:sz w:val="24"/>
+          <w:szCs w:val="24"/>
+        </w:rPr>
+      </w:pPr>
+    </w:p>
+    <w:p>
+      <w:pPr>
+        <w:rPr>
+          <w:rFonts w:ascii="Calibri" w:hAnsi="Calibri" w:cs="Calibri"/>
+          <w:sz w:val="24"/>
+          <w:szCs w:val="24"/>
+        </w:rPr>
+      </w:pPr>
+      <w:r>
+        <w:rPr>
+          <w:rFonts w:ascii="Calibri" w:hAnsi="Calibri" w:cs="Calibri"/>
+          <w:b/>
+          <w:bCs/>
+          <w:sz w:val="24"/>
+          <w:szCs w:val="24"/>
+        </w:rPr>
+        <w:t>Interpretation:</w:t>
+      </w:r>
+      <w:r>
+        <w:rPr>
+          <w:rFonts w:ascii="Calibri" w:hAnsi="Calibri" w:cs="Calibri"/>
+          <w:b/>
+          <w:bCs/>
+          <w:sz w:val="24"/>
+          <w:szCs w:val="24"/>
+        </w:rPr>
+        <w:t xml:space="preserve"> </w:t>
+      </w:r>
+      <w:proofErr w:type="spellStart"/>
+      <w:r>
+        <w:rPr>
+          <w:rFonts w:ascii="Calibri" w:hAnsi="Calibri" w:cs="Calibri"/>
+          <w:sz w:val="24"/>
+          <w:szCs w:val="24"/>
+        </w:rPr>
+        <w:t>CustomerPurchaseDays</w:t>
+      </w:r>
+      <w:proofErr w:type="spellEnd"/>
+      <w:r>
+        <w:rPr>
+          <w:rFonts w:ascii="Calibri" w:hAnsi="Calibri" w:cs="Calibri"/>
+          <w:sz w:val="24"/>
+          <w:szCs w:val="24"/>
+        </w:rPr>
+        <w:t xml:space="preserve"> was the best positive predictor of repeat behaviour, according to logistic regression. This suggests that customers are more likely to return the more days they spend interacting with the platform. While </w:t>
+      </w:r>
+      <w:proofErr w:type="spellStart"/>
+      <w:r>
+        <w:rPr>
+          <w:rFonts w:ascii="Calibri" w:hAnsi="Calibri" w:cs="Calibri"/>
+          <w:sz w:val="24"/>
+          <w:szCs w:val="24"/>
+        </w:rPr>
+        <w:t>PurchaseFrequency</w:t>
+      </w:r>
+      <w:proofErr w:type="spellEnd"/>
+      <w:r>
+        <w:rPr>
+          <w:rFonts w:ascii="Calibri" w:hAnsi="Calibri" w:cs="Calibri"/>
+          <w:sz w:val="24"/>
+          <w:szCs w:val="24"/>
+        </w:rPr>
+        <w:t xml:space="preserve"> showed a slight negative impact, maybe as a result of behavioural overlap or multicollinearity, </w:t>
+      </w:r>
+      <w:proofErr w:type="spellStart"/>
+      <w:r>
+        <w:rPr>
+          <w:rFonts w:ascii="Calibri" w:hAnsi="Calibri" w:cs="Calibri"/>
+          <w:sz w:val="24"/>
+          <w:szCs w:val="24"/>
+        </w:rPr>
+        <w:t>TotalSpend</w:t>
+      </w:r>
+      <w:proofErr w:type="spellEnd"/>
+      <w:r>
+        <w:rPr>
+          <w:rFonts w:ascii="Calibri" w:hAnsi="Calibri" w:cs="Calibri"/>
+          <w:sz w:val="24"/>
+          <w:szCs w:val="24"/>
+        </w:rPr>
+        <w:t xml:space="preserve"> and </w:t>
+      </w:r>
+      <w:proofErr w:type="spellStart"/>
+      <w:r>
+        <w:rPr>
+          <w:rFonts w:ascii="Calibri" w:hAnsi="Calibri" w:cs="Calibri"/>
+          <w:sz w:val="24"/>
+          <w:szCs w:val="24"/>
+        </w:rPr>
+        <w:t>TotalQuantity</w:t>
+      </w:r>
+      <w:proofErr w:type="spellEnd"/>
+      <w:r>
+        <w:rPr>
+          <w:rFonts w:ascii="Calibri" w:hAnsi="Calibri" w:cs="Calibri"/>
+          <w:sz w:val="24"/>
+          <w:szCs w:val="24"/>
+        </w:rPr>
+        <w:t xml:space="preserve"> were likewise positively correlated.</w:t>
+      </w:r>
+    </w:p>
+    <w:p>
+      <w:pPr>
+        <w:rPr>
+          <w:rFonts w:ascii="Calibri" w:hAnsi="Calibri" w:cs="Calibri"/>
+          <w:b/>
+          <w:bCs/>
+          <w:sz w:val="24"/>
+          <w:szCs w:val="24"/>
+        </w:rPr>
+      </w:pPr>
+    </w:p>
+    <w:p>
+      <w:pPr>
+        <w:rPr>
+          <w:rFonts w:ascii="Calibri" w:hAnsi="Calibri" w:cs="Calibri"/>
+          <w:b/>
+          <w:bCs/>
+          <w:sz w:val="24"/>
+          <w:szCs w:val="24"/>
+        </w:rPr>
+      </w:pPr>
+      <w:r>
+        <w:rPr>
+          <w:rFonts w:ascii="Calibri" w:hAnsi="Calibri" w:cs="Calibri"/>
+          <w:b/>
+          <w:bCs/>
+          <w:sz w:val="24"/>
+          <w:szCs w:val="24"/>
+        </w:rPr>
+        <w:t>Decision Tree Classifier</w:t>
+      </w:r>
+    </w:p>
+    <w:p>
+      <w:pPr>
+        <w:rPr>
+          <w:rFonts w:ascii="Calibri" w:hAnsi="Calibri" w:cs="Calibri"/>
+          <w:sz w:val="24"/>
+          <w:szCs w:val="24"/>
+        </w:rPr>
+      </w:pPr>
+      <w:r>
+        <w:rPr>
+          <w:rFonts w:ascii="Calibri" w:hAnsi="Calibri" w:cs="Calibri"/>
+          <w:b/>
+          <w:bCs/>
+          <w:sz w:val="24"/>
+          <w:szCs w:val="24"/>
+        </w:rPr>
+        <w:t>Interpretation</w:t>
+      </w:r>
+      <w:r>
+        <w:rPr>
+          <w:rFonts w:ascii="Calibri" w:hAnsi="Calibri" w:cs="Calibri"/>
+          <w:b/>
+          <w:bCs/>
+          <w:sz w:val="24"/>
+          <w:szCs w:val="24"/>
+        </w:rPr>
+        <w:t xml:space="preserve">: </w:t>
+      </w:r>
+      <w:r>
+        <w:rPr>
+          <w:rFonts w:ascii="Calibri" w:hAnsi="Calibri" w:cs="Calibri"/>
+          <w:sz w:val="24"/>
+          <w:szCs w:val="24"/>
+        </w:rPr>
+        <w:t>In addition to providing excellent prediction performance, the Decision Tree classifier made it possible to comprehend model splits intuitively. The model used the same four customer-level attributes as inputs. The model is effective in detecting repeat customers with few false positives or false negatives, according to the performance measures, which show a good balance between precision and recall.</w:t>
+      </w:r>
+    </w:p>
+    <w:p>
+      <w:pPr>
+        <w:rPr>
+          <w:rFonts w:ascii="Calibri" w:hAnsi="Calibri" w:cs="Calibri"/>
+          <w:sz w:val="24"/>
+          <w:szCs w:val="24"/>
+        </w:rPr>
+      </w:pPr>
+    </w:p>
+    <w:p>
+      <w:pPr>
+        <w:rPr>
+          <w:rFonts w:ascii="Calibri" w:hAnsi="Calibri" w:cs="Calibri"/>
+          <w:b/>
+          <w:bCs/>
+          <w:sz w:val="24"/>
+          <w:szCs w:val="24"/>
+        </w:rPr>
+      </w:pPr>
+      <w:r>
+        <w:rPr>
+          <w:rFonts w:ascii="Calibri" w:hAnsi="Calibri" w:cs="Calibri"/>
+          <w:b/>
+          <w:bCs/>
+          <w:sz w:val="24"/>
+          <w:szCs w:val="24"/>
+        </w:rPr>
+        <w:t>Random Forest Classifier</w:t>
+      </w:r>
+    </w:p>
+    <w:p>
+      <w:pPr>
+        <w:rPr>
+          <w:rFonts w:ascii="Calibri" w:hAnsi="Calibri" w:cs="Calibri"/>
+          <w:sz w:val="24"/>
+          <w:szCs w:val="24"/>
+        </w:rPr>
+      </w:pPr>
+      <w:r>
+        <w:rPr>
+          <w:rFonts w:ascii="Calibri" w:hAnsi="Calibri" w:cs="Calibri"/>
+          <w:b/>
+          <w:bCs/>
+          <w:sz w:val="24"/>
+          <w:szCs w:val="24"/>
+        </w:rPr>
+        <w:t>Interpretation</w:t>
+      </w:r>
+      <w:r>
+        <w:rPr>
+          <w:rFonts w:ascii="Calibri" w:hAnsi="Calibri" w:cs="Calibri"/>
+          <w:b/>
+          <w:bCs/>
+          <w:sz w:val="24"/>
+          <w:szCs w:val="24"/>
+        </w:rPr>
+        <w:t xml:space="preserve">: </w:t>
+      </w:r>
+      <w:r>
+        <w:rPr>
+          <w:rFonts w:ascii="Calibri" w:hAnsi="Calibri" w:cs="Calibri"/>
+          <w:sz w:val="24"/>
+          <w:szCs w:val="24"/>
+        </w:rPr>
+        <w:t>Out of the three models, the Random Forest model had the highest accuracy and ROC-AUC, demonstrating its ability to handle feature interactions and non-linear relationships.</w:t>
+      </w:r>
+    </w:p>
+    <w:p>
+      <w:pPr>
+        <w:rPr>
+          <w:rFonts w:ascii="Calibri" w:hAnsi="Calibri" w:cs="Calibri"/>
+          <w:sz w:val="24"/>
+          <w:szCs w:val="24"/>
+        </w:rPr>
+      </w:pPr>
+    </w:p>
+    <w:p>
+      <w:pPr>
+        <w:rPr>
+          <w:rFonts w:ascii="Calibri" w:hAnsi="Calibri" w:cs="Calibri"/>
+          <w:b/>
+          <w:bCs/>
+          <w:sz w:val="24"/>
+          <w:szCs w:val="24"/>
+        </w:rPr>
+      </w:pPr>
+      <w:r>
+        <w:rPr>
+          <w:rFonts w:ascii="Calibri" w:hAnsi="Calibri" w:cs="Calibri"/>
+          <w:b/>
+          <w:bCs/>
+          <w:sz w:val="24"/>
+          <w:szCs w:val="24"/>
+        </w:rPr>
+        <w:t>ROC Curve Analysis</w:t>
+      </w:r>
+    </w:p>
+    <w:p>
+      <w:pPr>
+        <w:rPr>
+          <w:rFonts w:ascii="Calibri" w:hAnsi="Calibri" w:cs="Calibri"/>
+          <w:sz w:val="24"/>
+          <w:szCs w:val="24"/>
+        </w:rPr>
+      </w:pPr>
+      <w:r>
+        <w:rPr>
+          <w:rFonts w:ascii="Calibri" w:hAnsi="Calibri" w:cs="Calibri"/>
+          <w:sz w:val="24"/>
+          <w:szCs w:val="24"/>
+        </w:rPr>
+        <w:t>Plotting the True Positive Rate (TPR) versus the False Positive Rate (FPR) across various thresholds allows the ROC (Receiver Operating Characteristic) curve to assess model performance. Better class separation ability is shown by a model that is closer to the top-left corner of the plot and has a bigger Area Under the Curve (AUC).</w:t>
+      </w:r>
+    </w:p>
+    <w:p>
+      <w:pPr>
+        <w:rPr>
+          <w:rFonts w:ascii="Calibri" w:hAnsi="Calibri" w:cs="Calibri"/>
+          <w:sz w:val="24"/>
+          <w:szCs w:val="24"/>
+        </w:rPr>
+      </w:pPr>
+      <w:r>
+        <w:rPr>
+          <w:rFonts w:ascii="Calibri" w:hAnsi="Calibri" w:cs="Calibri"/>
+          <w:sz w:val="24"/>
+          <w:szCs w:val="24"/>
+        </w:rPr>
+        <w:t>The following AUC values were noted, as shown in Figure below</w:t>
+      </w:r>
+    </w:p>
+    <w:p>
+      <w:pPr>
+        <w:rPr>
+          <w:rFonts w:ascii="Calibri" w:hAnsi="Calibri" w:cs="Calibri"/>
+          <w:sz w:val="24"/>
+          <w:szCs w:val="24"/>
+        </w:rPr>
+      </w:pPr>
+      <w:r>
+        <w:rPr>
+          <w:rFonts w:ascii="Calibri" w:hAnsi="Calibri" w:cs="Calibri"/>
+          <w:noProof/>
+          <w:sz w:val="24"/>
+          <w:szCs w:val="24"/>
+        </w:rPr>
+        <w:lastRenderedPageBreak/>
+        <w:drawing>
+          <wp:inline distT="0" distB="0" distL="0" distR="0" wp14:anchorId="367C8F32" wp14:editId="638E4502">
+            <wp:extent cx="5731510" cy="3390900"/>
+            <wp:effectExtent l="0" t="0" r="2540" b="0"/>
+            <wp:docPr id="980465015" name="Picture 3" descr="A graph with lines and numbers&#10;&#10;AI-generated content may be incorrect."/>
+            <wp:cNvGraphicFramePr>
+              <a:graphicFrameLocks xmlns:a="http://schemas.openxmlformats.org/drawingml/2006/main" noChangeAspect="1"/>
+            </wp:cNvGraphicFramePr>
+            <a:graphic xmlns:a="http://schemas.openxmlformats.org/drawingml/2006/main">
+              <a:graphicData uri="http://schemas.openxmlformats.org/drawingml/2006/picture">
+                <pic:pic xmlns:pic="http://schemas.openxmlformats.org/drawingml/2006/picture">
+                  <pic:nvPicPr>
+                    <pic:cNvPr id="980465015" name="Picture 3" descr="A graph with lines and numbers&#10;&#10;AI-generated content may be incorrect."/>
+                    <pic:cNvPicPr/>
+                  </pic:nvPicPr>
+                  <pic:blipFill>
+                    <a:blip r:embed="rId29">
+                      <a:extLst>
+                        <a:ext uri="{28A0092B-C50C-407E-A947-70E740481C1C}">
+                          <a14:useLocalDpi xmlns:a14="http://schemas.microsoft.com/office/drawing/2010/main" val="0"/>
+                        </a:ext>
+                      </a:extLst>
+                    </a:blip>
+                    <a:stretch>
+                      <a:fillRect/>
+                    </a:stretch>
+                  </pic:blipFill>
+                  <pic:spPr>
+                    <a:xfrm>
+                      <a:off x="0" y="0"/>
+                      <a:ext cx="5731510" cy="3390900"/>
+                    </a:xfrm>
+                    <a:prstGeom prst="rect">
+                      <a:avLst/>
+                    </a:prstGeom>
+                  </pic:spPr>
+                </pic:pic>
+              </a:graphicData>
+            </a:graphic>
+          </wp:inline>
+        </w:drawing>
+      </w:r>
+    </w:p>
+    <w:p>
+      <w:pPr>
+        <w:rPr>
+          <w:rFonts w:ascii="Calibri" w:hAnsi="Calibri" w:cs="Calibri"/>
+          <w:sz w:val="24"/>
+          <w:szCs w:val="24"/>
+        </w:rPr>
+      </w:pPr>
+    </w:p>
+    <w:p>
+      <w:pPr>
+        <w:rPr>
+          <w:rFonts w:ascii="Calibri" w:hAnsi="Calibri" w:cs="Calibri"/>
+          <w:sz w:val="24"/>
+          <w:szCs w:val="24"/>
+        </w:rPr>
+      </w:pPr>
+      <w:r>
+        <w:rPr>
+          <w:rFonts w:ascii="Calibri" w:hAnsi="Calibri" w:cs="Calibri"/>
+          <w:sz w:val="24"/>
+          <w:szCs w:val="24"/>
+        </w:rPr>
+        <w:t>AUC for logistic regression is 0.99.</w:t>
+      </w:r>
+    </w:p>
+    <w:p>
+      <w:pPr>
+        <w:rPr>
+          <w:rFonts w:ascii="Calibri" w:hAnsi="Calibri" w:cs="Calibri"/>
+          <w:sz w:val="24"/>
+          <w:szCs w:val="24"/>
+        </w:rPr>
+      </w:pPr>
+      <w:r>
+        <w:rPr>
+          <w:rFonts w:ascii="Calibri" w:hAnsi="Calibri" w:cs="Calibri"/>
+          <w:sz w:val="24"/>
+          <w:szCs w:val="24"/>
+        </w:rPr>
+        <w:t>AUC for the decision tree is 0.97.</w:t>
+      </w:r>
+    </w:p>
+    <w:p>
+      <w:pPr>
+        <w:rPr>
+          <w:rFonts w:ascii="Calibri" w:hAnsi="Calibri" w:cs="Calibri"/>
+          <w:sz w:val="24"/>
+          <w:szCs w:val="24"/>
+        </w:rPr>
+      </w:pPr>
+      <w:r>
+        <w:rPr>
+          <w:rFonts w:ascii="Calibri" w:hAnsi="Calibri" w:cs="Calibri"/>
+          <w:sz w:val="24"/>
+          <w:szCs w:val="24"/>
+        </w:rPr>
+        <w:t>AUC for Random Forest: 0.99</w:t>
+      </w:r>
+    </w:p>
+    <w:p>
+      <w:pPr>
+        <w:rPr>
+          <w:rFonts w:ascii="Calibri" w:hAnsi="Calibri" w:cs="Calibri"/>
+          <w:sz w:val="24"/>
+          <w:szCs w:val="24"/>
+        </w:rPr>
+      </w:pPr>
+      <w:r>
+        <w:rPr>
+          <w:rFonts w:ascii="Calibri" w:hAnsi="Calibri" w:cs="Calibri"/>
+          <w:sz w:val="24"/>
+          <w:szCs w:val="24"/>
+        </w:rPr>
+        <w:t>Near-perfect classification performance was attained by Random Forest and Logistic Regression, while the Decision Tree also did well, however with a somewhat lower AUC. Strong predictive potential in identifying repeat purchasers was confirmed by the fact that all models performed significantly better than the random baseline (AUC = 0.50).</w:t>
+      </w:r>
+    </w:p>
+    <w:p>
+      <w:pPr>
+        <w:rPr>
+          <w:rFonts w:ascii="Calibri" w:hAnsi="Calibri" w:cs="Calibri"/>
+          <w:sz w:val="24"/>
+          <w:szCs w:val="24"/>
+        </w:rPr>
+      </w:pPr>
+    </w:p>
+    <w:p>
+      <w:pPr>
         <w:pStyle w:val="ListParagraph"/>
         <w:rPr>
           <w:rFonts w:ascii="Calibri" w:hAnsi="Calibri" w:cs="Calibri"/>
@@ -6213,7 +6809,6 @@
           <w:sz w:val="28"/>
           <w:szCs w:val="28"/>
         </w:rPr>
-        <w:lastRenderedPageBreak/>
         <w:t>References</w:t>
       </w:r>
     </w:p>
@@ -6243,7 +6838,7 @@
         </w:rPr>
         <w:t xml:space="preserve">McKinsey &amp; Company (2021) The importance of customer retention in e-commerce. Available at: </w:t>
       </w:r>
-      <w:hyperlink r:id="rId27" w:history="1">
+      <w:hyperlink r:id="rId30" w:history="1">
         <w:r>
           <w:rPr>
             <w:rStyle w:val="Hyperlink"/>

</xml_diff>